<commit_message>
Rapport : Mise à jour figures
</commit_message>
<xml_diff>
--- a/infrastructure/docs/Rapport 1.0.docx
+++ b/infrastructure/docs/Rapport 1.0.docx
@@ -211,15 +211,28 @@
           <w:rFonts w:ascii="Calibri" w:hAnsi="Calibri" w:cs="Calibri"/>
           <w:sz w:val="24"/>
           <w:szCs w:val="24"/>
-        </w:rPr>
-      </w:pPr>
-      <w:r>
-        <w:rPr>
-          <w:rFonts w:ascii="Calibri" w:hAnsi="Calibri" w:cs="Calibri"/>
-          <w:sz w:val="24"/>
-          <w:szCs w:val="24"/>
-        </w:rPr>
-        <w:t>Etheve, Alexandre</w:t>
+          <w:lang w:val="en-CA"/>
+        </w:rPr>
+      </w:pPr>
+      <w:proofErr w:type="spellStart"/>
+      <w:r>
+        <w:rPr>
+          <w:rFonts w:ascii="Calibri" w:hAnsi="Calibri" w:cs="Calibri"/>
+          <w:sz w:val="24"/>
+          <w:szCs w:val="24"/>
+          <w:lang w:val="en-CA"/>
+        </w:rPr>
+        <w:t>Etheve</w:t>
+      </w:r>
+      <w:proofErr w:type="spellEnd"/>
+      <w:r>
+        <w:rPr>
+          <w:rFonts w:ascii="Calibri" w:hAnsi="Calibri" w:cs="Calibri"/>
+          <w:sz w:val="24"/>
+          <w:szCs w:val="24"/>
+          <w:lang w:val="en-CA"/>
+        </w:rPr>
+        <w:t>, Alexandre</w:t>
       </w:r>
     </w:p>
     <w:p>
@@ -231,13 +244,15 @@
           <w:rFonts w:ascii="Calibri" w:hAnsi="Calibri" w:cs="Calibri"/>
           <w:sz w:val="24"/>
           <w:szCs w:val="24"/>
-        </w:rPr>
-      </w:pPr>
-      <w:r>
-        <w:rPr>
-          <w:rFonts w:ascii="Calibri" w:hAnsi="Calibri" w:cs="Calibri"/>
-          <w:sz w:val="24"/>
-          <w:szCs w:val="24"/>
+          <w:lang w:val="en-CA"/>
+        </w:rPr>
+      </w:pPr>
+      <w:r>
+        <w:rPr>
+          <w:rFonts w:ascii="Calibri" w:hAnsi="Calibri" w:cs="Calibri"/>
+          <w:sz w:val="24"/>
+          <w:szCs w:val="24"/>
+          <w:lang w:val="en-CA"/>
         </w:rPr>
         <w:t>Kaba, Mohamed</w:t>
       </w:r>
@@ -251,15 +266,28 @@
           <w:rFonts w:ascii="Calibri" w:hAnsi="Calibri" w:cs="Calibri"/>
           <w:sz w:val="24"/>
           <w:szCs w:val="24"/>
-        </w:rPr>
-      </w:pPr>
-      <w:r>
-        <w:rPr>
-          <w:rFonts w:ascii="Calibri" w:hAnsi="Calibri" w:cs="Calibri"/>
-          <w:sz w:val="24"/>
-          <w:szCs w:val="24"/>
-        </w:rPr>
-        <w:t>Laumonier, Robin</w:t>
+          <w:lang w:val="en-CA"/>
+        </w:rPr>
+      </w:pPr>
+      <w:proofErr w:type="spellStart"/>
+      <w:r>
+        <w:rPr>
+          <w:rFonts w:ascii="Calibri" w:hAnsi="Calibri" w:cs="Calibri"/>
+          <w:sz w:val="24"/>
+          <w:szCs w:val="24"/>
+          <w:lang w:val="en-CA"/>
+        </w:rPr>
+        <w:t>Laumonier</w:t>
+      </w:r>
+      <w:proofErr w:type="spellEnd"/>
+      <w:r>
+        <w:rPr>
+          <w:rFonts w:ascii="Calibri" w:hAnsi="Calibri" w:cs="Calibri"/>
+          <w:sz w:val="24"/>
+          <w:szCs w:val="24"/>
+          <w:lang w:val="en-CA"/>
+        </w:rPr>
+        <w:t>, Robin</w:t>
       </w:r>
     </w:p>
     <w:p>
@@ -379,6 +407,15 @@
     </w:p>
     <w:sdt>
       <w:sdtPr>
+        <w:rPr>
+          <w:rFonts w:asciiTheme="minorHAnsi" w:eastAsiaTheme="minorHAnsi" w:hAnsiTheme="minorHAnsi" w:cstheme="minorBidi"/>
+          <w:color w:val="auto"/>
+          <w:kern w:val="2"/>
+          <w:sz w:val="22"/>
+          <w:szCs w:val="22"/>
+          <w:lang w:val="fr-CA" w:eastAsia="en-US"/>
+          <w14:ligatures w14:val="standardContextual"/>
+        </w:rPr>
         <w:id w:val="-540437138"/>
         <w:docPartObj>
           <w:docPartGallery w:val="Table of Contents"/>
@@ -387,15 +424,8 @@
       </w:sdtPr>
       <w:sdtEndPr>
         <w:rPr>
-          <w:rFonts w:asciiTheme="minorHAnsi" w:eastAsiaTheme="minorHAnsi" w:hAnsiTheme="minorHAnsi" w:cstheme="minorBidi"/>
           <w:b/>
           <w:bCs/>
-          <w:color w:val="auto"/>
-          <w:kern w:val="2"/>
-          <w:sz w:val="22"/>
-          <w:szCs w:val="22"/>
-          <w:lang w:val="fr-CA" w:eastAsia="en-US"/>
-          <w14:ligatures w14:val="standardContextual"/>
         </w:rPr>
       </w:sdtEndPr>
       <w:sdtContent>
@@ -440,7 +470,7 @@
           <w:hyperlink w:anchor="_Toc226833188" w:history="1">
             <w:r>
               <w:rPr>
-                <w:rStyle w:val="Lienhypertexte"/>
+                <w:rStyle w:val="Hyperlien"/>
                 <w:rFonts w:ascii="Calibri" w:hAnsi="Calibri" w:cs="Calibri"/>
                 <w:noProof/>
               </w:rPr>
@@ -513,7 +543,7 @@
           <w:hyperlink w:anchor="_Toc226833189" w:history="1">
             <w:r>
               <w:rPr>
-                <w:rStyle w:val="Lienhypertexte"/>
+                <w:rStyle w:val="Hyperlien"/>
                 <w:rFonts w:ascii="Calibri" w:hAnsi="Calibri" w:cs="Calibri"/>
                 <w:noProof/>
               </w:rPr>
@@ -586,7 +616,7 @@
           <w:hyperlink w:anchor="_Toc226833190" w:history="1">
             <w:r>
               <w:rPr>
-                <w:rStyle w:val="Lienhypertexte"/>
+                <w:rStyle w:val="Hyperlien"/>
                 <w:rFonts w:ascii="Calibri" w:hAnsi="Calibri" w:cs="Calibri"/>
                 <w:noProof/>
               </w:rPr>
@@ -659,7 +689,7 @@
           <w:hyperlink w:anchor="_Toc226833191" w:history="1">
             <w:r>
               <w:rPr>
-                <w:rStyle w:val="Lienhypertexte"/>
+                <w:rStyle w:val="Hyperlien"/>
                 <w:rFonts w:ascii="Calibri" w:hAnsi="Calibri" w:cs="Calibri"/>
                 <w:noProof/>
               </w:rPr>
@@ -732,7 +762,7 @@
           <w:hyperlink w:anchor="_Toc226833192" w:history="1">
             <w:r>
               <w:rPr>
-                <w:rStyle w:val="Lienhypertexte"/>
+                <w:rStyle w:val="Hyperlien"/>
                 <w:rFonts w:ascii="Calibri" w:hAnsi="Calibri" w:cs="Calibri"/>
                 <w:noProof/>
               </w:rPr>
@@ -805,7 +835,7 @@
           <w:hyperlink w:anchor="_Toc226833193" w:history="1">
             <w:r>
               <w:rPr>
-                <w:rStyle w:val="Lienhypertexte"/>
+                <w:rStyle w:val="Hyperlien"/>
                 <w:rFonts w:ascii="Calibri" w:hAnsi="Calibri" w:cs="Calibri"/>
                 <w:noProof/>
                 <w:lang w:val="en-US"/>
@@ -879,7 +909,7 @@
           <w:hyperlink w:anchor="_Toc226833194" w:history="1">
             <w:r>
               <w:rPr>
-                <w:rStyle w:val="Lienhypertexte"/>
+                <w:rStyle w:val="Hyperlien"/>
                 <w:rFonts w:ascii="Calibri" w:hAnsi="Calibri" w:cs="Calibri"/>
                 <w:noProof/>
                 <w:lang w:val="en-US"/>
@@ -888,7 +918,7 @@
             </w:r>
             <w:r>
               <w:rPr>
-                <w:rStyle w:val="Lienhypertexte"/>
+                <w:rStyle w:val="Hyperlien"/>
                 <w:rFonts w:ascii="Calibri" w:hAnsi="Calibri" w:cs="Calibri"/>
                 <w:noProof/>
               </w:rPr>
@@ -961,7 +991,7 @@
           <w:hyperlink w:anchor="_Toc226833195" w:history="1">
             <w:r>
               <w:rPr>
-                <w:rStyle w:val="Lienhypertexte"/>
+                <w:rStyle w:val="Hyperlien"/>
                 <w:rFonts w:ascii="Calibri" w:hAnsi="Calibri" w:cs="Calibri"/>
                 <w:noProof/>
                 <w:lang w:val="en-US"/>
@@ -970,7 +1000,7 @@
             </w:r>
             <w:r>
               <w:rPr>
-                <w:rStyle w:val="Lienhypertexte"/>
+                <w:rStyle w:val="Hyperlien"/>
                 <w:rFonts w:ascii="Calibri" w:hAnsi="Calibri" w:cs="Calibri"/>
                 <w:noProof/>
               </w:rPr>
@@ -1043,7 +1073,7 @@
           <w:hyperlink w:anchor="_Toc226833196" w:history="1">
             <w:r>
               <w:rPr>
-                <w:rStyle w:val="Lienhypertexte"/>
+                <w:rStyle w:val="Hyperlien"/>
                 <w:rFonts w:ascii="Calibri" w:hAnsi="Calibri" w:cs="Calibri"/>
                 <w:noProof/>
                 <w:lang w:val="en-US"/>
@@ -1052,7 +1082,7 @@
             </w:r>
             <w:r>
               <w:rPr>
-                <w:rStyle w:val="Lienhypertexte"/>
+                <w:rStyle w:val="Hyperlien"/>
                 <w:rFonts w:ascii="Calibri" w:hAnsi="Calibri" w:cs="Calibri"/>
                 <w:noProof/>
               </w:rPr>
@@ -1125,7 +1155,7 @@
           <w:hyperlink w:anchor="_Toc226833197" w:history="1">
             <w:r>
               <w:rPr>
-                <w:rStyle w:val="Lienhypertexte"/>
+                <w:rStyle w:val="Hyperlien"/>
                 <w:rFonts w:ascii="Calibri" w:hAnsi="Calibri" w:cs="Calibri"/>
                 <w:noProof/>
                 <w:lang w:val="en-US"/>
@@ -1199,7 +1229,7 @@
           <w:hyperlink w:anchor="_Toc226833198" w:history="1">
             <w:r>
               <w:rPr>
-                <w:rStyle w:val="Lienhypertexte"/>
+                <w:rStyle w:val="Hyperlien"/>
                 <w:rFonts w:ascii="Calibri" w:hAnsi="Calibri" w:cs="Calibri"/>
                 <w:noProof/>
                 <w:lang w:val="fr-FR"/>
@@ -1208,7 +1238,7 @@
             </w:r>
             <w:r>
               <w:rPr>
-                <w:rStyle w:val="Lienhypertexte"/>
+                <w:rStyle w:val="Hyperlien"/>
                 <w:rFonts w:ascii="Calibri" w:hAnsi="Calibri" w:cs="Calibri"/>
                 <w:noProof/>
               </w:rPr>
@@ -1216,7 +1246,7 @@
             </w:r>
             <w:r>
               <w:rPr>
-                <w:rStyle w:val="Lienhypertexte"/>
+                <w:rStyle w:val="Hyperlien"/>
                 <w:rFonts w:ascii="Calibri" w:hAnsi="Calibri" w:cs="Calibri"/>
                 <w:noProof/>
                 <w:lang w:val="fr-FR"/>
@@ -1225,7 +1255,7 @@
             </w:r>
             <w:r>
               <w:rPr>
-                <w:rStyle w:val="Lienhypertexte"/>
+                <w:rStyle w:val="Hyperlien"/>
                 <w:rFonts w:ascii="Calibri" w:hAnsi="Calibri" w:cs="Calibri"/>
                 <w:noProof/>
               </w:rPr>
@@ -1298,7 +1328,7 @@
           <w:hyperlink w:anchor="_Toc226833199" w:history="1">
             <w:r>
               <w:rPr>
-                <w:rStyle w:val="Lienhypertexte"/>
+                <w:rStyle w:val="Hyperlien"/>
                 <w:rFonts w:ascii="Calibri" w:hAnsi="Calibri" w:cs="Calibri"/>
                 <w:noProof/>
                 <w:lang w:val="en-US"/>
@@ -1307,7 +1337,7 @@
             </w:r>
             <w:r>
               <w:rPr>
-                <w:rStyle w:val="Lienhypertexte"/>
+                <w:rStyle w:val="Hyperlien"/>
                 <w:rFonts w:ascii="Calibri" w:hAnsi="Calibri" w:cs="Calibri"/>
                 <w:noProof/>
               </w:rPr>
@@ -1315,7 +1345,7 @@
             </w:r>
             <w:r>
               <w:rPr>
-                <w:rStyle w:val="Lienhypertexte"/>
+                <w:rStyle w:val="Hyperlien"/>
                 <w:rFonts w:ascii="Calibri" w:hAnsi="Calibri" w:cs="Calibri"/>
                 <w:noProof/>
                 <w:lang w:val="en-US"/>
@@ -1324,7 +1354,7 @@
             </w:r>
             <w:r>
               <w:rPr>
-                <w:rStyle w:val="Lienhypertexte"/>
+                <w:rStyle w:val="Hyperlien"/>
                 <w:rFonts w:ascii="Calibri" w:hAnsi="Calibri" w:cs="Calibri"/>
                 <w:noProof/>
               </w:rPr>
@@ -1397,7 +1427,7 @@
           <w:hyperlink w:anchor="_Toc226833200" w:history="1">
             <w:r>
               <w:rPr>
-                <w:rStyle w:val="Lienhypertexte"/>
+                <w:rStyle w:val="Hyperlien"/>
                 <w:rFonts w:ascii="Calibri" w:hAnsi="Calibri" w:cs="Calibri"/>
                 <w:noProof/>
                 <w:lang w:val="en-US"/>
@@ -1406,7 +1436,7 @@
             </w:r>
             <w:r>
               <w:rPr>
-                <w:rStyle w:val="Lienhypertexte"/>
+                <w:rStyle w:val="Hyperlien"/>
                 <w:rFonts w:ascii="Calibri" w:hAnsi="Calibri" w:cs="Calibri"/>
                 <w:noProof/>
               </w:rPr>
@@ -1414,7 +1444,7 @@
             </w:r>
             <w:r>
               <w:rPr>
-                <w:rStyle w:val="Lienhypertexte"/>
+                <w:rStyle w:val="Hyperlien"/>
                 <w:rFonts w:ascii="Calibri" w:hAnsi="Calibri" w:cs="Calibri"/>
                 <w:noProof/>
                 <w:lang w:val="en-US"/>
@@ -1423,7 +1453,7 @@
             </w:r>
             <w:r>
               <w:rPr>
-                <w:rStyle w:val="Lienhypertexte"/>
+                <w:rStyle w:val="Hyperlien"/>
                 <w:rFonts w:ascii="Calibri" w:hAnsi="Calibri" w:cs="Calibri"/>
                 <w:noProof/>
               </w:rPr>
@@ -1496,7 +1526,7 @@
           <w:hyperlink w:anchor="_Toc226833201" w:history="1">
             <w:r>
               <w:rPr>
-                <w:rStyle w:val="Lienhypertexte"/>
+                <w:rStyle w:val="Hyperlien"/>
                 <w:rFonts w:ascii="Calibri" w:hAnsi="Calibri" w:cs="Calibri"/>
                 <w:noProof/>
                 <w:lang w:val="fr-FR"/>
@@ -1505,7 +1535,7 @@
             </w:r>
             <w:r>
               <w:rPr>
-                <w:rStyle w:val="Lienhypertexte"/>
+                <w:rStyle w:val="Hyperlien"/>
                 <w:rFonts w:ascii="Calibri" w:hAnsi="Calibri" w:cs="Calibri"/>
                 <w:noProof/>
               </w:rPr>
@@ -1513,7 +1543,7 @@
             </w:r>
             <w:r>
               <w:rPr>
-                <w:rStyle w:val="Lienhypertexte"/>
+                <w:rStyle w:val="Hyperlien"/>
                 <w:rFonts w:ascii="Calibri" w:hAnsi="Calibri" w:cs="Calibri"/>
                 <w:noProof/>
                 <w:lang w:val="fr-FR"/>
@@ -1522,7 +1552,7 @@
             </w:r>
             <w:r>
               <w:rPr>
-                <w:rStyle w:val="Lienhypertexte"/>
+                <w:rStyle w:val="Hyperlien"/>
                 <w:rFonts w:ascii="Calibri" w:hAnsi="Calibri" w:cs="Calibri"/>
                 <w:noProof/>
               </w:rPr>
@@ -1595,7 +1625,7 @@
           <w:hyperlink w:anchor="_Toc226833202" w:history="1">
             <w:r>
               <w:rPr>
-                <w:rStyle w:val="Lienhypertexte"/>
+                <w:rStyle w:val="Hyperlien"/>
                 <w:rFonts w:ascii="Calibri" w:hAnsi="Calibri" w:cs="Calibri"/>
                 <w:noProof/>
                 <w:lang w:val="fr-FR"/>
@@ -1604,7 +1634,7 @@
             </w:r>
             <w:r>
               <w:rPr>
-                <w:rStyle w:val="Lienhypertexte"/>
+                <w:rStyle w:val="Hyperlien"/>
                 <w:rFonts w:ascii="Calibri" w:hAnsi="Calibri" w:cs="Calibri"/>
                 <w:noProof/>
               </w:rPr>
@@ -1612,7 +1642,7 @@
             </w:r>
             <w:r>
               <w:rPr>
-                <w:rStyle w:val="Lienhypertexte"/>
+                <w:rStyle w:val="Hyperlien"/>
                 <w:rFonts w:ascii="Calibri" w:hAnsi="Calibri" w:cs="Calibri"/>
                 <w:noProof/>
                 <w:lang w:val="fr-FR"/>
@@ -1621,7 +1651,7 @@
             </w:r>
             <w:r>
               <w:rPr>
-                <w:rStyle w:val="Lienhypertexte"/>
+                <w:rStyle w:val="Hyperlien"/>
                 <w:rFonts w:ascii="Calibri" w:hAnsi="Calibri" w:cs="Calibri"/>
                 <w:noProof/>
               </w:rPr>
@@ -1694,7 +1724,7 @@
           <w:hyperlink w:anchor="_Toc226833203" w:history="1">
             <w:r>
               <w:rPr>
-                <w:rStyle w:val="Lienhypertexte"/>
+                <w:rStyle w:val="Hyperlien"/>
                 <w:rFonts w:ascii="Calibri" w:hAnsi="Calibri" w:cs="Calibri"/>
                 <w:noProof/>
                 <w:lang w:val="en-US"/>
@@ -1703,14 +1733,14 @@
             </w:r>
             <w:r>
               <w:rPr>
-                <w:rStyle w:val="Lienhypertexte"/>
+                <w:rStyle w:val="Hyperlien"/>
                 <w:noProof/>
               </w:rPr>
               <w:t>8</w:t>
             </w:r>
             <w:r>
               <w:rPr>
-                <w:rStyle w:val="Lienhypertexte"/>
+                <w:rStyle w:val="Hyperlien"/>
                 <w:rFonts w:ascii="Calibri" w:hAnsi="Calibri" w:cs="Calibri"/>
                 <w:noProof/>
                 <w:lang w:val="fr-FR"/>
@@ -1719,7 +1749,7 @@
             </w:r>
             <w:r>
               <w:rPr>
-                <w:rStyle w:val="Lienhypertexte"/>
+                <w:rStyle w:val="Hyperlien"/>
                 <w:noProof/>
               </w:rPr>
               <w:t>Nginx comme reverse proxy</w:t>
@@ -1791,7 +1821,7 @@
           <w:hyperlink w:anchor="_Toc226833204" w:history="1">
             <w:r>
               <w:rPr>
-                <w:rStyle w:val="Lienhypertexte"/>
+                <w:rStyle w:val="Hyperlien"/>
                 <w:rFonts w:ascii="Calibri" w:hAnsi="Calibri" w:cs="Calibri"/>
                 <w:noProof/>
                 <w:lang w:val="fr-FR"/>
@@ -1800,14 +1830,14 @@
             </w:r>
             <w:r>
               <w:rPr>
-                <w:rStyle w:val="Lienhypertexte"/>
+                <w:rStyle w:val="Hyperlien"/>
                 <w:noProof/>
               </w:rPr>
               <w:t>9</w:t>
             </w:r>
             <w:r>
               <w:rPr>
-                <w:rStyle w:val="Lienhypertexte"/>
+                <w:rStyle w:val="Hyperlien"/>
                 <w:rFonts w:ascii="Calibri" w:hAnsi="Calibri" w:cs="Calibri"/>
                 <w:noProof/>
                 <w:lang w:val="fr-FR"/>
@@ -1816,7 +1846,7 @@
             </w:r>
             <w:r>
               <w:rPr>
-                <w:rStyle w:val="Lienhypertexte"/>
+                <w:rStyle w:val="Hyperlien"/>
                 <w:noProof/>
               </w:rPr>
               <w:t>Sécurité des systèmes SSO (attaques possibles, importance du HTTPS, rôle 2FA)</w:t>
@@ -1888,7 +1918,7 @@
           <w:hyperlink w:anchor="_Toc226833205" w:history="1">
             <w:r>
               <w:rPr>
-                <w:rStyle w:val="Lienhypertexte"/>
+                <w:rStyle w:val="Hyperlien"/>
                 <w:noProof/>
               </w:rPr>
               <w:t>III – ORGANISATION DU GROUPE</w:t>
@@ -1960,7 +1990,7 @@
           <w:hyperlink w:anchor="_Toc226833206" w:history="1">
             <w:r>
               <w:rPr>
-                <w:rStyle w:val="Lienhypertexte"/>
+                <w:rStyle w:val="Hyperlien"/>
                 <w:noProof/>
               </w:rPr>
               <w:t>3.1 – Répartition des rôles et attribution des tâches</w:t>
@@ -2032,7 +2062,7 @@
           <w:hyperlink w:anchor="_Toc226833207" w:history="1">
             <w:r>
               <w:rPr>
-                <w:rStyle w:val="Lienhypertexte"/>
+                <w:rStyle w:val="Hyperlien"/>
                 <w:noProof/>
               </w:rPr>
               <w:t>3.2 – Outils de collaboration</w:t>
@@ -2104,7 +2134,7 @@
           <w:hyperlink w:anchor="_Toc226833208" w:history="1">
             <w:r>
               <w:rPr>
-                <w:rStyle w:val="Lienhypertexte"/>
+                <w:rStyle w:val="Hyperlien"/>
                 <w:noProof/>
               </w:rPr>
               <w:t>IV – ARCHITECTURE DE L’INFRASTRUCTURE</w:t>
@@ -2176,7 +2206,7 @@
           <w:hyperlink w:anchor="_Toc226833209" w:history="1">
             <w:r>
               <w:rPr>
-                <w:rStyle w:val="Lienhypertexte"/>
+                <w:rStyle w:val="Hyperlien"/>
                 <w:noProof/>
               </w:rPr>
               <w:t>4.1 – Vue d'ensemble de l'infrastructure</w:t>
@@ -2248,7 +2278,7 @@
           <w:hyperlink w:anchor="_Toc226833210" w:history="1">
             <w:r>
               <w:rPr>
-                <w:rStyle w:val="Lienhypertexte"/>
+                <w:rStyle w:val="Hyperlien"/>
                 <w:noProof/>
               </w:rPr>
               <w:t>4.2 – Segmentation réseau Docker</w:t>
@@ -2320,7 +2350,7 @@
           <w:hyperlink w:anchor="_Toc226833211" w:history="1">
             <w:r>
               <w:rPr>
-                <w:rStyle w:val="Lienhypertexte"/>
+                <w:rStyle w:val="Hyperlien"/>
                 <w:noProof/>
               </w:rPr>
               <w:t>4.3 – FQDN et plan d'adressage</w:t>
@@ -2392,7 +2422,7 @@
           <w:hyperlink w:anchor="_Toc226833212" w:history="1">
             <w:r>
               <w:rPr>
-                <w:rStyle w:val="Lienhypertexte"/>
+                <w:rStyle w:val="Hyperlien"/>
                 <w:noProof/>
               </w:rPr>
               <w:t>4.4 – Diagramme de flux réseau et ports</w:t>
@@ -2464,7 +2494,7 @@
           <w:hyperlink w:anchor="_Toc226833213" w:history="1">
             <w:r>
               <w:rPr>
-                <w:rStyle w:val="Lienhypertexte"/>
+                <w:rStyle w:val="Hyperlien"/>
                 <w:noProof/>
               </w:rPr>
               <w:t>4.5 – Certificats TLS</w:t>
@@ -2536,7 +2566,7 @@
           <w:hyperlink w:anchor="_Toc226833214" w:history="1">
             <w:r>
               <w:rPr>
-                <w:rStyle w:val="Lienhypertexte"/>
+                <w:rStyle w:val="Hyperlien"/>
                 <w:noProof/>
               </w:rPr>
               <w:t>4.6 – Choix technique et justification (pourquoi Docker ? Authelia ? Nginx)</w:t>
@@ -2608,7 +2638,7 @@
           <w:hyperlink w:anchor="_Toc226833215" w:history="1">
             <w:r>
               <w:rPr>
-                <w:rStyle w:val="Lienhypertexte"/>
+                <w:rStyle w:val="Hyperlien"/>
                 <w:noProof/>
               </w:rPr>
               <w:t>V – GESTION DES IDENTITÉS ET DES ACCÈS</w:t>
@@ -2680,7 +2710,7 @@
           <w:hyperlink w:anchor="_Toc226833216" w:history="1">
             <w:r>
               <w:rPr>
-                <w:rStyle w:val="Lienhypertexte"/>
+                <w:rStyle w:val="Hyperlien"/>
                 <w:noProof/>
               </w:rPr>
               <w:t>5.1 – Nomenclature CIP des utilisateurs</w:t>
@@ -2752,7 +2782,7 @@
           <w:hyperlink w:anchor="_Toc226833217" w:history="1">
             <w:r>
               <w:rPr>
-                <w:rStyle w:val="Lienhypertexte"/>
+                <w:rStyle w:val="Hyperlien"/>
                 <w:noProof/>
               </w:rPr>
               <w:t>5.2 – Annuaire OpenLDAP</w:t>
@@ -2824,7 +2854,7 @@
           <w:hyperlink w:anchor="_Toc226833218" w:history="1">
             <w:r>
               <w:rPr>
-                <w:rStyle w:val="Lienhypertexte"/>
+                <w:rStyle w:val="Hyperlien"/>
                 <w:noProof/>
               </w:rPr>
               <w:t>5.3 – Groupes et permissions associées</w:t>
@@ -2896,7 +2926,7 @@
           <w:hyperlink w:anchor="_Toc226833219" w:history="1">
             <w:r>
               <w:rPr>
-                <w:rStyle w:val="Lienhypertexte"/>
+                <w:rStyle w:val="Hyperlien"/>
                 <w:noProof/>
               </w:rPr>
               <w:t>5.4 – Politique d'accès Authelia</w:t>
@@ -2968,7 +2998,7 @@
           <w:hyperlink w:anchor="_Toc226833220" w:history="1">
             <w:r>
               <w:rPr>
-                <w:rStyle w:val="Lienhypertexte"/>
+                <w:rStyle w:val="Hyperlien"/>
                 <w:noProof/>
               </w:rPr>
               <w:t>5.5 – Limites de login et régulation</w:t>
@@ -3040,7 +3070,7 @@
           <w:hyperlink w:anchor="_Toc226833221" w:history="1">
             <w:r>
               <w:rPr>
-                <w:rStyle w:val="Lienhypertexte"/>
+                <w:rStyle w:val="Hyperlien"/>
                 <w:noProof/>
               </w:rPr>
               <w:t>5.6 – Politique de mots de passe</w:t>
@@ -3112,7 +3142,7 @@
           <w:hyperlink w:anchor="_Toc226833222" w:history="1">
             <w:r>
               <w:rPr>
-                <w:rStyle w:val="Lienhypertexte"/>
+                <w:rStyle w:val="Hyperlien"/>
                 <w:noProof/>
               </w:rPr>
               <w:t>VI – IMPLÉMENTATION</w:t>
@@ -3184,7 +3214,7 @@
           <w:hyperlink w:anchor="_Toc226833223" w:history="1">
             <w:r>
               <w:rPr>
-                <w:rStyle w:val="Lienhypertexte"/>
+                <w:rStyle w:val="Hyperlien"/>
                 <w:noProof/>
               </w:rPr>
               <w:t>6.1 – Mise en place de l'environnement Docker</w:t>
@@ -3256,7 +3286,7 @@
           <w:hyperlink w:anchor="_Toc226833224" w:history="1">
             <w:r>
               <w:rPr>
-                <w:rStyle w:val="Lienhypertexte"/>
+                <w:rStyle w:val="Hyperlien"/>
                 <w:noProof/>
               </w:rPr>
               <w:t>6.2 – Configuration de Nginx (reverse proxy + TLS)</w:t>
@@ -3328,7 +3358,7 @@
           <w:hyperlink w:anchor="_Toc226833225" w:history="1">
             <w:r>
               <w:rPr>
-                <w:rStyle w:val="Lienhypertexte"/>
+                <w:rStyle w:val="Hyperlien"/>
                 <w:noProof/>
               </w:rPr>
               <w:t>6.3 – Déploiement d'Authelia</w:t>
@@ -3400,7 +3430,7 @@
           <w:hyperlink w:anchor="_Toc226833226" w:history="1">
             <w:r>
               <w:rPr>
-                <w:rStyle w:val="Lienhypertexte"/>
+                <w:rStyle w:val="Hyperlien"/>
                 <w:noProof/>
               </w:rPr>
               <w:t>6.4 – Intégration OIDC par service</w:t>
@@ -3472,7 +3502,7 @@
           <w:hyperlink w:anchor="_Toc226833227" w:history="1">
             <w:r>
               <w:rPr>
-                <w:rStyle w:val="Lienhypertexte"/>
+                <w:rStyle w:val="Hyperlien"/>
                 <w:noProof/>
                 <w:lang w:val="en-US"/>
               </w:rPr>
@@ -3545,7 +3575,7 @@
           <w:hyperlink w:anchor="_Toc226833228" w:history="1">
             <w:r>
               <w:rPr>
-                <w:rStyle w:val="Lienhypertexte"/>
+                <w:rStyle w:val="Hyperlien"/>
                 <w:noProof/>
                 <w:lang w:val="en-US"/>
               </w:rPr>
@@ -3618,7 +3648,7 @@
           <w:hyperlink w:anchor="_Toc226833229" w:history="1">
             <w:r>
               <w:rPr>
-                <w:rStyle w:val="Lienhypertexte"/>
+                <w:rStyle w:val="Hyperlien"/>
                 <w:noProof/>
                 <w:lang w:val="en-US"/>
               </w:rPr>
@@ -3691,7 +3721,7 @@
           <w:hyperlink w:anchor="_Toc226833230" w:history="1">
             <w:r>
               <w:rPr>
-                <w:rStyle w:val="Lienhypertexte"/>
+                <w:rStyle w:val="Hyperlien"/>
                 <w:noProof/>
                 <w:lang w:val="en-US"/>
               </w:rPr>
@@ -3764,7 +3794,7 @@
           <w:hyperlink w:anchor="_Toc226833231" w:history="1">
             <w:r>
               <w:rPr>
-                <w:rStyle w:val="Lienhypertexte"/>
+                <w:rStyle w:val="Hyperlien"/>
                 <w:noProof/>
                 <w:lang w:val="en-US"/>
               </w:rPr>
@@ -3837,7 +3867,7 @@
           <w:hyperlink w:anchor="_Toc226833232" w:history="1">
             <w:r>
               <w:rPr>
-                <w:rStyle w:val="Lienhypertexte"/>
+                <w:rStyle w:val="Hyperlien"/>
                 <w:noProof/>
               </w:rPr>
               <w:t>6.5 – Flux d'authentification par service (diagramme séquence)</w:t>
@@ -3909,7 +3939,7 @@
           <w:hyperlink w:anchor="_Toc226833233" w:history="1">
             <w:r>
               <w:rPr>
-                <w:rStyle w:val="Lienhypertexte"/>
+                <w:rStyle w:val="Hyperlien"/>
                 <w:noProof/>
               </w:rPr>
               <w:t>6.6 – Gestion des variables d’environnement et secrets</w:t>
@@ -3981,7 +4011,7 @@
           <w:hyperlink w:anchor="_Toc226833234" w:history="1">
             <w:r>
               <w:rPr>
-                <w:rStyle w:val="Lienhypertexte"/>
+                <w:rStyle w:val="Hyperlien"/>
                 <w:noProof/>
               </w:rPr>
               <w:t>6.7 – Configuration du 2FA (TOTP)</w:t>
@@ -4053,7 +4083,7 @@
           <w:hyperlink w:anchor="_Toc226833235" w:history="1">
             <w:r>
               <w:rPr>
-                <w:rStyle w:val="Lienhypertexte"/>
+                <w:rStyle w:val="Hyperlien"/>
                 <w:noProof/>
               </w:rPr>
               <w:t>VII – POINTS DÉPASSANT LE CAHIER DE CHARGES</w:t>
@@ -4125,7 +4155,7 @@
           <w:hyperlink w:anchor="_Toc226833236" w:history="1">
             <w:r>
               <w:rPr>
-                <w:rStyle w:val="Lienhypertexte"/>
+                <w:rStyle w:val="Hyperlien"/>
                 <w:noProof/>
               </w:rPr>
               <w:t>7.1 – Xxxx, par exemple Docker Secrets — gestion sécurisée des tokens</w:t>
@@ -4197,7 +4227,7 @@
           <w:hyperlink w:anchor="_Toc226833237" w:history="1">
             <w:r>
               <w:rPr>
-                <w:rStyle w:val="Lienhypertexte"/>
+                <w:rStyle w:val="Hyperlien"/>
                 <w:noProof/>
               </w:rPr>
               <w:t>7.2 – Xxxx (par exemple Serveur OpenLDAP fonctionnel)</w:t>
@@ -4269,7 +4299,7 @@
           <w:hyperlink w:anchor="_Toc226833238" w:history="1">
             <w:r>
               <w:rPr>
-                <w:rStyle w:val="Lienhypertexte"/>
+                <w:rStyle w:val="Hyperlien"/>
                 <w:noProof/>
               </w:rPr>
               <w:t>7.3 – Xxxx (rotation automatique des tokens)</w:t>
@@ -4341,7 +4371,7 @@
           <w:hyperlink w:anchor="_Toc226833239" w:history="1">
             <w:r>
               <w:rPr>
-                <w:rStyle w:val="Lienhypertexte"/>
+                <w:rStyle w:val="Hyperlien"/>
                 <w:noProof/>
               </w:rPr>
               <w:t>VIII – POINTS BLOQUANTS ET MITIGATIONS</w:t>
@@ -4413,7 +4443,7 @@
           <w:hyperlink w:anchor="_Toc226833240" w:history="1">
             <w:r>
               <w:rPr>
-                <w:rStyle w:val="Lienhypertexte"/>
+                <w:rStyle w:val="Hyperlien"/>
                 <w:noProof/>
               </w:rPr>
               <w:t>8.1 – Problèmes rencontrés</w:t>
@@ -4485,7 +4515,7 @@
           <w:hyperlink w:anchor="_Toc226833241" w:history="1">
             <w:r>
               <w:rPr>
-                <w:rStyle w:val="Lienhypertexte"/>
+                <w:rStyle w:val="Hyperlien"/>
                 <w:noProof/>
               </w:rPr>
               <w:t>8.2 – Solutions apportées</w:t>
@@ -4557,7 +4587,7 @@
           <w:hyperlink w:anchor="_Toc226833242" w:history="1">
             <w:r>
               <w:rPr>
-                <w:rStyle w:val="Lienhypertexte"/>
+                <w:rStyle w:val="Hyperlien"/>
                 <w:noProof/>
               </w:rPr>
               <w:t>8.3 – Points mis de côté et justifications</w:t>
@@ -4629,7 +4659,7 @@
           <w:hyperlink w:anchor="_Toc226833243" w:history="1">
             <w:r>
               <w:rPr>
-                <w:rStyle w:val="Lienhypertexte"/>
+                <w:rStyle w:val="Hyperlien"/>
                 <w:noProof/>
               </w:rPr>
               <w:t>IX – CONCLUSION</w:t>
@@ -4701,7 +4731,7 @@
           <w:hyperlink w:anchor="_Toc226833244" w:history="1">
             <w:r>
               <w:rPr>
-                <w:rStyle w:val="Lienhypertexte"/>
+                <w:rStyle w:val="Hyperlien"/>
                 <w:noProof/>
               </w:rPr>
               <w:t>9.1 – Notions apprises</w:t>
@@ -4773,7 +4803,7 @@
           <w:hyperlink w:anchor="_Toc226833245" w:history="1">
             <w:r>
               <w:rPr>
-                <w:rStyle w:val="Lienhypertexte"/>
+                <w:rStyle w:val="Hyperlien"/>
                 <w:noProof/>
               </w:rPr>
               <w:t>9.2 – Perspectives d'amélioration</w:t>
@@ -4845,7 +4875,7 @@
           <w:hyperlink w:anchor="_Toc226833246" w:history="1">
             <w:r>
               <w:rPr>
-                <w:rStyle w:val="Lienhypertexte"/>
+                <w:rStyle w:val="Hyperlien"/>
                 <w:noProof/>
               </w:rPr>
               <w:t>X – RÉFÉRENCES</w:t>
@@ -4917,7 +4947,7 @@
           <w:hyperlink w:anchor="_Toc226833247" w:history="1">
             <w:r>
               <w:rPr>
-                <w:rStyle w:val="Lienhypertexte"/>
+                <w:rStyle w:val="Hyperlien"/>
                 <w:noProof/>
               </w:rPr>
               <w:t>XI – Annexes</w:t>
@@ -4989,7 +5019,7 @@
           <w:hyperlink w:anchor="_Toc226833248" w:history="1">
             <w:r>
               <w:rPr>
-                <w:rStyle w:val="Lienhypertexte"/>
+                <w:rStyle w:val="Hyperlien"/>
                 <w:noProof/>
               </w:rPr>
               <w:t>Annexe A — Configuration complète Authelia</w:t>
@@ -5061,7 +5091,7 @@
           <w:hyperlink w:anchor="_Toc226833249" w:history="1">
             <w:r>
               <w:rPr>
-                <w:rStyle w:val="Lienhypertexte"/>
+                <w:rStyle w:val="Hyperlien"/>
                 <w:noProof/>
               </w:rPr>
               <w:t>Annexe B — Captures d'écran de l'implémentation</w:t>
@@ -5133,7 +5163,7 @@
           <w:hyperlink w:anchor="_Toc226833250" w:history="1">
             <w:r>
               <w:rPr>
-                <w:rStyle w:val="Lienhypertexte"/>
+                <w:rStyle w:val="Hyperlien"/>
                 <w:noProof/>
               </w:rPr>
               <w:t>Annexe C — Diagrammes de flux réseau détaillés</w:t>
@@ -5205,7 +5235,7 @@
           <w:hyperlink w:anchor="_Toc226833251" w:history="1">
             <w:r>
               <w:rPr>
-                <w:rStyle w:val="Lienhypertexte"/>
+                <w:rStyle w:val="Hyperlien"/>
                 <w:noProof/>
               </w:rPr>
               <w:t>Annexe D — Journal de bord du projet (milestones, points bloquants)</w:t>
@@ -5277,7 +5307,7 @@
           <w:hyperlink w:anchor="_Toc226833252" w:history="1">
             <w:r>
               <w:rPr>
-                <w:rStyle w:val="Lienhypertexte"/>
+                <w:rStyle w:val="Hyperlien"/>
                 <w:noProof/>
               </w:rPr>
               <w:t>Annexe E — Playbook Ansible</w:t>
@@ -5712,7 +5742,7 @@
           <w:sz w:val="24"/>
           <w:szCs w:val="24"/>
         </w:rPr>
-        <w:t>Des outils de gestion de projet et de documentation – JIRA, Confluence</w:t>
+        <w:t>Une solution de stockage et de partage de fichiers – Nextcloud</w:t>
       </w:r>
     </w:p>
     <w:p>
@@ -5737,32 +5767,39 @@
           <w:sz w:val="24"/>
           <w:szCs w:val="24"/>
         </w:rPr>
-        <w:t>Une solution de stockage et de partage de fichiers – Nextcloud</w:t>
-      </w:r>
-    </w:p>
-    <w:p>
-      <w:pPr>
-        <w:pStyle w:val="Paragraphedeliste"/>
-        <w:numPr>
-          <w:ilvl w:val="0"/>
-          <w:numId w:val="19"/>
-        </w:numPr>
-        <w:spacing w:after="60" w:line="276" w:lineRule="auto"/>
-        <w:ind w:left="473"/>
-        <w:jc w:val="both"/>
-        <w:rPr>
-          <w:rFonts w:ascii="Calibri" w:hAnsi="Calibri" w:cs="Calibri"/>
-          <w:sz w:val="24"/>
-          <w:szCs w:val="24"/>
-        </w:rPr>
-      </w:pPr>
-      <w:r>
-        <w:rPr>
-          <w:rFonts w:ascii="Calibri" w:hAnsi="Calibri" w:cs="Calibri"/>
-          <w:sz w:val="24"/>
-          <w:szCs w:val="24"/>
-        </w:rPr>
-        <w:t>Une plateforme de communication interne – Rocket.Chat</w:t>
+        <w:t xml:space="preserve">Une plateforme de communication </w:t>
+      </w:r>
+      <w:r>
+        <w:rPr>
+          <w:rFonts w:ascii="Calibri" w:hAnsi="Calibri" w:cs="Calibri"/>
+          <w:sz w:val="24"/>
+          <w:szCs w:val="24"/>
+        </w:rPr>
+        <w:t>et gestion tickets</w:t>
+      </w:r>
+      <w:r>
+        <w:rPr>
+          <w:rFonts w:ascii="Calibri" w:hAnsi="Calibri" w:cs="Calibri"/>
+          <w:sz w:val="24"/>
+          <w:szCs w:val="24"/>
+        </w:rPr>
+        <w:t xml:space="preserve"> – Rocket.Chat</w:t>
+      </w:r>
+      <w:r>
+        <w:rPr>
+          <w:rFonts w:ascii="Calibri" w:hAnsi="Calibri" w:cs="Calibri"/>
+          <w:sz w:val="24"/>
+          <w:szCs w:val="24"/>
+        </w:rPr>
+        <w:t xml:space="preserve">, </w:t>
+      </w:r>
+      <w:r>
+        <w:rPr>
+          <w:rFonts w:ascii="Calibri" w:hAnsi="Calibri" w:cs="Calibri"/>
+          <w:sz w:val="24"/>
+          <w:szCs w:val="24"/>
+        </w:rPr>
+        <w:t>Libredesk</w:t>
       </w:r>
     </w:p>
     <w:p>
@@ -5872,7 +5909,6 @@
           <w:sz w:val="24"/>
           <w:szCs w:val="24"/>
         </w:rPr>
-        <w:lastRenderedPageBreak/>
         <w:t xml:space="preserve">Intégrer les services applicatifs </w:t>
       </w:r>
       <w:r>
@@ -5927,15 +5963,7 @@
           <w:sz w:val="24"/>
           <w:szCs w:val="24"/>
         </w:rPr>
-        <w:t>JIRA</w:t>
-      </w:r>
-      <w:r>
-        <w:rPr>
-          <w:rFonts w:ascii="Calibri" w:hAnsi="Calibri" w:cs="Calibri"/>
-          <w:sz w:val="24"/>
-          <w:szCs w:val="24"/>
-        </w:rPr>
-        <w:t xml:space="preserve">, </w:t>
+        <w:t>Libre</w:t>
       </w:r>
       <w:r>
         <w:rPr>
@@ -5945,7 +5973,7 @@
           <w:sz w:val="24"/>
           <w:szCs w:val="24"/>
         </w:rPr>
-        <w:t>Confluence</w:t>
+        <w:t>desk</w:t>
       </w:r>
       <w:r>
         <w:rPr>
@@ -6013,6 +6041,7 @@
           <w:sz w:val="24"/>
           <w:szCs w:val="24"/>
         </w:rPr>
+        <w:lastRenderedPageBreak/>
         <w:t>Garantir la sécurité des communications via l’utilisation de certificats TLS</w:t>
       </w:r>
     </w:p>
@@ -6102,7 +6131,31 @@
           <w:sz w:val="24"/>
           <w:szCs w:val="24"/>
         </w:rPr>
-        <w:t>Le périmètre de ce projet couvre la conception, la mise en œuvre et la documentation d’une infrastructure SSO sécurisée intégrant six services applicatifs (GitLab, Jenkins, Nextcloud, JIRA, Confluence, Rocket.Chat) :</w:t>
+        <w:t xml:space="preserve">Le périmètre de ce projet couvre la conception, la mise en œuvre et la documentation d’une infrastructure SSO sécurisée intégrant six services applicatifs (GitLab, Jenkins, Nextcloud, </w:t>
+      </w:r>
+      <w:r>
+        <w:rPr>
+          <w:rFonts w:ascii="Calibri" w:hAnsi="Calibri" w:cs="Calibri"/>
+          <w:sz w:val="24"/>
+          <w:szCs w:val="24"/>
+        </w:rPr>
+        <w:t>Libre</w:t>
+      </w:r>
+      <w:r>
+        <w:rPr>
+          <w:rFonts w:ascii="Calibri" w:hAnsi="Calibri" w:cs="Calibri"/>
+          <w:sz w:val="24"/>
+          <w:szCs w:val="24"/>
+        </w:rPr>
+        <w:t>desk</w:t>
+      </w:r>
+      <w:r>
+        <w:rPr>
+          <w:rFonts w:ascii="Calibri" w:hAnsi="Calibri" w:cs="Calibri"/>
+          <w:sz w:val="24"/>
+          <w:szCs w:val="24"/>
+        </w:rPr>
+        <w:t>, Rocket.Chat) :</w:t>
       </w:r>
     </w:p>
     <w:p>
@@ -6302,10 +6355,10 @@
           <w:szCs w:val="24"/>
         </w:rPr>
         <w:drawing>
-          <wp:inline distT="0" distB="0" distL="0" distR="0" wp14:anchorId="37559388" wp14:editId="6909962E">
-            <wp:extent cx="5608320" cy="2202180"/>
-            <wp:effectExtent l="0" t="0" r="0" b="7620"/>
-            <wp:docPr id="282699800" name="Image 3"/>
+          <wp:inline distT="0" distB="0" distL="0" distR="0" wp14:anchorId="63FA857A" wp14:editId="01A75479">
+            <wp:extent cx="5981700" cy="2552700"/>
+            <wp:effectExtent l="0" t="0" r="0" b="0"/>
+            <wp:docPr id="940098276" name="Image 3"/>
             <wp:cNvGraphicFramePr>
               <a:graphicFrameLocks xmlns:a="http://schemas.openxmlformats.org/drawingml/2006/main" noChangeAspect="1"/>
             </wp:cNvGraphicFramePr>
@@ -6313,7 +6366,7 @@
               <a:graphicData uri="http://schemas.openxmlformats.org/drawingml/2006/picture">
                 <pic:pic xmlns:pic="http://schemas.openxmlformats.org/drawingml/2006/picture">
                   <pic:nvPicPr>
-                    <pic:cNvPr id="0" name="Picture 3"/>
+                    <pic:cNvPr id="0" name="Picture 7"/>
                     <pic:cNvPicPr>
                       <a:picLocks noChangeAspect="1" noChangeArrowheads="1"/>
                     </pic:cNvPicPr>
@@ -6334,7 +6387,7 @@
                   <pic:spPr bwMode="auto">
                     <a:xfrm>
                       <a:off x="0" y="0"/>
-                      <a:ext cx="5608320" cy="2202180"/>
+                      <a:ext cx="5981700" cy="2552700"/>
                     </a:xfrm>
                     <a:prstGeom prst="rect">
                       <a:avLst/>
@@ -6482,10 +6535,10 @@
           <w:szCs w:val="24"/>
         </w:rPr>
         <w:drawing>
-          <wp:inline distT="0" distB="0" distL="0" distR="0" wp14:anchorId="2FD35162" wp14:editId="58E5DAF1">
-            <wp:extent cx="5608320" cy="2034540"/>
-            <wp:effectExtent l="0" t="0" r="0" b="3810"/>
-            <wp:docPr id="1039252190" name="Image 4"/>
+          <wp:inline distT="0" distB="0" distL="0" distR="0" wp14:anchorId="39F3810D" wp14:editId="5881A147">
+            <wp:extent cx="5753100" cy="2209800"/>
+            <wp:effectExtent l="0" t="0" r="0" b="0"/>
+            <wp:docPr id="468730694" name="Image 4"/>
             <wp:cNvGraphicFramePr>
               <a:graphicFrameLocks xmlns:a="http://schemas.openxmlformats.org/drawingml/2006/main" noChangeAspect="1"/>
             </wp:cNvGraphicFramePr>
@@ -6493,7 +6546,7 @@
               <a:graphicData uri="http://schemas.openxmlformats.org/drawingml/2006/picture">
                 <pic:pic xmlns:pic="http://schemas.openxmlformats.org/drawingml/2006/picture">
                   <pic:nvPicPr>
-                    <pic:cNvPr id="0" name="Picture 4"/>
+                    <pic:cNvPr id="0" name="Picture 8"/>
                     <pic:cNvPicPr>
                       <a:picLocks noChangeAspect="1" noChangeArrowheads="1"/>
                     </pic:cNvPicPr>
@@ -6514,7 +6567,7 @@
                   <pic:spPr bwMode="auto">
                     <a:xfrm>
                       <a:off x="0" y="0"/>
-                      <a:ext cx="5608320" cy="2034540"/>
+                      <a:ext cx="5753100" cy="2209800"/>
                     </a:xfrm>
                     <a:prstGeom prst="rect">
                       <a:avLst/>
@@ -6595,7 +6648,31 @@
           <w:sz w:val="24"/>
           <w:szCs w:val="24"/>
         </w:rPr>
-        <w:t>Les services consommateurs – GitLab, Jenkins, Nextcloud, JIRA, Confluence, Rocket.Chat</w:t>
+        <w:t xml:space="preserve">Les services consommateurs – GitLab, Jenkins, Nextcloud, </w:t>
+      </w:r>
+      <w:r>
+        <w:rPr>
+          <w:rFonts w:ascii="Calibri" w:hAnsi="Calibri" w:cs="Calibri"/>
+          <w:sz w:val="24"/>
+          <w:szCs w:val="24"/>
+        </w:rPr>
+        <w:t>Libr</w:t>
+      </w:r>
+      <w:r>
+        <w:rPr>
+          <w:rFonts w:ascii="Calibri" w:hAnsi="Calibri" w:cs="Calibri"/>
+          <w:sz w:val="24"/>
+          <w:szCs w:val="24"/>
+        </w:rPr>
+        <w:t>edesk</w:t>
+      </w:r>
+      <w:r>
+        <w:rPr>
+          <w:rFonts w:ascii="Calibri" w:hAnsi="Calibri" w:cs="Calibri"/>
+          <w:sz w:val="24"/>
+          <w:szCs w:val="24"/>
+        </w:rPr>
+        <w:t>, Rocket.Chat</w:t>
       </w:r>
     </w:p>
     <w:p>
@@ -6760,23 +6837,14 @@
       <w:r>
         <w:rPr>
           <w:rFonts w:ascii="Calibri" w:hAnsi="Calibri" w:cs="Calibri"/>
-          <w:lang w:val="en-US"/>
         </w:rPr>
         <w:t>2.</w:t>
       </w:r>
       <w:r>
         <w:rPr>
           <w:rFonts w:ascii="Calibri" w:hAnsi="Calibri" w:cs="Calibri"/>
-          <w:lang w:val="en-US"/>
-        </w:rPr>
-        <w:t>2</w:t>
-      </w:r>
-      <w:r>
-        <w:rPr>
-          <w:rFonts w:ascii="Calibri" w:hAnsi="Calibri" w:cs="Calibri"/>
-          <w:lang w:val="en-US"/>
-        </w:rPr>
-        <w:t xml:space="preserve"> – </w:t>
+        </w:rPr>
+        <w:t xml:space="preserve">2 – </w:t>
       </w:r>
       <w:r>
         <w:rPr>
@@ -6954,7 +7022,6 @@
       <w:r>
         <w:rPr>
           <w:rFonts w:ascii="Calibri" w:hAnsi="Calibri" w:cs="Calibri"/>
-          <w:lang w:val="en-US"/>
         </w:rPr>
         <w:t>2.</w:t>
       </w:r>
@@ -7009,10 +7076,10 @@
           <w:szCs w:val="24"/>
         </w:rPr>
         <w:drawing>
-          <wp:inline distT="0" distB="0" distL="0" distR="0" wp14:anchorId="050D2E30" wp14:editId="65B1AAB9">
-            <wp:extent cx="5608320" cy="2941320"/>
-            <wp:effectExtent l="0" t="0" r="0" b="0"/>
-            <wp:docPr id="453174310" name="Image 5"/>
+          <wp:inline distT="0" distB="0" distL="0" distR="0" wp14:anchorId="6E92EE73" wp14:editId="04263DFE">
+            <wp:extent cx="5608320" cy="3444240"/>
+            <wp:effectExtent l="0" t="0" r="0" b="3810"/>
+            <wp:docPr id="390333147" name="Image 5"/>
             <wp:cNvGraphicFramePr>
               <a:graphicFrameLocks xmlns:a="http://schemas.openxmlformats.org/drawingml/2006/main" noChangeAspect="1"/>
             </wp:cNvGraphicFramePr>
@@ -7020,7 +7087,7 @@
               <a:graphicData uri="http://schemas.openxmlformats.org/drawingml/2006/picture">
                 <pic:pic xmlns:pic="http://schemas.openxmlformats.org/drawingml/2006/picture">
                   <pic:nvPicPr>
-                    <pic:cNvPr id="0" name="Picture 5"/>
+                    <pic:cNvPr id="0" name="Picture 9"/>
                     <pic:cNvPicPr>
                       <a:picLocks noChangeAspect="1" noChangeArrowheads="1"/>
                     </pic:cNvPicPr>
@@ -7041,7 +7108,7 @@
                   <pic:spPr bwMode="auto">
                     <a:xfrm>
                       <a:off x="0" y="0"/>
-                      <a:ext cx="5608320" cy="2941320"/>
+                      <a:ext cx="5608320" cy="3444240"/>
                     </a:xfrm>
                     <a:prstGeom prst="rect">
                       <a:avLst/>
@@ -7118,7 +7185,6 @@
       <w:r>
         <w:rPr>
           <w:rFonts w:ascii="Calibri" w:hAnsi="Calibri" w:cs="Calibri"/>
-          <w:lang w:val="en-US"/>
         </w:rPr>
         <w:t>2.</w:t>
       </w:r>
@@ -7554,23 +7620,13 @@
           <w:szCs w:val="24"/>
         </w:rPr>
       </w:pPr>
-      <w:proofErr w:type="spellStart"/>
-      <w:r>
-        <w:rPr>
-          <w:rFonts w:ascii="Calibri" w:hAnsi="Calibri" w:cs="Calibri"/>
-          <w:sz w:val="24"/>
-          <w:szCs w:val="24"/>
-        </w:rPr>
-        <w:t>Refresh</w:t>
-      </w:r>
-      <w:proofErr w:type="spellEnd"/>
-      <w:r>
-        <w:rPr>
-          <w:rFonts w:ascii="Calibri" w:hAnsi="Calibri" w:cs="Calibri"/>
-          <w:sz w:val="24"/>
-          <w:szCs w:val="24"/>
-        </w:rPr>
-        <w:t xml:space="preserve"> Token – permet le renouvellement des « Tokens » sans réauthentification</w:t>
+      <w:r>
+        <w:rPr>
+          <w:rFonts w:ascii="Calibri" w:hAnsi="Calibri" w:cs="Calibri"/>
+          <w:sz w:val="24"/>
+          <w:szCs w:val="24"/>
+        </w:rPr>
+        <w:t>Refresh Token – permet le renouvellement des « Tokens » sans réauthentification</w:t>
       </w:r>
     </w:p>
     <w:p>
@@ -8866,7 +8922,6 @@
       <w:r>
         <w:rPr>
           <w:rFonts w:ascii="Calibri" w:hAnsi="Calibri" w:cs="Calibri"/>
-          <w:lang w:val="en-US"/>
         </w:rPr>
         <w:t>2.</w:t>
       </w:r>
@@ -8879,7 +8934,6 @@
       <w:r>
         <w:rPr>
           <w:rFonts w:ascii="Calibri" w:hAnsi="Calibri" w:cs="Calibri"/>
-          <w:lang w:val="en-US"/>
         </w:rPr>
         <w:t xml:space="preserve"> – </w:t>
       </w:r>
@@ -9561,7 +9615,6 @@
       <w:r>
         <w:rPr>
           <w:rFonts w:ascii="Calibri" w:hAnsi="Calibri" w:cs="Calibri"/>
-          <w:lang w:val="en-US"/>
         </w:rPr>
         <w:t>2.</w:t>
       </w:r>
@@ -9744,13 +9797,7 @@
       </w:pPr>
       <w:bookmarkStart w:id="22" w:name="_Toc226833210"/>
       <w:r>
-        <w:t>4.</w:t>
-      </w:r>
-      <w:r>
-        <w:t>2</w:t>
-      </w:r>
-      <w:r>
-        <w:t xml:space="preserve"> – </w:t>
+        <w:t xml:space="preserve">4.2 – </w:t>
       </w:r>
       <w:r>
         <w:t>Segmentation réseau Docker</w:t>
@@ -9769,13 +9816,7 @@
       </w:pPr>
       <w:bookmarkStart w:id="23" w:name="_Toc226833211"/>
       <w:r>
-        <w:t>4.</w:t>
-      </w:r>
-      <w:r>
-        <w:t>3</w:t>
-      </w:r>
-      <w:r>
-        <w:t xml:space="preserve"> – </w:t>
+        <w:t xml:space="preserve">4.3 – </w:t>
       </w:r>
       <w:r>
         <w:t>FQDN et plan d'adressage</w:t>
@@ -9794,13 +9835,7 @@
       </w:pPr>
       <w:bookmarkStart w:id="24" w:name="_Toc226833212"/>
       <w:r>
-        <w:t>4.</w:t>
-      </w:r>
-      <w:r>
-        <w:t>4</w:t>
-      </w:r>
-      <w:r>
-        <w:t xml:space="preserve"> – </w:t>
+        <w:t xml:space="preserve">4.4 – </w:t>
       </w:r>
       <w:r>
         <w:t>Diagramme de flux réseau et ports</w:t>
@@ -9819,13 +9854,7 @@
       </w:pPr>
       <w:bookmarkStart w:id="25" w:name="_Toc226833213"/>
       <w:r>
-        <w:t>4.</w:t>
-      </w:r>
-      <w:r>
-        <w:t>5</w:t>
-      </w:r>
-      <w:r>
-        <w:t xml:space="preserve"> – </w:t>
+        <w:t xml:space="preserve">4.5 – </w:t>
       </w:r>
       <w:r>
         <w:t>Certificats TLS</w:t>
@@ -9844,13 +9873,7 @@
       </w:pPr>
       <w:bookmarkStart w:id="26" w:name="_Toc226833214"/>
       <w:r>
-        <w:t>4.</w:t>
-      </w:r>
-      <w:r>
-        <w:t>6</w:t>
-      </w:r>
-      <w:r>
-        <w:t xml:space="preserve"> – </w:t>
+        <w:t xml:space="preserve">4.6 – </w:t>
       </w:r>
       <w:r>
         <w:t>Choix technique et justification (pourquoi Docker ? Authelia ? Nginx)</w:t>
@@ -9884,7 +9907,6 @@
       </w:pPr>
       <w:bookmarkStart w:id="27" w:name="_Toc226833215"/>
       <w:r>
-        <w:lastRenderedPageBreak/>
         <w:t>V – GESTION DES IDENTITÉS ET DES ACCÈS</w:t>
       </w:r>
       <w:bookmarkEnd w:id="27"/>
@@ -9896,10 +9918,7 @@
       </w:pPr>
       <w:bookmarkStart w:id="28" w:name="_Toc226833216"/>
       <w:r>
-        <w:t>5</w:t>
-      </w:r>
-      <w:r>
-        <w:t xml:space="preserve">.1 – </w:t>
+        <w:t xml:space="preserve">5.1 – </w:t>
       </w:r>
       <w:r>
         <w:t>Nomenclature CIP des utilisateurs</w:t>
@@ -9918,23 +9937,12 @@
       </w:pPr>
       <w:bookmarkStart w:id="29" w:name="_Toc226833217"/>
       <w:r>
-        <w:t>5.</w:t>
-      </w:r>
-      <w:r>
-        <w:t>2</w:t>
-      </w:r>
-      <w:r>
-        <w:t xml:space="preserve"> – </w:t>
-      </w:r>
-      <w:r>
-        <w:t xml:space="preserve">Annuaire </w:t>
-      </w:r>
-      <w:proofErr w:type="spellStart"/>
-      <w:r>
-        <w:t>OpenLDAP</w:t>
+        <w:t xml:space="preserve">5.2 – </w:t>
+      </w:r>
+      <w:r>
+        <w:t>Annuaire OpenLDAP</w:t>
       </w:r>
       <w:bookmarkEnd w:id="29"/>
-      <w:proofErr w:type="spellEnd"/>
     </w:p>
     <w:p>
       <w:pPr>
@@ -9948,13 +9956,7 @@
       </w:pPr>
       <w:bookmarkStart w:id="30" w:name="_Toc226833218"/>
       <w:r>
-        <w:t>5.</w:t>
-      </w:r>
-      <w:r>
-        <w:t>3</w:t>
-      </w:r>
-      <w:r>
-        <w:t xml:space="preserve"> – </w:t>
+        <w:t xml:space="preserve">5.3 – </w:t>
       </w:r>
       <w:r>
         <w:t>Groupes et permissions associées</w:t>
@@ -9973,13 +9975,7 @@
       </w:pPr>
       <w:bookmarkStart w:id="31" w:name="_Toc226833219"/>
       <w:r>
-        <w:t>5.</w:t>
-      </w:r>
-      <w:r>
-        <w:t>4</w:t>
-      </w:r>
-      <w:r>
-        <w:t xml:space="preserve"> – </w:t>
+        <w:t xml:space="preserve">5.4 – </w:t>
       </w:r>
       <w:r>
         <w:t>Politique d'accès Authelia</w:t>
@@ -9998,13 +9994,7 @@
       </w:pPr>
       <w:bookmarkStart w:id="32" w:name="_Toc226833220"/>
       <w:r>
-        <w:t>5.</w:t>
-      </w:r>
-      <w:r>
-        <w:t>5</w:t>
-      </w:r>
-      <w:r>
-        <w:t xml:space="preserve"> – </w:t>
+        <w:t xml:space="preserve">5.5 – </w:t>
       </w:r>
       <w:r>
         <w:t>Limites de login et régulation</w:t>
@@ -10023,13 +10013,7 @@
       </w:pPr>
       <w:bookmarkStart w:id="33" w:name="_Toc226833221"/>
       <w:r>
-        <w:t>5.</w:t>
-      </w:r>
-      <w:r>
-        <w:t>6</w:t>
-      </w:r>
-      <w:r>
-        <w:t xml:space="preserve"> – </w:t>
+        <w:t xml:space="preserve">5.6 – </w:t>
       </w:r>
       <w:r>
         <w:t>Politique de mots de passe</w:t>
@@ -10063,7 +10047,6 @@
       </w:pPr>
       <w:bookmarkStart w:id="34" w:name="_Toc226833222"/>
       <w:r>
-        <w:lastRenderedPageBreak/>
         <w:t>VI – IMPLÉMENTATION</w:t>
       </w:r>
       <w:bookmarkEnd w:id="34"/>
@@ -10075,10 +10058,7 @@
       </w:pPr>
       <w:bookmarkStart w:id="35" w:name="_Toc226833223"/>
       <w:r>
-        <w:t>6</w:t>
-      </w:r>
-      <w:r>
-        <w:t xml:space="preserve">.1 – </w:t>
+        <w:t xml:space="preserve">6.1 – </w:t>
       </w:r>
       <w:r>
         <w:t>Mise en place de l'environnement Docker</w:t>
@@ -10097,13 +10077,7 @@
       </w:pPr>
       <w:bookmarkStart w:id="36" w:name="_Toc226833224"/>
       <w:r>
-        <w:t>6.</w:t>
-      </w:r>
-      <w:r>
-        <w:t>2</w:t>
-      </w:r>
-      <w:r>
-        <w:t xml:space="preserve"> – </w:t>
+        <w:t xml:space="preserve">6.2 – </w:t>
       </w:r>
       <w:r>
         <w:t>Configuration de Nginx (reverse proxy + TLS)</w:t>
@@ -10122,13 +10096,7 @@
       </w:pPr>
       <w:bookmarkStart w:id="37" w:name="_Toc226833225"/>
       <w:r>
-        <w:t>6.</w:t>
-      </w:r>
-      <w:r>
-        <w:t>3</w:t>
-      </w:r>
-      <w:r>
-        <w:t xml:space="preserve"> – </w:t>
+        <w:t xml:space="preserve">6.3 – </w:t>
       </w:r>
       <w:r>
         <w:t>Déploiement d'Authelia</w:t>
@@ -10147,13 +10115,7 @@
       </w:pPr>
       <w:bookmarkStart w:id="38" w:name="_Toc226833226"/>
       <w:r>
-        <w:t>6.</w:t>
-      </w:r>
-      <w:r>
-        <w:t>4</w:t>
-      </w:r>
-      <w:r>
-        <w:t xml:space="preserve"> – </w:t>
+        <w:t xml:space="preserve">6.4 – </w:t>
       </w:r>
       <w:r>
         <w:t>Intégration OIDC par service</w:t>
@@ -10178,34 +10140,53 @@
         <w:rPr>
           <w:lang w:val="en-US"/>
         </w:rPr>
-        <w:t>6.</w:t>
+        <w:t xml:space="preserve">6.4.1 – </w:t>
       </w:r>
       <w:r>
         <w:rPr>
           <w:lang w:val="en-US"/>
         </w:rPr>
-        <w:t>4.1</w:t>
-      </w:r>
-      <w:r>
+        <w:t>GitLab</w:t>
+      </w:r>
+      <w:bookmarkEnd w:id="39"/>
+    </w:p>
+    <w:p>
+      <w:pPr>
+        <w:jc w:val="both"/>
         <w:rPr>
           <w:lang w:val="en-US"/>
         </w:rPr>
-        <w:t xml:space="preserve"> – </w:t>
-      </w:r>
-      <w:r>
+      </w:pPr>
+    </w:p>
+    <w:p>
+      <w:pPr>
+        <w:pStyle w:val="Titre3"/>
+        <w:jc w:val="both"/>
         <w:rPr>
           <w:lang w:val="en-US"/>
         </w:rPr>
-        <w:t>GitLab</w:t>
-      </w:r>
-      <w:bookmarkEnd w:id="39"/>
-    </w:p>
-    <w:p>
-      <w:pPr>
-        <w:jc w:val="both"/>
+      </w:pPr>
+      <w:bookmarkStart w:id="40" w:name="_Toc226833228"/>
+      <w:r>
         <w:rPr>
           <w:lang w:val="en-US"/>
         </w:rPr>
+        <w:t xml:space="preserve">6.4.2 – </w:t>
+      </w:r>
+      <w:r>
+        <w:rPr>
+          <w:lang w:val="en-US"/>
+        </w:rPr>
+        <w:t>Jenkins</w:t>
+      </w:r>
+      <w:bookmarkEnd w:id="40"/>
+    </w:p>
+    <w:p>
+      <w:pPr>
+        <w:jc w:val="both"/>
+        <w:rPr>
+          <w:lang w:val="en-US"/>
+        </w:rPr>
       </w:pPr>
     </w:p>
     <w:p>
@@ -10216,39 +10197,52 @@
           <w:lang w:val="en-US"/>
         </w:rPr>
       </w:pPr>
-      <w:bookmarkStart w:id="40" w:name="_Toc226833228"/>
+      <w:bookmarkStart w:id="41" w:name="_Toc226833229"/>
       <w:r>
         <w:rPr>
           <w:lang w:val="en-US"/>
         </w:rPr>
-        <w:t>6.</w:t>
+        <w:t xml:space="preserve">6.4.3 – </w:t>
       </w:r>
       <w:r>
         <w:rPr>
           <w:lang w:val="en-US"/>
         </w:rPr>
-        <w:t>4.2</w:t>
-      </w:r>
-      <w:r>
+        <w:t>Nextcloud</w:t>
+      </w:r>
+      <w:bookmarkEnd w:id="41"/>
+    </w:p>
+    <w:p>
+      <w:pPr>
+        <w:jc w:val="both"/>
         <w:rPr>
           <w:lang w:val="en-US"/>
         </w:rPr>
-        <w:t xml:space="preserve"> – </w:t>
-      </w:r>
-      <w:r>
+      </w:pPr>
+    </w:p>
+    <w:p>
+      <w:pPr>
+        <w:pStyle w:val="Titre3"/>
+        <w:jc w:val="both"/>
         <w:rPr>
           <w:lang w:val="en-US"/>
         </w:rPr>
-        <w:t>Jenkins</w:t>
-      </w:r>
-      <w:bookmarkEnd w:id="40"/>
-    </w:p>
-    <w:p>
-      <w:pPr>
-        <w:jc w:val="both"/>
+      </w:pPr>
+      <w:bookmarkStart w:id="42" w:name="_Toc226833230"/>
+      <w:r>
         <w:rPr>
           <w:lang w:val="en-US"/>
         </w:rPr>
+        <w:t>6.4.4 – Rocket.Chat</w:t>
+      </w:r>
+      <w:bookmarkEnd w:id="42"/>
+    </w:p>
+    <w:p>
+      <w:pPr>
+        <w:jc w:val="both"/>
+        <w:rPr>
+          <w:lang w:val="en-US"/>
+        </w:rPr>
       </w:pPr>
     </w:p>
     <w:p>
@@ -10259,104 +10253,12 @@
           <w:lang w:val="en-US"/>
         </w:rPr>
       </w:pPr>
-      <w:bookmarkStart w:id="41" w:name="_Toc226833229"/>
+      <w:bookmarkStart w:id="43" w:name="_Toc226833231"/>
       <w:r>
         <w:rPr>
           <w:lang w:val="en-US"/>
         </w:rPr>
-        <w:t>6.</w:t>
-      </w:r>
-      <w:r>
-        <w:rPr>
-          <w:lang w:val="en-US"/>
-        </w:rPr>
-        <w:t>4.3</w:t>
-      </w:r>
-      <w:r>
-        <w:rPr>
-          <w:lang w:val="en-US"/>
-        </w:rPr>
-        <w:t xml:space="preserve"> – </w:t>
-      </w:r>
-      <w:r>
-        <w:rPr>
-          <w:lang w:val="en-US"/>
-        </w:rPr>
-        <w:t>Nextcloud</w:t>
-      </w:r>
-      <w:bookmarkEnd w:id="41"/>
-    </w:p>
-    <w:p>
-      <w:pPr>
-        <w:jc w:val="both"/>
-        <w:rPr>
-          <w:lang w:val="en-US"/>
-        </w:rPr>
-      </w:pPr>
-    </w:p>
-    <w:p>
-      <w:pPr>
-        <w:pStyle w:val="Titre3"/>
-        <w:jc w:val="both"/>
-        <w:rPr>
-          <w:lang w:val="en-US"/>
-        </w:rPr>
-      </w:pPr>
-      <w:bookmarkStart w:id="42" w:name="_Toc226833230"/>
-      <w:r>
-        <w:rPr>
-          <w:lang w:val="en-US"/>
-        </w:rPr>
-        <w:t>6.</w:t>
-      </w:r>
-      <w:r>
-        <w:rPr>
-          <w:lang w:val="en-US"/>
-        </w:rPr>
-        <w:t>4.4</w:t>
-      </w:r>
-      <w:r>
-        <w:rPr>
-          <w:lang w:val="en-US"/>
-        </w:rPr>
-        <w:t xml:space="preserve"> – Rocket.Chat</w:t>
-      </w:r>
-      <w:bookmarkEnd w:id="42"/>
-    </w:p>
-    <w:p>
-      <w:pPr>
-        <w:jc w:val="both"/>
-        <w:rPr>
-          <w:lang w:val="en-US"/>
-        </w:rPr>
-      </w:pPr>
-    </w:p>
-    <w:p>
-      <w:pPr>
-        <w:pStyle w:val="Titre3"/>
-        <w:jc w:val="both"/>
-        <w:rPr>
-          <w:lang w:val="en-US"/>
-        </w:rPr>
-      </w:pPr>
-      <w:bookmarkStart w:id="43" w:name="_Toc226833231"/>
-      <w:r>
-        <w:rPr>
-          <w:lang w:val="en-US"/>
-        </w:rPr>
-        <w:t>6.</w:t>
-      </w:r>
-      <w:r>
-        <w:rPr>
-          <w:lang w:val="en-US"/>
-        </w:rPr>
-        <w:t>4.5</w:t>
-      </w:r>
-      <w:r>
-        <w:rPr>
-          <w:lang w:val="en-US"/>
-        </w:rPr>
-        <w:t xml:space="preserve"> – </w:t>
+        <w:t xml:space="preserve">6.4.5 – </w:t>
       </w:r>
       <w:proofErr w:type="spellStart"/>
       <w:r>
@@ -10383,13 +10285,7 @@
       </w:pPr>
       <w:bookmarkStart w:id="44" w:name="_Toc226833232"/>
       <w:r>
-        <w:t>6.</w:t>
-      </w:r>
-      <w:r>
-        <w:t>5</w:t>
-      </w:r>
-      <w:r>
-        <w:t xml:space="preserve"> – </w:t>
+        <w:t xml:space="preserve">6.5 – </w:t>
       </w:r>
       <w:r>
         <w:t>Flux d'authentification par service (diagramme séquence)</w:t>
@@ -10408,13 +10304,7 @@
       </w:pPr>
       <w:bookmarkStart w:id="45" w:name="_Toc226833233"/>
       <w:r>
-        <w:t>6.</w:t>
-      </w:r>
-      <w:r>
-        <w:t>6</w:t>
-      </w:r>
-      <w:r>
-        <w:t xml:space="preserve"> – </w:t>
+        <w:t xml:space="preserve">6.6 – </w:t>
       </w:r>
       <w:r>
         <w:t>Gestion des variables d’environnement et secrets</w:t>
@@ -10433,13 +10323,7 @@
       </w:pPr>
       <w:bookmarkStart w:id="46" w:name="_Toc226833234"/>
       <w:r>
-        <w:t>6.</w:t>
-      </w:r>
-      <w:r>
-        <w:t>7</w:t>
-      </w:r>
-      <w:r>
-        <w:t xml:space="preserve"> – </w:t>
+        <w:t xml:space="preserve">6.7 – </w:t>
       </w:r>
       <w:r>
         <w:t>Configuration du 2FA (TOTP)</w:t>
@@ -10473,7 +10357,6 @@
       </w:pPr>
       <w:bookmarkStart w:id="47" w:name="_Toc226833235"/>
       <w:r>
-        <w:lastRenderedPageBreak/>
         <w:t>VII – POINTS DÉPASSANT LE CAHIER DE CHARGES</w:t>
       </w:r>
       <w:bookmarkEnd w:id="47"/>
@@ -10504,13 +10387,7 @@
       </w:pPr>
       <w:bookmarkStart w:id="49" w:name="_Toc226833237"/>
       <w:r>
-        <w:t>7.</w:t>
-      </w:r>
-      <w:r>
-        <w:t>2</w:t>
-      </w:r>
-      <w:r>
-        <w:t xml:space="preserve"> – </w:t>
+        <w:t xml:space="preserve">7.2 – </w:t>
       </w:r>
       <w:r>
         <w:t xml:space="preserve">Xxxx (par </w:t>
@@ -10519,15 +10396,7 @@
         <w:t>exemple Serveur</w:t>
       </w:r>
       <w:r>
-        <w:t xml:space="preserve"> </w:t>
-      </w:r>
-      <w:proofErr w:type="spellStart"/>
-      <w:r>
-        <w:t>OpenLDAP</w:t>
-      </w:r>
-      <w:proofErr w:type="spellEnd"/>
-      <w:r>
-        <w:t xml:space="preserve"> fonctionnel)</w:t>
+        <w:t xml:space="preserve"> OpenLDAP fonctionnel)</w:t>
       </w:r>
       <w:bookmarkEnd w:id="49"/>
     </w:p>
@@ -10543,13 +10412,7 @@
       </w:pPr>
       <w:bookmarkStart w:id="50" w:name="_Toc226833238"/>
       <w:r>
-        <w:t>7.</w:t>
-      </w:r>
-      <w:r>
-        <w:t>3</w:t>
-      </w:r>
-      <w:r>
-        <w:t xml:space="preserve"> – </w:t>
+        <w:t xml:space="preserve">7.3 – </w:t>
       </w:r>
       <w:r>
         <w:t xml:space="preserve">Xxxx </w:t>
@@ -10589,7 +10452,6 @@
       </w:pPr>
       <w:bookmarkStart w:id="51" w:name="_Toc226833239"/>
       <w:r>
-        <w:lastRenderedPageBreak/>
         <w:t>VIII – POINTS BLOQUANTS ET MITIGATIONS</w:t>
       </w:r>
       <w:bookmarkEnd w:id="51"/>
@@ -10601,10 +10463,7 @@
       </w:pPr>
       <w:bookmarkStart w:id="52" w:name="_Toc226833240"/>
       <w:r>
-        <w:t>8</w:t>
-      </w:r>
-      <w:r>
-        <w:t xml:space="preserve">.1 – </w:t>
+        <w:t xml:space="preserve">8.1 – </w:t>
       </w:r>
       <w:r>
         <w:t>Problèmes rencontrés</w:t>
@@ -10623,13 +10482,7 @@
       </w:pPr>
       <w:bookmarkStart w:id="53" w:name="_Toc226833241"/>
       <w:r>
-        <w:t>8.</w:t>
-      </w:r>
-      <w:r>
-        <w:t>2</w:t>
-      </w:r>
-      <w:r>
-        <w:t xml:space="preserve"> – </w:t>
+        <w:t xml:space="preserve">8.2 – </w:t>
       </w:r>
       <w:r>
         <w:t>Solutions apportées</w:t>
@@ -10648,13 +10501,7 @@
       </w:pPr>
       <w:bookmarkStart w:id="54" w:name="_Toc226833242"/>
       <w:r>
-        <w:t>8.</w:t>
-      </w:r>
-      <w:r>
-        <w:t>3</w:t>
-      </w:r>
-      <w:r>
-        <w:t xml:space="preserve"> – </w:t>
+        <w:t xml:space="preserve">8.3 – </w:t>
       </w:r>
       <w:r>
         <w:t>Points mis de côté et justifications</w:t>
@@ -10688,7 +10535,6 @@
       </w:pPr>
       <w:bookmarkStart w:id="55" w:name="_Toc226833243"/>
       <w:r>
-        <w:lastRenderedPageBreak/>
         <w:t>IX – CONCLUSION</w:t>
       </w:r>
       <w:bookmarkEnd w:id="55"/>
@@ -10700,10 +10546,7 @@
       </w:pPr>
       <w:bookmarkStart w:id="56" w:name="_Toc226833244"/>
       <w:r>
-        <w:t>9</w:t>
-      </w:r>
-      <w:r>
-        <w:t xml:space="preserve">.1 – </w:t>
+        <w:t xml:space="preserve">9.1 – </w:t>
       </w:r>
       <w:r>
         <w:t>Notions apprises</w:t>
@@ -10722,10 +10565,7 @@
       </w:pPr>
       <w:bookmarkStart w:id="57" w:name="_Toc226833245"/>
       <w:r>
-        <w:t>9.2</w:t>
-      </w:r>
-      <w:r>
-        <w:t xml:space="preserve"> – </w:t>
+        <w:t xml:space="preserve">9.2 – </w:t>
       </w:r>
       <w:r>
         <w:t>Perspectives d'amélioration</w:t>
@@ -10759,7 +10599,6 @@
       </w:pPr>
       <w:bookmarkStart w:id="58" w:name="_Toc226833246"/>
       <w:r>
-        <w:lastRenderedPageBreak/>
         <w:t>X – RÉFÉRENCES</w:t>
       </w:r>
       <w:bookmarkEnd w:id="58"/>
@@ -10791,7 +10630,6 @@
       </w:pPr>
       <w:bookmarkStart w:id="59" w:name="_Toc226833247"/>
       <w:r>
-        <w:lastRenderedPageBreak/>
         <w:t xml:space="preserve">XI – </w:t>
       </w:r>
       <w:r>
@@ -14637,6 +14475,7 @@
   <w:style w:type="character" w:default="1" w:styleId="Policepardfaut">
     <w:name w:val="Default Paragraph Font"/>
     <w:uiPriority w:val="1"/>
+    <w:semiHidden/>
     <w:unhideWhenUsed/>
   </w:style>
   <w:style w:type="table" w:default="1" w:styleId="TableauNormal">
@@ -15071,7 +14910,7 @@
       <w:ind w:left="440"/>
     </w:pPr>
   </w:style>
-  <w:style w:type="character" w:styleId="Lienhypertexte">
+  <w:style w:type="character" w:styleId="Hyperlien">
     <w:name w:val="Hyperlink"/>
     <w:basedOn w:val="Policepardfaut"/>
     <w:uiPriority w:val="99"/>

</xml_diff>

<commit_message>
Rapport Mise à jour : 2.3 - Authelia Le coeur du systeme, 8.1 - Problemes rencontrés, 8.2 - Solutions apportées
</commit_message>
<xml_diff>
--- a/infrastructure/docs/Rapport 1.0.docx
+++ b/infrastructure/docs/Rapport 1.0.docx
@@ -7477,7 +7477,6 @@
           <w:rFonts w:ascii="Calibri" w:hAnsi="Calibri" w:cs="Calibri"/>
           <w:lang w:val="en-US"/>
         </w:rPr>
-        <w:lastRenderedPageBreak/>
         <w:t>2.</w:t>
       </w:r>
       <w:r>
@@ -7698,147 +7697,40 @@
     </w:p>
     <w:p>
       <w:pPr>
-        <w:pStyle w:val="Paragraphedeliste"/>
-        <w:numPr>
-          <w:ilvl w:val="0"/>
-          <w:numId w:val="22"/>
-        </w:numPr>
-        <w:spacing w:line="240" w:lineRule="auto"/>
-        <w:jc w:val="both"/>
-        <w:rPr>
-          <w:rFonts w:ascii="Calibri" w:hAnsi="Calibri" w:cs="Calibri"/>
-          <w:sz w:val="24"/>
-          <w:szCs w:val="24"/>
-        </w:rPr>
-      </w:pPr>
-      <w:r>
-        <w:rPr>
-          <w:rFonts w:ascii="Calibri" w:hAnsi="Calibri" w:cs="Calibri"/>
-          <w:sz w:val="24"/>
-          <w:szCs w:val="24"/>
-        </w:rPr>
-        <w:t>Authelia — présentation et fonctionnement</w:t>
-      </w:r>
-    </w:p>
-    <w:p>
-      <w:pPr>
-        <w:pStyle w:val="Paragraphedeliste"/>
-        <w:numPr>
-          <w:ilvl w:val="0"/>
-          <w:numId w:val="22"/>
-        </w:numPr>
-        <w:spacing w:line="240" w:lineRule="auto"/>
-        <w:jc w:val="both"/>
-        <w:rPr>
-          <w:rFonts w:ascii="Calibri" w:hAnsi="Calibri" w:cs="Calibri"/>
-          <w:sz w:val="24"/>
-          <w:szCs w:val="24"/>
-        </w:rPr>
-      </w:pPr>
-      <w:r>
-        <w:rPr>
-          <w:rFonts w:ascii="Calibri" w:hAnsi="Calibri" w:cs="Calibri"/>
-          <w:sz w:val="24"/>
-          <w:szCs w:val="24"/>
-        </w:rPr>
-        <w:t>Authentification à deux facteurs (2FA/TOTP)</w:t>
-      </w:r>
-    </w:p>
-    <w:p>
-      <w:pPr>
-        <w:pStyle w:val="Paragraphedeliste"/>
-        <w:numPr>
-          <w:ilvl w:val="0"/>
-          <w:numId w:val="22"/>
-        </w:numPr>
-        <w:spacing w:line="240" w:lineRule="auto"/>
-        <w:jc w:val="both"/>
-        <w:rPr>
-          <w:rFonts w:ascii="Calibri" w:hAnsi="Calibri" w:cs="Calibri"/>
-          <w:sz w:val="24"/>
-          <w:szCs w:val="24"/>
-        </w:rPr>
-      </w:pPr>
-      <w:r>
-        <w:rPr>
-          <w:rFonts w:ascii="Calibri" w:hAnsi="Calibri" w:cs="Calibri"/>
-          <w:sz w:val="24"/>
-          <w:szCs w:val="24"/>
-        </w:rPr>
-        <w:t>LDAP et gestion des identités</w:t>
-      </w:r>
-    </w:p>
-    <w:p>
-      <w:pPr>
-        <w:pStyle w:val="Paragraphedeliste"/>
-        <w:numPr>
-          <w:ilvl w:val="0"/>
-          <w:numId w:val="22"/>
-        </w:numPr>
-        <w:spacing w:line="240" w:lineRule="auto"/>
-        <w:jc w:val="both"/>
-        <w:rPr>
-          <w:rFonts w:ascii="Calibri" w:hAnsi="Calibri" w:cs="Calibri"/>
-          <w:sz w:val="24"/>
-          <w:szCs w:val="24"/>
-        </w:rPr>
-      </w:pPr>
-      <w:r>
-        <w:rPr>
-          <w:rFonts w:ascii="Calibri" w:hAnsi="Calibri" w:cs="Calibri"/>
-          <w:sz w:val="24"/>
-          <w:szCs w:val="24"/>
-        </w:rPr>
-        <w:t>Docker et conteneurisation</w:t>
-      </w:r>
-    </w:p>
-    <w:p>
-      <w:pPr>
-        <w:pStyle w:val="Paragraphedeliste"/>
-        <w:numPr>
-          <w:ilvl w:val="0"/>
-          <w:numId w:val="22"/>
-        </w:numPr>
-        <w:spacing w:line="240" w:lineRule="auto"/>
-        <w:jc w:val="both"/>
-        <w:rPr>
-          <w:rFonts w:ascii="Calibri" w:hAnsi="Calibri" w:cs="Calibri"/>
-          <w:sz w:val="24"/>
-          <w:szCs w:val="24"/>
-        </w:rPr>
-      </w:pPr>
-      <w:r>
-        <w:rPr>
-          <w:rFonts w:ascii="Calibri" w:hAnsi="Calibri" w:cs="Calibri"/>
-          <w:sz w:val="24"/>
-          <w:szCs w:val="24"/>
-        </w:rPr>
-        <w:t>Nginx comme reverse proxy</w:t>
-      </w:r>
-    </w:p>
-    <w:p>
-      <w:pPr>
-        <w:pStyle w:val="Paragraphedeliste"/>
-        <w:numPr>
-          <w:ilvl w:val="0"/>
-          <w:numId w:val="22"/>
-        </w:numPr>
-        <w:spacing w:line="240" w:lineRule="auto"/>
-        <w:jc w:val="both"/>
-        <w:rPr>
-          <w:rFonts w:ascii="Calibri" w:hAnsi="Calibri" w:cs="Calibri"/>
-          <w:sz w:val="24"/>
-          <w:szCs w:val="24"/>
-        </w:rPr>
-      </w:pPr>
-      <w:r>
-        <w:rPr>
-          <w:rFonts w:ascii="Calibri" w:hAnsi="Calibri" w:cs="Calibri"/>
-          <w:sz w:val="24"/>
-          <w:szCs w:val="24"/>
-        </w:rPr>
-        <w:t>Sécurité des systèmes SSO (attaques possibles, importance du HTTPS, rôle 2FA)</w:t>
-      </w:r>
+        <w:pStyle w:val="Titre2"/>
+        <w:jc w:val="both"/>
+        <w:rPr>
+          <w:rFonts w:ascii="Calibri" w:hAnsi="Calibri" w:cs="Calibri"/>
+        </w:rPr>
+      </w:pPr>
+      <w:bookmarkStart w:id="10" w:name="_Toc226833198"/>
+      <w:r>
+        <w:rPr>
+          <w:rFonts w:ascii="Calibri" w:hAnsi="Calibri" w:cs="Calibri"/>
+          <w:lang w:val="fr-FR"/>
+        </w:rPr>
+        <w:t>2.</w:t>
+      </w:r>
+      <w:r>
+        <w:rPr>
+          <w:rFonts w:ascii="Calibri" w:hAnsi="Calibri" w:cs="Calibri"/>
+        </w:rPr>
+        <w:t>3</w:t>
+      </w:r>
+      <w:r>
+        <w:rPr>
+          <w:rFonts w:ascii="Calibri" w:hAnsi="Calibri" w:cs="Calibri"/>
+          <w:lang w:val="fr-FR"/>
+        </w:rPr>
+        <w:t xml:space="preserve"> – </w:t>
+      </w:r>
+      <w:r>
+        <w:rPr>
+          <w:rFonts w:ascii="Calibri" w:hAnsi="Calibri" w:cs="Calibri"/>
+        </w:rPr>
+        <w:t>Authelia – Le cœur du système</w:t>
+      </w:r>
+      <w:bookmarkEnd w:id="10"/>
     </w:p>
     <w:p>
       <w:pPr>
@@ -7850,43 +7742,214 @@
           <w:szCs w:val="24"/>
         </w:rPr>
       </w:pPr>
-    </w:p>
-    <w:p>
-      <w:pPr>
-        <w:pStyle w:val="Titre2"/>
-        <w:jc w:val="both"/>
-        <w:rPr>
-          <w:rFonts w:ascii="Calibri" w:hAnsi="Calibri" w:cs="Calibri"/>
-        </w:rPr>
-      </w:pPr>
-      <w:bookmarkStart w:id="10" w:name="_Toc226833198"/>
-      <w:r>
-        <w:rPr>
-          <w:rFonts w:ascii="Calibri" w:hAnsi="Calibri" w:cs="Calibri"/>
-          <w:lang w:val="fr-FR"/>
-        </w:rPr>
-        <w:t>2.</w:t>
-      </w:r>
-      <w:r>
-        <w:rPr>
-          <w:rFonts w:ascii="Calibri" w:hAnsi="Calibri" w:cs="Calibri"/>
-        </w:rPr>
-        <w:t>3</w:t>
-      </w:r>
-      <w:r>
-        <w:rPr>
-          <w:rFonts w:ascii="Calibri" w:hAnsi="Calibri" w:cs="Calibri"/>
-          <w:lang w:val="fr-FR"/>
-        </w:rPr>
-        <w:t xml:space="preserve"> – </w:t>
-      </w:r>
-      <w:r>
-        <w:rPr>
-          <w:rFonts w:ascii="Calibri" w:hAnsi="Calibri" w:cs="Calibri"/>
-        </w:rPr>
-        <w:t>Authelia – Le cœur du système</w:t>
-      </w:r>
-      <w:bookmarkEnd w:id="10"/>
+      <w:r>
+        <w:rPr>
+          <w:rFonts w:ascii="Calibri" w:hAnsi="Calibri" w:cs="Calibri"/>
+          <w:sz w:val="24"/>
+          <w:szCs w:val="24"/>
+        </w:rPr>
+        <w:t>Authelia est un serveur d'authentification</w:t>
+      </w:r>
+      <w:r>
+        <w:rPr>
+          <w:rFonts w:ascii="Calibri" w:hAnsi="Calibri" w:cs="Calibri"/>
+          <w:sz w:val="24"/>
+          <w:szCs w:val="24"/>
+        </w:rPr>
+        <w:t xml:space="preserve"> et d’autorisation</w:t>
+      </w:r>
+      <w:r>
+        <w:rPr>
+          <w:rFonts w:ascii="Calibri" w:hAnsi="Calibri" w:cs="Calibri"/>
+          <w:sz w:val="24"/>
+          <w:szCs w:val="24"/>
+        </w:rPr>
+        <w:t xml:space="preserve"> permettant </w:t>
+      </w:r>
+      <w:r>
+        <w:rPr>
+          <w:rFonts w:ascii="Calibri" w:hAnsi="Calibri" w:cs="Calibri"/>
+          <w:sz w:val="24"/>
+          <w:szCs w:val="24"/>
+        </w:rPr>
+        <w:t xml:space="preserve">de mettre en place un système SSO sécurisé avec </w:t>
+      </w:r>
+      <w:r>
+        <w:rPr>
+          <w:rFonts w:ascii="Calibri" w:hAnsi="Calibri" w:cs="Calibri"/>
+          <w:sz w:val="24"/>
+          <w:szCs w:val="24"/>
+        </w:rPr>
+        <w:t xml:space="preserve">double authentification. </w:t>
+      </w:r>
+      <w:r>
+        <w:rPr>
+          <w:rFonts w:ascii="Calibri" w:hAnsi="Calibri" w:cs="Calibri"/>
+          <w:sz w:val="24"/>
+          <w:szCs w:val="24"/>
+        </w:rPr>
+        <w:t>Il</w:t>
+      </w:r>
+      <w:r>
+        <w:rPr>
+          <w:rFonts w:ascii="Calibri" w:hAnsi="Calibri" w:cs="Calibri"/>
+          <w:sz w:val="24"/>
+          <w:szCs w:val="24"/>
+        </w:rPr>
+        <w:t xml:space="preserve"> joue deux rôles simultanément</w:t>
+      </w:r>
+      <w:r>
+        <w:rPr>
+          <w:rFonts w:ascii="Calibri" w:hAnsi="Calibri" w:cs="Calibri"/>
+          <w:sz w:val="24"/>
+          <w:szCs w:val="24"/>
+        </w:rPr>
+        <w:t>, celui</w:t>
+      </w:r>
+      <w:r>
+        <w:rPr>
+          <w:rFonts w:ascii="Calibri" w:hAnsi="Calibri" w:cs="Calibri"/>
+          <w:sz w:val="24"/>
+          <w:szCs w:val="24"/>
+        </w:rPr>
+        <w:t xml:space="preserve"> de </w:t>
+      </w:r>
+      <w:r>
+        <w:rPr>
+          <w:rFonts w:ascii="Calibri" w:hAnsi="Calibri" w:cs="Calibri"/>
+          <w:sz w:val="24"/>
+          <w:szCs w:val="24"/>
+        </w:rPr>
+        <w:t>portail d’authentification</w:t>
+      </w:r>
+      <w:r>
+        <w:rPr>
+          <w:rFonts w:ascii="Calibri" w:hAnsi="Calibri" w:cs="Calibri"/>
+          <w:sz w:val="24"/>
+          <w:szCs w:val="24"/>
+        </w:rPr>
+        <w:t xml:space="preserve"> (</w:t>
+      </w:r>
+      <w:r>
+        <w:rPr>
+          <w:rFonts w:ascii="Calibri" w:hAnsi="Calibri" w:cs="Calibri"/>
+          <w:sz w:val="24"/>
+          <w:szCs w:val="24"/>
+        </w:rPr>
+        <w:t>login + 2FA</w:t>
+      </w:r>
+      <w:r>
+        <w:rPr>
+          <w:rFonts w:ascii="Calibri" w:hAnsi="Calibri" w:cs="Calibri"/>
+          <w:sz w:val="24"/>
+          <w:szCs w:val="24"/>
+        </w:rPr>
+        <w:t>)</w:t>
+      </w:r>
+      <w:r>
+        <w:rPr>
+          <w:rFonts w:ascii="Calibri" w:hAnsi="Calibri" w:cs="Calibri"/>
+          <w:sz w:val="24"/>
+          <w:szCs w:val="24"/>
+        </w:rPr>
+        <w:t>,</w:t>
+      </w:r>
+      <w:r>
+        <w:rPr>
+          <w:rFonts w:ascii="Calibri" w:hAnsi="Calibri" w:cs="Calibri"/>
+          <w:sz w:val="24"/>
+          <w:szCs w:val="24"/>
+        </w:rPr>
+        <w:t xml:space="preserve"> et</w:t>
+      </w:r>
+      <w:r>
+        <w:rPr>
+          <w:rFonts w:ascii="Calibri" w:hAnsi="Calibri" w:cs="Calibri"/>
+          <w:sz w:val="24"/>
+          <w:szCs w:val="24"/>
+        </w:rPr>
+        <w:t xml:space="preserve"> celui</w:t>
+      </w:r>
+      <w:r>
+        <w:rPr>
+          <w:rFonts w:ascii="Calibri" w:hAnsi="Calibri" w:cs="Calibri"/>
+          <w:sz w:val="24"/>
+          <w:szCs w:val="24"/>
+        </w:rPr>
+        <w:t xml:space="preserve"> de fournisseur </w:t>
+      </w:r>
+      <w:r>
+        <w:rPr>
+          <w:rFonts w:ascii="Calibri" w:hAnsi="Calibri" w:cs="Calibri"/>
+          <w:sz w:val="24"/>
+          <w:szCs w:val="24"/>
+        </w:rPr>
+        <w:t>OIDC pour les services connectés</w:t>
+      </w:r>
+      <w:r>
+        <w:rPr>
+          <w:rFonts w:ascii="Calibri" w:hAnsi="Calibri" w:cs="Calibri"/>
+          <w:sz w:val="24"/>
+          <w:szCs w:val="24"/>
+        </w:rPr>
+        <w:t>.</w:t>
+      </w:r>
+      <w:r>
+        <w:rPr>
+          <w:rFonts w:ascii="Calibri" w:hAnsi="Calibri" w:cs="Calibri"/>
+          <w:sz w:val="24"/>
+          <w:szCs w:val="24"/>
+        </w:rPr>
+        <w:t xml:space="preserve"> I</w:t>
+      </w:r>
+      <w:r>
+        <w:rPr>
+          <w:rFonts w:ascii="Calibri" w:hAnsi="Calibri" w:cs="Calibri"/>
+          <w:sz w:val="24"/>
+          <w:szCs w:val="24"/>
+        </w:rPr>
+        <w:t>l s'intercale</w:t>
+      </w:r>
+      <w:r>
+        <w:rPr>
+          <w:rFonts w:ascii="Calibri" w:hAnsi="Calibri" w:cs="Calibri"/>
+          <w:sz w:val="24"/>
+          <w:szCs w:val="24"/>
+        </w:rPr>
+        <w:t xml:space="preserve"> </w:t>
+      </w:r>
+      <w:r>
+        <w:rPr>
+          <w:rFonts w:ascii="Calibri" w:hAnsi="Calibri" w:cs="Calibri"/>
+          <w:sz w:val="24"/>
+          <w:szCs w:val="24"/>
+        </w:rPr>
+        <w:t>donc</w:t>
+      </w:r>
+      <w:r>
+        <w:rPr>
+          <w:rFonts w:ascii="Calibri" w:hAnsi="Calibri" w:cs="Calibri"/>
+          <w:sz w:val="24"/>
+          <w:szCs w:val="24"/>
+        </w:rPr>
+        <w:t xml:space="preserve"> entre le reverse proxy et </w:t>
+      </w:r>
+      <w:r>
+        <w:rPr>
+          <w:rFonts w:ascii="Calibri" w:hAnsi="Calibri" w:cs="Calibri"/>
+          <w:sz w:val="24"/>
+          <w:szCs w:val="24"/>
+        </w:rPr>
+        <w:t>les</w:t>
+      </w:r>
+      <w:r>
+        <w:rPr>
+          <w:rFonts w:ascii="Calibri" w:hAnsi="Calibri" w:cs="Calibri"/>
+          <w:sz w:val="24"/>
+          <w:szCs w:val="24"/>
+        </w:rPr>
+        <w:t xml:space="preserve"> services.</w:t>
+      </w:r>
     </w:p>
     <w:p>
       <w:pPr>
@@ -7901,107 +7964,15 @@
       <w:r>
         <w:rPr>
           <w:rFonts w:ascii="Calibri" w:hAnsi="Calibri" w:cs="Calibri"/>
-          <w:sz w:val="24"/>
-          <w:szCs w:val="24"/>
-        </w:rPr>
-        <w:t xml:space="preserve">Authelia est un serveur d'authentification open source qui joue deux rôles simultanément : </w:t>
-      </w:r>
-      <w:r>
-        <w:rPr>
-          <w:rFonts w:ascii="Calibri" w:hAnsi="Calibri" w:cs="Calibri"/>
-          <w:b/>
-          <w:bCs/>
-          <w:sz w:val="24"/>
-          <w:szCs w:val="24"/>
-        </w:rPr>
-        <w:t>portail SSO</w:t>
-      </w:r>
-      <w:r>
-        <w:rPr>
-          <w:rFonts w:ascii="Calibri" w:hAnsi="Calibri" w:cs="Calibri"/>
-          <w:sz w:val="24"/>
-          <w:szCs w:val="24"/>
-        </w:rPr>
-        <w:t xml:space="preserve"> (via OIDC) et </w:t>
-      </w:r>
-      <w:r>
-        <w:rPr>
-          <w:rFonts w:ascii="Calibri" w:hAnsi="Calibri" w:cs="Calibri"/>
-          <w:b/>
-          <w:bCs/>
-          <w:sz w:val="24"/>
-          <w:szCs w:val="24"/>
-        </w:rPr>
-        <w:t>proxy d'authentification</w:t>
-      </w:r>
-      <w:r>
-        <w:rPr>
-          <w:rFonts w:ascii="Calibri" w:hAnsi="Calibri" w:cs="Calibri"/>
-          <w:sz w:val="24"/>
-          <w:szCs w:val="24"/>
-        </w:rPr>
-        <w:t xml:space="preserve"> (</w:t>
-      </w:r>
-      <w:proofErr w:type="spellStart"/>
-      <w:r>
-        <w:rPr>
-          <w:rFonts w:ascii="Calibri" w:hAnsi="Calibri" w:cs="Calibri"/>
-          <w:sz w:val="24"/>
-          <w:szCs w:val="24"/>
-        </w:rPr>
-        <w:t>forward</w:t>
-      </w:r>
-      <w:proofErr w:type="spellEnd"/>
-      <w:r>
-        <w:rPr>
-          <w:rFonts w:ascii="Calibri" w:hAnsi="Calibri" w:cs="Calibri"/>
-          <w:sz w:val="24"/>
-          <w:szCs w:val="24"/>
-        </w:rPr>
-        <w:t xml:space="preserve"> </w:t>
-      </w:r>
-      <w:proofErr w:type="spellStart"/>
-      <w:r>
-        <w:rPr>
-          <w:rFonts w:ascii="Calibri" w:hAnsi="Calibri" w:cs="Calibri"/>
-          <w:sz w:val="24"/>
-          <w:szCs w:val="24"/>
-        </w:rPr>
-        <w:t>auth</w:t>
-      </w:r>
-      <w:proofErr w:type="spellEnd"/>
-      <w:r>
-        <w:rPr>
-          <w:rFonts w:ascii="Calibri" w:hAnsi="Calibri" w:cs="Calibri"/>
-          <w:sz w:val="24"/>
-          <w:szCs w:val="24"/>
-        </w:rPr>
-        <w:t xml:space="preserve"> avec Nginx). Il s'intercale entre le reverse proxy et nos services.</w:t>
-      </w:r>
-    </w:p>
-    <w:p>
-      <w:pPr>
-        <w:spacing w:after="0" w:line="276" w:lineRule="auto"/>
-        <w:jc w:val="both"/>
-        <w:rPr>
-          <w:rFonts w:ascii="Calibri" w:hAnsi="Calibri" w:cs="Calibri"/>
-          <w:sz w:val="24"/>
-          <w:szCs w:val="24"/>
-        </w:rPr>
-      </w:pPr>
-      <w:r>
-        <w:rPr>
-          <w:rFonts w:ascii="Calibri" w:hAnsi="Calibri" w:cs="Calibri"/>
           <w:noProof/>
           <w:sz w:val="24"/>
           <w:szCs w:val="24"/>
         </w:rPr>
-        <w:lastRenderedPageBreak/>
         <w:drawing>
-          <wp:inline distT="0" distB="0" distL="0" distR="0" wp14:anchorId="72702CF4" wp14:editId="54797098">
-            <wp:extent cx="5612130" cy="3463925"/>
-            <wp:effectExtent l="0" t="0" r="0" b="0"/>
-            <wp:docPr id="496099357" name="Image 1" descr="Une image contenant texte, capture d’écran, Police, nombre&#10;&#10;Description générée automatiquement"/>
+          <wp:inline distT="0" distB="0" distL="0" distR="0" wp14:anchorId="2B5BE58F" wp14:editId="54C0D3CF">
+            <wp:extent cx="6088380" cy="3208020"/>
+            <wp:effectExtent l="0" t="0" r="7620" b="0"/>
+            <wp:docPr id="1515723140" name="Image 9"/>
             <wp:cNvGraphicFramePr>
               <a:graphicFrameLocks xmlns:a="http://schemas.openxmlformats.org/drawingml/2006/main" noChangeAspect="1"/>
             </wp:cNvGraphicFramePr>
@@ -8009,23 +7980,36 @@
               <a:graphicData uri="http://schemas.openxmlformats.org/drawingml/2006/picture">
                 <pic:pic xmlns:pic="http://schemas.openxmlformats.org/drawingml/2006/picture">
                   <pic:nvPicPr>
-                    <pic:cNvPr id="496099357" name="Image 1" descr="Une image contenant texte, capture d’écran, Police, nombre&#10;&#10;Description générée automatiquement"/>
-                    <pic:cNvPicPr/>
+                    <pic:cNvPr id="0" name="Picture 21"/>
+                    <pic:cNvPicPr>
+                      <a:picLocks noChangeAspect="1" noChangeArrowheads="1"/>
+                    </pic:cNvPicPr>
                   </pic:nvPicPr>
                   <pic:blipFill>
-                    <a:blip r:embed="rId12"/>
+                    <a:blip r:embed="rId12">
+                      <a:extLst>
+                        <a:ext uri="{28A0092B-C50C-407E-A947-70E740481C1C}">
+                          <a14:useLocalDpi xmlns:a14="http://schemas.microsoft.com/office/drawing/2010/main" val="0"/>
+                        </a:ext>
+                      </a:extLst>
+                    </a:blip>
+                    <a:srcRect/>
                     <a:stretch>
                       <a:fillRect/>
                     </a:stretch>
                   </pic:blipFill>
-                  <pic:spPr>
+                  <pic:spPr bwMode="auto">
                     <a:xfrm>
                       <a:off x="0" y="0"/>
-                      <a:ext cx="5612130" cy="3463925"/>
+                      <a:ext cx="6088380" cy="3208020"/>
                     </a:xfrm>
                     <a:prstGeom prst="rect">
                       <a:avLst/>
                     </a:prstGeom>
+                    <a:noFill/>
+                    <a:ln>
+                      <a:noFill/>
+                    </a:ln>
                   </pic:spPr>
                 </pic:pic>
               </a:graphicData>
@@ -8050,26 +8034,127 @@
           <w:sz w:val="24"/>
           <w:szCs w:val="24"/>
         </w:rPr>
-        <w:t xml:space="preserve">Authelia a besoin de </w:t>
-      </w:r>
-      <w:r>
+        <w:t xml:space="preserve">L’architecture repose sur une approche </w:t>
+      </w:r>
+      <w:r>
+        <w:rPr>
+          <w:rFonts w:ascii="Calibri" w:hAnsi="Calibri" w:cs="Calibri"/>
+          <w:sz w:val="24"/>
+          <w:szCs w:val="24"/>
+        </w:rPr>
+        <w:t>conteneurisée avec Docker, permettant</w:t>
+      </w:r>
+      <w:r>
+        <w:rPr>
+          <w:rFonts w:ascii="Calibri" w:hAnsi="Calibri" w:cs="Calibri"/>
+          <w:sz w:val="24"/>
+          <w:szCs w:val="24"/>
+        </w:rPr>
+        <w:t xml:space="preserve"> de déployer l’ensemble des services sans recourir à </w:t>
+      </w:r>
+      <w:r>
+        <w:rPr>
+          <w:rFonts w:ascii="Calibri" w:hAnsi="Calibri" w:cs="Calibri"/>
+          <w:sz w:val="24"/>
+          <w:szCs w:val="24"/>
+        </w:rPr>
+        <w:t>des machines distinctes.</w:t>
+      </w:r>
+      <w:r>
+        <w:rPr>
+          <w:rFonts w:ascii="Calibri" w:hAnsi="Calibri" w:cs="Calibri"/>
+          <w:sz w:val="24"/>
+          <w:szCs w:val="24"/>
+        </w:rPr>
+        <w:t xml:space="preserve"> Tous les composants sont exécutés sous forme de conteneurs interconnectés</w:t>
+      </w:r>
+      <w:r>
+        <w:rPr>
+          <w:rFonts w:ascii="Calibri" w:hAnsi="Calibri" w:cs="Calibri"/>
+          <w:sz w:val="24"/>
+          <w:szCs w:val="24"/>
+        </w:rPr>
+        <w:t xml:space="preserve">, cela facilite </w:t>
+      </w:r>
+      <w:r>
+        <w:rPr>
+          <w:rFonts w:ascii="Calibri" w:hAnsi="Calibri" w:cs="Calibri"/>
+          <w:sz w:val="24"/>
+          <w:szCs w:val="24"/>
+        </w:rPr>
+        <w:t>la portabilité et la maintenance.</w:t>
+      </w:r>
+    </w:p>
+    <w:p>
+      <w:pPr>
+        <w:spacing w:after="0" w:line="276" w:lineRule="auto"/>
+        <w:jc w:val="both"/>
         <w:rPr>
           <w:rFonts w:ascii="Calibri" w:hAnsi="Calibri" w:cs="Calibri"/>
           <w:b/>
           <w:bCs/>
-          <w:sz w:val="24"/>
-          <w:szCs w:val="24"/>
-        </w:rPr>
-        <w:t>deux composants de stockage</w:t>
-      </w:r>
-      <w:r>
-        <w:rPr>
-          <w:rFonts w:ascii="Calibri" w:hAnsi="Calibri" w:cs="Calibri"/>
-          <w:sz w:val="24"/>
-          <w:szCs w:val="24"/>
-        </w:rPr>
-        <w:t xml:space="preserve"> : Redis pour les sessions actives (rapide, en mémoire), et soit un fichier YAML soit un annuaire LDAP pour les utilisateurs. Le bonus LDAP remplace le fichier — c'est ce qu'on va implémenter</w:t>
-      </w:r>
+          <w:i/>
+          <w:iCs/>
+          <w:sz w:val="24"/>
+          <w:szCs w:val="24"/>
+        </w:rPr>
+      </w:pPr>
+      <w:r>
+        <w:rPr>
+          <w:rFonts w:ascii="Calibri" w:hAnsi="Calibri" w:cs="Calibri"/>
+          <w:sz w:val="24"/>
+          <w:szCs w:val="24"/>
+        </w:rPr>
+        <w:t>Le système est accessible via le domaine</w:t>
+      </w:r>
+      <w:r>
+        <w:rPr>
+          <w:rFonts w:ascii="Calibri" w:hAnsi="Calibri" w:cs="Calibri"/>
+          <w:sz w:val="24"/>
+          <w:szCs w:val="24"/>
+        </w:rPr>
+        <w:t xml:space="preserve"> : </w:t>
+      </w:r>
+      <w:proofErr w:type="spellStart"/>
+      <w:r>
+        <w:rPr>
+          <w:rFonts w:ascii="Calibri" w:hAnsi="Calibri" w:cs="Calibri"/>
+          <w:b/>
+          <w:bCs/>
+          <w:i/>
+          <w:iCs/>
+          <w:sz w:val="24"/>
+          <w:szCs w:val="24"/>
+        </w:rPr>
+        <w:t>tp-</w:t>
+      </w:r>
+      <w:proofErr w:type="gramStart"/>
+      <w:r>
+        <w:rPr>
+          <w:rFonts w:ascii="Calibri" w:hAnsi="Calibri" w:cs="Calibri"/>
+          <w:b/>
+          <w:bCs/>
+          <w:i/>
+          <w:iCs/>
+          <w:sz w:val="24"/>
+          <w:szCs w:val="24"/>
+        </w:rPr>
+        <w:t>sso</w:t>
+      </w:r>
+      <w:r>
+        <w:rPr>
+          <w:rFonts w:ascii="Calibri" w:hAnsi="Calibri" w:cs="Calibri"/>
+          <w:b/>
+          <w:bCs/>
+          <w:i/>
+          <w:iCs/>
+          <w:sz w:val="24"/>
+          <w:szCs w:val="24"/>
+        </w:rPr>
+        <w:t>.local</w:t>
+      </w:r>
+      <w:proofErr w:type="spellEnd"/>
+      <w:proofErr w:type="gramEnd"/>
     </w:p>
     <w:p>
       <w:pPr>
@@ -8077,25 +8162,822 @@
         <w:jc w:val="both"/>
         <w:rPr>
           <w:rFonts w:ascii="Calibri" w:hAnsi="Calibri" w:cs="Calibri"/>
-          <w:sz w:val="24"/>
-          <w:szCs w:val="24"/>
-        </w:rPr>
-      </w:pPr>
-      <w:r>
-        <w:rPr>
-          <w:rFonts w:ascii="Segoe UI Emoji" w:hAnsi="Segoe UI Emoji" w:cs="Segoe UI Emoji"/>
-          <w:sz w:val="24"/>
-          <w:szCs w:val="24"/>
-        </w:rPr>
-        <w:t>👉</w:t>
-      </w:r>
-      <w:r>
-        <w:rPr>
-          <w:rFonts w:ascii="Calibri" w:hAnsi="Calibri" w:cs="Calibri"/>
-          <w:sz w:val="24"/>
-          <w:szCs w:val="24"/>
-        </w:rPr>
-        <w:t xml:space="preserve"> En clair : ce qui se passe quand un utilisateur accède à GitLab</w:t>
+          <w:b/>
+          <w:bCs/>
+          <w:i/>
+          <w:iCs/>
+          <w:sz w:val="24"/>
+          <w:szCs w:val="24"/>
+        </w:rPr>
+      </w:pPr>
+      <w:r>
+        <w:rPr>
+          <w:rFonts w:ascii="Calibri" w:hAnsi="Calibri" w:cs="Calibri"/>
+          <w:sz w:val="24"/>
+          <w:szCs w:val="24"/>
+        </w:rPr>
+        <w:t xml:space="preserve">Ce domaine centralise l’accès aux différents </w:t>
+      </w:r>
+      <w:r>
+        <w:rPr>
+          <w:rFonts w:ascii="Calibri" w:hAnsi="Calibri" w:cs="Calibri"/>
+          <w:sz w:val="24"/>
+          <w:szCs w:val="24"/>
+        </w:rPr>
+        <w:t>services à travers un reverse proxy (</w:t>
+      </w:r>
+      <w:r>
+        <w:rPr>
+          <w:rFonts w:ascii="Calibri" w:hAnsi="Calibri" w:cs="Calibri"/>
+          <w:b/>
+          <w:bCs/>
+          <w:i/>
+          <w:iCs/>
+          <w:sz w:val="24"/>
+          <w:szCs w:val="24"/>
+        </w:rPr>
+        <w:t>Nginx</w:t>
+      </w:r>
+      <w:r>
+        <w:rPr>
+          <w:rFonts w:ascii="Calibri" w:hAnsi="Calibri" w:cs="Calibri"/>
+          <w:sz w:val="24"/>
+          <w:szCs w:val="24"/>
+        </w:rPr>
+        <w:t>) sécurisé.</w:t>
+      </w:r>
+      <w:r>
+        <w:rPr>
+          <w:rFonts w:ascii="Calibri" w:hAnsi="Calibri" w:cs="Calibri"/>
+          <w:sz w:val="24"/>
+          <w:szCs w:val="24"/>
+        </w:rPr>
+        <w:t xml:space="preserve"> </w:t>
+      </w:r>
+      <w:r>
+        <w:rPr>
+          <w:rFonts w:ascii="Calibri" w:hAnsi="Calibri" w:cs="Calibri"/>
+          <w:sz w:val="24"/>
+          <w:szCs w:val="24"/>
+        </w:rPr>
+        <w:t>Le réseau principal docker</w:t>
+      </w:r>
+      <w:r>
+        <w:rPr>
+          <w:rFonts w:ascii="Calibri" w:hAnsi="Calibri" w:cs="Calibri"/>
+          <w:sz w:val="24"/>
+          <w:szCs w:val="24"/>
+        </w:rPr>
+        <w:t xml:space="preserve"> </w:t>
+      </w:r>
+      <w:proofErr w:type="spellStart"/>
+      <w:r>
+        <w:rPr>
+          <w:rFonts w:ascii="Calibri" w:hAnsi="Calibri" w:cs="Calibri"/>
+          <w:b/>
+          <w:bCs/>
+          <w:i/>
+          <w:iCs/>
+          <w:sz w:val="24"/>
+          <w:szCs w:val="24"/>
+        </w:rPr>
+        <w:t>sso_network</w:t>
+      </w:r>
+      <w:proofErr w:type="spellEnd"/>
+      <w:r>
+        <w:rPr>
+          <w:rFonts w:ascii="Calibri" w:hAnsi="Calibri" w:cs="Calibri"/>
+          <w:sz w:val="24"/>
+          <w:szCs w:val="24"/>
+        </w:rPr>
+        <w:t xml:space="preserve"> </w:t>
+      </w:r>
+      <w:r>
+        <w:rPr>
+          <w:rFonts w:ascii="Calibri" w:hAnsi="Calibri" w:cs="Calibri"/>
+          <w:sz w:val="24"/>
+          <w:szCs w:val="24"/>
+        </w:rPr>
+        <w:t>assure la communication</w:t>
+      </w:r>
+      <w:r>
+        <w:rPr>
+          <w:rFonts w:ascii="Calibri" w:hAnsi="Calibri" w:cs="Calibri"/>
+          <w:sz w:val="24"/>
+          <w:szCs w:val="24"/>
+        </w:rPr>
+        <w:t xml:space="preserve"> globale, il contient</w:t>
+      </w:r>
+      <w:r>
+        <w:rPr>
+          <w:rFonts w:ascii="Calibri" w:hAnsi="Calibri" w:cs="Calibri"/>
+          <w:sz w:val="24"/>
+          <w:szCs w:val="24"/>
+        </w:rPr>
+        <w:t xml:space="preserve"> le reverse proxy, </w:t>
+      </w:r>
+      <w:r>
+        <w:rPr>
+          <w:rFonts w:ascii="Calibri" w:hAnsi="Calibri" w:cs="Calibri"/>
+          <w:b/>
+          <w:bCs/>
+          <w:i/>
+          <w:iCs/>
+          <w:sz w:val="24"/>
+          <w:szCs w:val="24"/>
+        </w:rPr>
+        <w:t>Athelia</w:t>
+      </w:r>
+      <w:r>
+        <w:rPr>
+          <w:rFonts w:ascii="Calibri" w:hAnsi="Calibri" w:cs="Calibri"/>
+          <w:sz w:val="24"/>
+          <w:szCs w:val="24"/>
+        </w:rPr>
+        <w:t xml:space="preserve">, </w:t>
+      </w:r>
+      <w:r>
+        <w:rPr>
+          <w:rFonts w:ascii="Calibri" w:hAnsi="Calibri" w:cs="Calibri"/>
+          <w:b/>
+          <w:bCs/>
+          <w:i/>
+          <w:iCs/>
+          <w:sz w:val="24"/>
+          <w:szCs w:val="24"/>
+        </w:rPr>
+        <w:t>LDAP</w:t>
+      </w:r>
+      <w:r>
+        <w:rPr>
+          <w:rFonts w:ascii="Calibri" w:hAnsi="Calibri" w:cs="Calibri"/>
+          <w:b/>
+          <w:bCs/>
+          <w:i/>
+          <w:iCs/>
+          <w:sz w:val="24"/>
+          <w:szCs w:val="24"/>
+        </w:rPr>
+        <w:t>.</w:t>
+      </w:r>
+    </w:p>
+    <w:p>
+      <w:pPr>
+        <w:spacing w:after="0" w:line="276" w:lineRule="auto"/>
+        <w:jc w:val="both"/>
+        <w:rPr>
+          <w:rFonts w:ascii="Calibri" w:hAnsi="Calibri" w:cs="Calibri"/>
+          <w:sz w:val="24"/>
+          <w:szCs w:val="24"/>
+        </w:rPr>
+      </w:pPr>
+      <w:proofErr w:type="spellStart"/>
+      <w:r>
+        <w:rPr>
+          <w:rFonts w:ascii="Calibri" w:hAnsi="Calibri" w:cs="Calibri"/>
+          <w:b/>
+          <w:bCs/>
+          <w:i/>
+          <w:iCs/>
+          <w:sz w:val="24"/>
+          <w:szCs w:val="24"/>
+        </w:rPr>
+        <w:lastRenderedPageBreak/>
+        <w:t>L</w:t>
+      </w:r>
+      <w:r>
+        <w:rPr>
+          <w:rFonts w:ascii="Calibri" w:hAnsi="Calibri" w:cs="Calibri"/>
+          <w:b/>
+          <w:bCs/>
+          <w:i/>
+          <w:iCs/>
+          <w:sz w:val="24"/>
+          <w:szCs w:val="24"/>
+        </w:rPr>
+        <w:t>ibredesk</w:t>
+      </w:r>
+      <w:r>
+        <w:rPr>
+          <w:rFonts w:ascii="Calibri" w:hAnsi="Calibri" w:cs="Calibri"/>
+          <w:b/>
+          <w:bCs/>
+          <w:i/>
+          <w:iCs/>
+          <w:sz w:val="24"/>
+          <w:szCs w:val="24"/>
+        </w:rPr>
+        <w:t>_network</w:t>
+      </w:r>
+      <w:proofErr w:type="spellEnd"/>
+      <w:r>
+        <w:rPr>
+          <w:rFonts w:ascii="Calibri" w:hAnsi="Calibri" w:cs="Calibri"/>
+          <w:b/>
+          <w:bCs/>
+          <w:i/>
+          <w:iCs/>
+          <w:sz w:val="24"/>
+          <w:szCs w:val="24"/>
+        </w:rPr>
+        <w:t xml:space="preserve"> </w:t>
+      </w:r>
+      <w:r>
+        <w:rPr>
+          <w:rFonts w:ascii="Calibri" w:hAnsi="Calibri" w:cs="Calibri"/>
+          <w:sz w:val="24"/>
+          <w:szCs w:val="24"/>
+        </w:rPr>
+        <w:t>est dédié</w:t>
+      </w:r>
+      <w:r>
+        <w:rPr>
+          <w:rFonts w:ascii="Calibri" w:hAnsi="Calibri" w:cs="Calibri"/>
+          <w:sz w:val="24"/>
+          <w:szCs w:val="24"/>
+        </w:rPr>
+        <w:t xml:space="preserve"> uniquement aux composants de Libredesk</w:t>
+      </w:r>
+      <w:r>
+        <w:rPr>
+          <w:rFonts w:ascii="Calibri" w:hAnsi="Calibri" w:cs="Calibri"/>
+          <w:sz w:val="24"/>
+          <w:szCs w:val="24"/>
+        </w:rPr>
+        <w:t>.</w:t>
+      </w:r>
+    </w:p>
+    <w:tbl>
+      <w:tblPr>
+        <w:tblStyle w:val="TableauGrille2"/>
+        <w:tblW w:w="0" w:type="auto"/>
+        <w:tblLook w:val="04A0" w:firstRow="1" w:lastRow="0" w:firstColumn="1" w:lastColumn="0" w:noHBand="0" w:noVBand="1"/>
+      </w:tblPr>
+      <w:tblGrid>
+        <w:gridCol w:w="2942"/>
+        <w:gridCol w:w="2943"/>
+        <w:gridCol w:w="2943"/>
+      </w:tblGrid>
+      <w:tr>
+        <w:trPr>
+          <w:cnfStyle w:val="100000000000" w:firstRow="1" w:lastRow="0" w:firstColumn="0" w:lastColumn="0" w:oddVBand="0" w:evenVBand="0" w:oddHBand="0" w:evenHBand="0" w:firstRowFirstColumn="0" w:firstRowLastColumn="0" w:lastRowFirstColumn="0" w:lastRowLastColumn="0"/>
+        </w:trPr>
+        <w:tc>
+          <w:tcPr>
+            <w:cnfStyle w:val="001000000000" w:firstRow="0" w:lastRow="0" w:firstColumn="1" w:lastColumn="0" w:oddVBand="0" w:evenVBand="0" w:oddHBand="0" w:evenHBand="0" w:firstRowFirstColumn="0" w:firstRowLastColumn="0" w:lastRowFirstColumn="0" w:lastRowLastColumn="0"/>
+            <w:tcW w:w="8828" w:type="dxa"/>
+            <w:gridSpan w:val="3"/>
+          </w:tcPr>
+          <w:p>
+            <w:pPr>
+              <w:spacing w:before="120" w:line="276" w:lineRule="auto"/>
+              <w:jc w:val="center"/>
+              <w:rPr>
+                <w:rFonts w:ascii="Calibri" w:hAnsi="Calibri" w:cs="Calibri"/>
+                <w:sz w:val="24"/>
+                <w:szCs w:val="24"/>
+              </w:rPr>
+            </w:pPr>
+            <w:r>
+              <w:rPr>
+                <w:rFonts w:ascii="Calibri" w:hAnsi="Calibri" w:cs="Calibri"/>
+                <w:sz w:val="24"/>
+                <w:szCs w:val="24"/>
+              </w:rPr>
+              <w:t>C</w:t>
+            </w:r>
+            <w:r>
+              <w:rPr>
+                <w:rFonts w:ascii="Calibri" w:hAnsi="Calibri" w:cs="Calibri"/>
+                <w:sz w:val="24"/>
+                <w:szCs w:val="24"/>
+              </w:rPr>
+              <w:t>omposants principaux</w:t>
+            </w:r>
+          </w:p>
+        </w:tc>
+      </w:tr>
+      <w:tr>
+        <w:trPr>
+          <w:cnfStyle w:val="000000100000" w:firstRow="0" w:lastRow="0" w:firstColumn="0" w:lastColumn="0" w:oddVBand="0" w:evenVBand="0" w:oddHBand="1" w:evenHBand="0" w:firstRowFirstColumn="0" w:firstRowLastColumn="0" w:lastRowFirstColumn="0" w:lastRowLastColumn="0"/>
+        </w:trPr>
+        <w:tc>
+          <w:tcPr>
+            <w:cnfStyle w:val="001000000000" w:firstRow="0" w:lastRow="0" w:firstColumn="1" w:lastColumn="0" w:oddVBand="0" w:evenVBand="0" w:oddHBand="0" w:evenHBand="0" w:firstRowFirstColumn="0" w:firstRowLastColumn="0" w:lastRowFirstColumn="0" w:lastRowLastColumn="0"/>
+            <w:tcW w:w="2942" w:type="dxa"/>
+          </w:tcPr>
+          <w:p>
+            <w:pPr>
+              <w:spacing w:line="276" w:lineRule="auto"/>
+              <w:jc w:val="both"/>
+              <w:rPr>
+                <w:rFonts w:ascii="Calibri" w:hAnsi="Calibri" w:cs="Calibri"/>
+                <w:b w:val="0"/>
+                <w:bCs w:val="0"/>
+                <w:sz w:val="24"/>
+                <w:szCs w:val="24"/>
+              </w:rPr>
+            </w:pPr>
+            <w:r>
+              <w:rPr>
+                <w:rFonts w:ascii="Calibri" w:hAnsi="Calibri" w:cs="Calibri"/>
+                <w:b w:val="0"/>
+                <w:bCs w:val="0"/>
+                <w:sz w:val="24"/>
+                <w:szCs w:val="24"/>
+              </w:rPr>
+              <w:t>Co</w:t>
+            </w:r>
+            <w:r>
+              <w:rPr>
+                <w:rFonts w:ascii="Calibri" w:hAnsi="Calibri" w:cs="Calibri"/>
+                <w:b w:val="0"/>
+                <w:bCs w:val="0"/>
+                <w:sz w:val="24"/>
+                <w:szCs w:val="24"/>
+              </w:rPr>
+              <w:t>mposant</w:t>
+            </w:r>
+          </w:p>
+        </w:tc>
+        <w:tc>
+          <w:tcPr>
+            <w:tcW w:w="2943" w:type="dxa"/>
+          </w:tcPr>
+          <w:p>
+            <w:pPr>
+              <w:spacing w:line="276" w:lineRule="auto"/>
+              <w:jc w:val="both"/>
+              <w:cnfStyle w:val="000000100000" w:firstRow="0" w:lastRow="0" w:firstColumn="0" w:lastColumn="0" w:oddVBand="0" w:evenVBand="0" w:oddHBand="1" w:evenHBand="0" w:firstRowFirstColumn="0" w:firstRowLastColumn="0" w:lastRowFirstColumn="0" w:lastRowLastColumn="0"/>
+              <w:rPr>
+                <w:rFonts w:ascii="Calibri" w:hAnsi="Calibri" w:cs="Calibri"/>
+                <w:sz w:val="24"/>
+                <w:szCs w:val="24"/>
+              </w:rPr>
+            </w:pPr>
+            <w:r>
+              <w:rPr>
+                <w:rFonts w:ascii="Calibri" w:hAnsi="Calibri" w:cs="Calibri"/>
+                <w:sz w:val="24"/>
+                <w:szCs w:val="24"/>
+              </w:rPr>
+              <w:t>Rôle</w:t>
+            </w:r>
+          </w:p>
+        </w:tc>
+        <w:tc>
+          <w:tcPr>
+            <w:tcW w:w="2943" w:type="dxa"/>
+          </w:tcPr>
+          <w:p>
+            <w:pPr>
+              <w:spacing w:line="276" w:lineRule="auto"/>
+              <w:jc w:val="both"/>
+              <w:cnfStyle w:val="000000100000" w:firstRow="0" w:lastRow="0" w:firstColumn="0" w:lastColumn="0" w:oddVBand="0" w:evenVBand="0" w:oddHBand="1" w:evenHBand="0" w:firstRowFirstColumn="0" w:firstRowLastColumn="0" w:lastRowFirstColumn="0" w:lastRowLastColumn="0"/>
+              <w:rPr>
+                <w:rFonts w:ascii="Calibri" w:hAnsi="Calibri" w:cs="Calibri"/>
+                <w:sz w:val="24"/>
+                <w:szCs w:val="24"/>
+              </w:rPr>
+            </w:pPr>
+            <w:r>
+              <w:rPr>
+                <w:rFonts w:ascii="Calibri" w:hAnsi="Calibri" w:cs="Calibri"/>
+                <w:sz w:val="24"/>
+                <w:szCs w:val="24"/>
+              </w:rPr>
+              <w:t>Description</w:t>
+            </w:r>
+          </w:p>
+        </w:tc>
+      </w:tr>
+      <w:tr>
+        <w:tc>
+          <w:tcPr>
+            <w:cnfStyle w:val="001000000000" w:firstRow="0" w:lastRow="0" w:firstColumn="1" w:lastColumn="0" w:oddVBand="0" w:evenVBand="0" w:oddHBand="0" w:evenHBand="0" w:firstRowFirstColumn="0" w:firstRowLastColumn="0" w:lastRowFirstColumn="0" w:lastRowLastColumn="0"/>
+            <w:tcW w:w="2942" w:type="dxa"/>
+          </w:tcPr>
+          <w:p>
+            <w:pPr>
+              <w:spacing w:line="276" w:lineRule="auto"/>
+              <w:rPr>
+                <w:rFonts w:ascii="Calibri" w:hAnsi="Calibri" w:cs="Calibri"/>
+                <w:sz w:val="24"/>
+                <w:szCs w:val="24"/>
+              </w:rPr>
+            </w:pPr>
+            <w:r>
+              <w:rPr>
+                <w:rFonts w:ascii="Calibri" w:hAnsi="Calibri" w:cs="Calibri"/>
+                <w:sz w:val="24"/>
+                <w:szCs w:val="24"/>
+              </w:rPr>
+              <w:t>Nginx Proxy</w:t>
+            </w:r>
+          </w:p>
+        </w:tc>
+        <w:tc>
+          <w:tcPr>
+            <w:tcW w:w="2943" w:type="dxa"/>
+          </w:tcPr>
+          <w:p>
+            <w:pPr>
+              <w:spacing w:line="276" w:lineRule="auto"/>
+              <w:jc w:val="both"/>
+              <w:cnfStyle w:val="000000000000" w:firstRow="0" w:lastRow="0" w:firstColumn="0" w:lastColumn="0" w:oddVBand="0" w:evenVBand="0" w:oddHBand="0" w:evenHBand="0" w:firstRowFirstColumn="0" w:firstRowLastColumn="0" w:lastRowFirstColumn="0" w:lastRowLastColumn="0"/>
+              <w:rPr>
+                <w:rFonts w:ascii="Calibri" w:hAnsi="Calibri" w:cs="Calibri"/>
+                <w:sz w:val="24"/>
+                <w:szCs w:val="24"/>
+              </w:rPr>
+            </w:pPr>
+            <w:r>
+              <w:rPr>
+                <w:rFonts w:ascii="Calibri" w:hAnsi="Calibri" w:cs="Calibri"/>
+                <w:sz w:val="24"/>
+                <w:szCs w:val="24"/>
+              </w:rPr>
+              <w:t>Point d’entrée unique</w:t>
+            </w:r>
+            <w:r>
+              <w:rPr>
+                <w:rFonts w:ascii="Calibri" w:hAnsi="Calibri" w:cs="Calibri"/>
+                <w:sz w:val="24"/>
+                <w:szCs w:val="24"/>
+              </w:rPr>
+              <w:t xml:space="preserve"> et routage des services</w:t>
+            </w:r>
+          </w:p>
+        </w:tc>
+        <w:tc>
+          <w:tcPr>
+            <w:tcW w:w="2943" w:type="dxa"/>
+          </w:tcPr>
+          <w:p>
+            <w:pPr>
+              <w:spacing w:line="276" w:lineRule="auto"/>
+              <w:jc w:val="both"/>
+              <w:cnfStyle w:val="000000000000" w:firstRow="0" w:lastRow="0" w:firstColumn="0" w:lastColumn="0" w:oddVBand="0" w:evenVBand="0" w:oddHBand="0" w:evenHBand="0" w:firstRowFirstColumn="0" w:firstRowLastColumn="0" w:lastRowFirstColumn="0" w:lastRowLastColumn="0"/>
+              <w:rPr>
+                <w:rFonts w:ascii="Calibri" w:hAnsi="Calibri" w:cs="Calibri"/>
+                <w:sz w:val="24"/>
+                <w:szCs w:val="24"/>
+              </w:rPr>
+            </w:pPr>
+            <w:r>
+              <w:rPr>
+                <w:rFonts w:ascii="Calibri" w:hAnsi="Calibri" w:cs="Calibri"/>
+                <w:sz w:val="24"/>
+                <w:szCs w:val="24"/>
+              </w:rPr>
+              <w:t>Reverse Proxy</w:t>
+            </w:r>
+          </w:p>
+        </w:tc>
+      </w:tr>
+      <w:tr>
+        <w:trPr>
+          <w:cnfStyle w:val="000000100000" w:firstRow="0" w:lastRow="0" w:firstColumn="0" w:lastColumn="0" w:oddVBand="0" w:evenVBand="0" w:oddHBand="1" w:evenHBand="0" w:firstRowFirstColumn="0" w:firstRowLastColumn="0" w:lastRowFirstColumn="0" w:lastRowLastColumn="0"/>
+        </w:trPr>
+        <w:tc>
+          <w:tcPr>
+            <w:cnfStyle w:val="001000000000" w:firstRow="0" w:lastRow="0" w:firstColumn="1" w:lastColumn="0" w:oddVBand="0" w:evenVBand="0" w:oddHBand="0" w:evenHBand="0" w:firstRowFirstColumn="0" w:firstRowLastColumn="0" w:lastRowFirstColumn="0" w:lastRowLastColumn="0"/>
+            <w:tcW w:w="2942" w:type="dxa"/>
+          </w:tcPr>
+          <w:p>
+            <w:pPr>
+              <w:spacing w:line="276" w:lineRule="auto"/>
+              <w:jc w:val="both"/>
+              <w:rPr>
+                <w:rFonts w:ascii="Calibri" w:hAnsi="Calibri" w:cs="Calibri"/>
+                <w:sz w:val="24"/>
+                <w:szCs w:val="24"/>
+              </w:rPr>
+            </w:pPr>
+            <w:r>
+              <w:rPr>
+                <w:rFonts w:ascii="Calibri" w:hAnsi="Calibri" w:cs="Calibri"/>
+                <w:sz w:val="24"/>
+                <w:szCs w:val="24"/>
+              </w:rPr>
+              <w:t>Authelia</w:t>
+            </w:r>
+          </w:p>
+        </w:tc>
+        <w:tc>
+          <w:tcPr>
+            <w:tcW w:w="2943" w:type="dxa"/>
+          </w:tcPr>
+          <w:p>
+            <w:pPr>
+              <w:spacing w:line="276" w:lineRule="auto"/>
+              <w:jc w:val="both"/>
+              <w:cnfStyle w:val="000000100000" w:firstRow="0" w:lastRow="0" w:firstColumn="0" w:lastColumn="0" w:oddVBand="0" w:evenVBand="0" w:oddHBand="1" w:evenHBand="0" w:firstRowFirstColumn="0" w:firstRowLastColumn="0" w:lastRowFirstColumn="0" w:lastRowLastColumn="0"/>
+              <w:rPr>
+                <w:rFonts w:ascii="Calibri" w:hAnsi="Calibri" w:cs="Calibri"/>
+                <w:sz w:val="24"/>
+                <w:szCs w:val="24"/>
+              </w:rPr>
+            </w:pPr>
+            <w:r>
+              <w:rPr>
+                <w:rFonts w:ascii="Calibri" w:hAnsi="Calibri" w:cs="Calibri"/>
+                <w:sz w:val="24"/>
+                <w:szCs w:val="24"/>
+              </w:rPr>
+              <w:t>SS</w:t>
+            </w:r>
+            <w:r>
+              <w:rPr>
+                <w:rFonts w:ascii="Calibri" w:hAnsi="Calibri" w:cs="Calibri"/>
+                <w:sz w:val="24"/>
+                <w:szCs w:val="24"/>
+              </w:rPr>
+              <w:t>O + 2FA</w:t>
+            </w:r>
+          </w:p>
+        </w:tc>
+        <w:tc>
+          <w:tcPr>
+            <w:tcW w:w="2943" w:type="dxa"/>
+          </w:tcPr>
+          <w:p>
+            <w:pPr>
+              <w:spacing w:line="276" w:lineRule="auto"/>
+              <w:jc w:val="both"/>
+              <w:cnfStyle w:val="000000100000" w:firstRow="0" w:lastRow="0" w:firstColumn="0" w:lastColumn="0" w:oddVBand="0" w:evenVBand="0" w:oddHBand="1" w:evenHBand="0" w:firstRowFirstColumn="0" w:firstRowLastColumn="0" w:lastRowFirstColumn="0" w:lastRowLastColumn="0"/>
+              <w:rPr>
+                <w:rFonts w:ascii="Calibri" w:hAnsi="Calibri" w:cs="Calibri"/>
+                <w:sz w:val="24"/>
+                <w:szCs w:val="24"/>
+              </w:rPr>
+            </w:pPr>
+            <w:r>
+              <w:rPr>
+                <w:rFonts w:ascii="Calibri" w:hAnsi="Calibri" w:cs="Calibri"/>
+                <w:sz w:val="24"/>
+                <w:szCs w:val="24"/>
+              </w:rPr>
+              <w:t>Authentification</w:t>
+            </w:r>
+          </w:p>
+        </w:tc>
+      </w:tr>
+      <w:tr>
+        <w:tc>
+          <w:tcPr>
+            <w:cnfStyle w:val="001000000000" w:firstRow="0" w:lastRow="0" w:firstColumn="1" w:lastColumn="0" w:oddVBand="0" w:evenVBand="0" w:oddHBand="0" w:evenHBand="0" w:firstRowFirstColumn="0" w:firstRowLastColumn="0" w:lastRowFirstColumn="0" w:lastRowLastColumn="0"/>
+            <w:tcW w:w="2942" w:type="dxa"/>
+          </w:tcPr>
+          <w:p>
+            <w:pPr>
+              <w:spacing w:line="276" w:lineRule="auto"/>
+              <w:jc w:val="both"/>
+              <w:rPr>
+                <w:rFonts w:ascii="Calibri" w:hAnsi="Calibri" w:cs="Calibri"/>
+                <w:sz w:val="24"/>
+                <w:szCs w:val="24"/>
+              </w:rPr>
+            </w:pPr>
+            <w:r>
+              <w:rPr>
+                <w:rFonts w:ascii="Calibri" w:hAnsi="Calibri" w:cs="Calibri"/>
+                <w:sz w:val="24"/>
+                <w:szCs w:val="24"/>
+              </w:rPr>
+              <w:t>LLDAP</w:t>
+            </w:r>
+          </w:p>
+        </w:tc>
+        <w:tc>
+          <w:tcPr>
+            <w:tcW w:w="2943" w:type="dxa"/>
+          </w:tcPr>
+          <w:p>
+            <w:pPr>
+              <w:spacing w:line="276" w:lineRule="auto"/>
+              <w:jc w:val="both"/>
+              <w:cnfStyle w:val="000000000000" w:firstRow="0" w:lastRow="0" w:firstColumn="0" w:lastColumn="0" w:oddVBand="0" w:evenVBand="0" w:oddHBand="0" w:evenHBand="0" w:firstRowFirstColumn="0" w:firstRowLastColumn="0" w:lastRowFirstColumn="0" w:lastRowLastColumn="0"/>
+              <w:rPr>
+                <w:rFonts w:ascii="Calibri" w:hAnsi="Calibri" w:cs="Calibri"/>
+                <w:sz w:val="24"/>
+                <w:szCs w:val="24"/>
+              </w:rPr>
+            </w:pPr>
+            <w:r>
+              <w:rPr>
+                <w:rFonts w:ascii="Calibri" w:hAnsi="Calibri" w:cs="Calibri"/>
+                <w:sz w:val="24"/>
+                <w:szCs w:val="24"/>
+              </w:rPr>
+              <w:t>Gestion des utilisateurs</w:t>
+            </w:r>
+          </w:p>
+        </w:tc>
+        <w:tc>
+          <w:tcPr>
+            <w:tcW w:w="2943" w:type="dxa"/>
+          </w:tcPr>
+          <w:p>
+            <w:pPr>
+              <w:spacing w:line="276" w:lineRule="auto"/>
+              <w:jc w:val="both"/>
+              <w:cnfStyle w:val="000000000000" w:firstRow="0" w:lastRow="0" w:firstColumn="0" w:lastColumn="0" w:oddVBand="0" w:evenVBand="0" w:oddHBand="0" w:evenHBand="0" w:firstRowFirstColumn="0" w:firstRowLastColumn="0" w:lastRowFirstColumn="0" w:lastRowLastColumn="0"/>
+              <w:rPr>
+                <w:rFonts w:ascii="Calibri" w:hAnsi="Calibri" w:cs="Calibri"/>
+                <w:sz w:val="24"/>
+                <w:szCs w:val="24"/>
+              </w:rPr>
+            </w:pPr>
+            <w:r>
+              <w:rPr>
+                <w:rFonts w:ascii="Calibri" w:hAnsi="Calibri" w:cs="Calibri"/>
+                <w:sz w:val="24"/>
+                <w:szCs w:val="24"/>
+              </w:rPr>
+              <w:t>Annuaire</w:t>
+            </w:r>
+          </w:p>
+        </w:tc>
+      </w:tr>
+      <w:tr>
+        <w:trPr>
+          <w:cnfStyle w:val="000000100000" w:firstRow="0" w:lastRow="0" w:firstColumn="0" w:lastColumn="0" w:oddVBand="0" w:evenVBand="0" w:oddHBand="1" w:evenHBand="0" w:firstRowFirstColumn="0" w:firstRowLastColumn="0" w:lastRowFirstColumn="0" w:lastRowLastColumn="0"/>
+        </w:trPr>
+        <w:tc>
+          <w:tcPr>
+            <w:cnfStyle w:val="001000000000" w:firstRow="0" w:lastRow="0" w:firstColumn="1" w:lastColumn="0" w:oddVBand="0" w:evenVBand="0" w:oddHBand="0" w:evenHBand="0" w:firstRowFirstColumn="0" w:firstRowLastColumn="0" w:lastRowFirstColumn="0" w:lastRowLastColumn="0"/>
+            <w:tcW w:w="2942" w:type="dxa"/>
+          </w:tcPr>
+          <w:p>
+            <w:pPr>
+              <w:spacing w:line="276" w:lineRule="auto"/>
+              <w:jc w:val="both"/>
+              <w:rPr>
+                <w:rFonts w:ascii="Calibri" w:hAnsi="Calibri" w:cs="Calibri"/>
+                <w:sz w:val="24"/>
+                <w:szCs w:val="24"/>
+              </w:rPr>
+            </w:pPr>
+            <w:r>
+              <w:rPr>
+                <w:rFonts w:ascii="Calibri" w:hAnsi="Calibri" w:cs="Calibri"/>
+                <w:sz w:val="24"/>
+                <w:szCs w:val="24"/>
+              </w:rPr>
+              <w:t>Services</w:t>
+            </w:r>
+          </w:p>
+        </w:tc>
+        <w:tc>
+          <w:tcPr>
+            <w:tcW w:w="2943" w:type="dxa"/>
+          </w:tcPr>
+          <w:p>
+            <w:pPr>
+              <w:spacing w:line="276" w:lineRule="auto"/>
+              <w:jc w:val="both"/>
+              <w:cnfStyle w:val="000000100000" w:firstRow="0" w:lastRow="0" w:firstColumn="0" w:lastColumn="0" w:oddVBand="0" w:evenVBand="0" w:oddHBand="1" w:evenHBand="0" w:firstRowFirstColumn="0" w:firstRowLastColumn="0" w:lastRowFirstColumn="0" w:lastRowLastColumn="0"/>
+              <w:rPr>
+                <w:rFonts w:ascii="Calibri" w:hAnsi="Calibri" w:cs="Calibri"/>
+                <w:sz w:val="24"/>
+                <w:szCs w:val="24"/>
+              </w:rPr>
+            </w:pPr>
+            <w:r>
+              <w:rPr>
+                <w:rFonts w:ascii="Calibri" w:hAnsi="Calibri" w:cs="Calibri"/>
+                <w:sz w:val="24"/>
+                <w:szCs w:val="24"/>
+              </w:rPr>
+              <w:t>Services applicatifs</w:t>
+            </w:r>
+          </w:p>
+        </w:tc>
+        <w:tc>
+          <w:tcPr>
+            <w:tcW w:w="2943" w:type="dxa"/>
+          </w:tcPr>
+          <w:p>
+            <w:pPr>
+              <w:spacing w:line="276" w:lineRule="auto"/>
+              <w:jc w:val="both"/>
+              <w:cnfStyle w:val="000000100000" w:firstRow="0" w:lastRow="0" w:firstColumn="0" w:lastColumn="0" w:oddVBand="0" w:evenVBand="0" w:oddHBand="1" w:evenHBand="0" w:firstRowFirstColumn="0" w:firstRowLastColumn="0" w:lastRowFirstColumn="0" w:lastRowLastColumn="0"/>
+              <w:rPr>
+                <w:rFonts w:ascii="Calibri" w:hAnsi="Calibri" w:cs="Calibri"/>
+                <w:sz w:val="24"/>
+                <w:szCs w:val="24"/>
+              </w:rPr>
+            </w:pPr>
+            <w:r>
+              <w:rPr>
+                <w:rFonts w:ascii="Calibri" w:hAnsi="Calibri" w:cs="Calibri"/>
+                <w:sz w:val="24"/>
+                <w:szCs w:val="24"/>
+              </w:rPr>
+              <w:t>Services consommés</w:t>
+            </w:r>
+          </w:p>
+        </w:tc>
+      </w:tr>
+    </w:tbl>
+    <w:p>
+      <w:pPr>
+        <w:spacing w:before="120" w:after="0" w:line="276" w:lineRule="auto"/>
+        <w:jc w:val="both"/>
+        <w:rPr>
+          <w:rFonts w:ascii="Calibri" w:hAnsi="Calibri" w:cs="Calibri"/>
+          <w:sz w:val="24"/>
+          <w:szCs w:val="24"/>
+        </w:rPr>
+      </w:pPr>
+      <w:r>
+        <w:rPr>
+          <w:rFonts w:ascii="Calibri" w:hAnsi="Calibri" w:cs="Calibri"/>
+          <w:sz w:val="24"/>
+          <w:szCs w:val="24"/>
+        </w:rPr>
+        <w:t xml:space="preserve">En clair : ce qui se passe quand un utilisateur </w:t>
+      </w:r>
+      <w:r>
+        <w:rPr>
+          <w:rFonts w:ascii="Calibri" w:hAnsi="Calibri" w:cs="Calibri"/>
+          <w:sz w:val="24"/>
+          <w:szCs w:val="24"/>
+        </w:rPr>
+        <w:t xml:space="preserve">veut </w:t>
+      </w:r>
+      <w:r>
+        <w:rPr>
+          <w:rFonts w:ascii="Calibri" w:hAnsi="Calibri" w:cs="Calibri"/>
+          <w:sz w:val="24"/>
+          <w:szCs w:val="24"/>
+        </w:rPr>
+        <w:t>ac</w:t>
+      </w:r>
+      <w:r>
+        <w:rPr>
+          <w:rFonts w:ascii="Calibri" w:hAnsi="Calibri" w:cs="Calibri"/>
+          <w:sz w:val="24"/>
+          <w:szCs w:val="24"/>
+        </w:rPr>
+        <w:t>céder</w:t>
+      </w:r>
+      <w:r>
+        <w:rPr>
+          <w:rFonts w:ascii="Calibri" w:hAnsi="Calibri" w:cs="Calibri"/>
+          <w:sz w:val="24"/>
+          <w:szCs w:val="24"/>
+        </w:rPr>
+        <w:t xml:space="preserve"> à </w:t>
+      </w:r>
+      <w:r>
+        <w:rPr>
+          <w:rFonts w:ascii="Calibri" w:hAnsi="Calibri" w:cs="Calibri"/>
+          <w:sz w:val="24"/>
+          <w:szCs w:val="24"/>
+        </w:rPr>
+        <w:t>un service</w:t>
+      </w:r>
+      <w:r>
+        <w:rPr>
+          <w:rFonts w:ascii="Calibri" w:hAnsi="Calibri" w:cs="Calibri"/>
+          <w:sz w:val="24"/>
+          <w:szCs w:val="24"/>
+        </w:rPr>
+        <w:t xml:space="preserve"> </w:t>
+      </w:r>
+      <w:r>
+        <w:rPr>
+          <w:rFonts w:ascii="Calibri" w:hAnsi="Calibri" w:cs="Calibri"/>
+          <w:sz w:val="24"/>
+          <w:szCs w:val="24"/>
+        </w:rPr>
+        <w:t>(exemple Git</w:t>
+      </w:r>
+      <w:r>
+        <w:rPr>
+          <w:rFonts w:ascii="Calibri" w:hAnsi="Calibri" w:cs="Calibri"/>
+          <w:sz w:val="24"/>
+          <w:szCs w:val="24"/>
+        </w:rPr>
+        <w:t>L</w:t>
+      </w:r>
+      <w:r>
+        <w:rPr>
+          <w:rFonts w:ascii="Calibri" w:hAnsi="Calibri" w:cs="Calibri"/>
+          <w:sz w:val="24"/>
+          <w:szCs w:val="24"/>
+        </w:rPr>
+        <w:t>ab</w:t>
+      </w:r>
+      <w:r>
+        <w:rPr>
+          <w:rFonts w:ascii="Calibri" w:hAnsi="Calibri" w:cs="Calibri"/>
+          <w:sz w:val="24"/>
+          <w:szCs w:val="24"/>
+        </w:rPr>
+        <w:t>)</w:t>
       </w:r>
     </w:p>
     <w:p>
@@ -8115,16 +8997,42 @@
       <w:r>
         <w:rPr>
           <w:rFonts w:ascii="Calibri" w:hAnsi="Calibri" w:cs="Calibri"/>
-        </w:rPr>
-        <w:t xml:space="preserve">Il va sur : </w:t>
-      </w:r>
-      <w:r>
-        <w:rPr>
-          <w:rFonts w:ascii="Calibri" w:hAnsi="Calibri" w:cs="Calibri"/>
-          <w:sz w:val="24"/>
-          <w:szCs w:val="24"/>
-        </w:rPr>
-        <w:t>https://gitlab.mon-domaine.com</w:t>
+          <w:sz w:val="24"/>
+          <w:szCs w:val="24"/>
+        </w:rPr>
+        <w:t>Il va sur : https://gitlab.</w:t>
+      </w:r>
+      <w:r>
+        <w:rPr>
+          <w:rFonts w:ascii="Calibri" w:hAnsi="Calibri" w:cs="Calibri"/>
+          <w:sz w:val="24"/>
+          <w:szCs w:val="24"/>
+        </w:rPr>
+        <w:t>tp-</w:t>
+      </w:r>
+      <w:r>
+        <w:rPr>
+          <w:rFonts w:ascii="Calibri" w:hAnsi="Calibri" w:cs="Calibri"/>
+          <w:sz w:val="24"/>
+          <w:szCs w:val="24"/>
+        </w:rPr>
+        <w:t>sso</w:t>
+      </w:r>
+      <w:r>
+        <w:rPr>
+          <w:rFonts w:ascii="Calibri" w:hAnsi="Calibri" w:cs="Calibri"/>
+          <w:sz w:val="24"/>
+          <w:szCs w:val="24"/>
+        </w:rPr>
+        <w:t>.</w:t>
+      </w:r>
+      <w:r>
+        <w:rPr>
+          <w:rFonts w:ascii="Calibri" w:hAnsi="Calibri" w:cs="Calibri"/>
+          <w:sz w:val="24"/>
+          <w:szCs w:val="24"/>
+        </w:rPr>
+        <w:t>local</w:t>
       </w:r>
     </w:p>
     <w:p>
@@ -8167,7 +9075,6 @@
           <w:numId w:val="5"/>
         </w:numPr>
         <w:spacing w:after="0" w:line="276" w:lineRule="auto"/>
-        <w:jc w:val="both"/>
         <w:rPr>
           <w:rFonts w:ascii="Calibri" w:hAnsi="Calibri" w:cs="Calibri"/>
           <w:sz w:val="24"/>
@@ -8231,8 +9138,7 @@
           <w:ilvl w:val="0"/>
           <w:numId w:val="5"/>
         </w:numPr>
-        <w:spacing w:after="120" w:line="276" w:lineRule="auto"/>
-        <w:jc w:val="both"/>
+        <w:spacing w:after="0" w:line="276" w:lineRule="auto"/>
         <w:rPr>
           <w:rFonts w:ascii="Calibri" w:hAnsi="Calibri" w:cs="Calibri"/>
           <w:sz w:val="24"/>
@@ -8246,6 +9152,14 @@
           <w:szCs w:val="24"/>
         </w:rPr>
         <w:t>Si OUI → accès au service</w:t>
+      </w:r>
+      <w:r>
+        <w:rPr>
+          <w:rFonts w:ascii="Calibri" w:hAnsi="Calibri" w:cs="Calibri"/>
+          <w:sz w:val="24"/>
+          <w:szCs w:val="24"/>
+        </w:rPr>
+        <w:t xml:space="preserve"> demandé</w:t>
       </w:r>
       <w:r>
         <w:rPr>
@@ -8259,478 +9173,6 @@
     </w:p>
     <w:p>
       <w:pPr>
-        <w:spacing w:after="0" w:line="276" w:lineRule="auto"/>
-        <w:jc w:val="both"/>
-        <w:rPr>
-          <w:rFonts w:ascii="Calibri" w:hAnsi="Calibri" w:cs="Calibri"/>
-          <w:sz w:val="24"/>
-          <w:szCs w:val="24"/>
-        </w:rPr>
-      </w:pPr>
-      <w:r>
-        <w:rPr>
-          <w:rFonts w:ascii="Calibri" w:hAnsi="Calibri" w:cs="Calibri"/>
-          <w:sz w:val="24"/>
-          <w:szCs w:val="24"/>
-          <w:u w:val="single"/>
-        </w:rPr>
-        <w:t>Nginx :</w:t>
-      </w:r>
-      <w:r>
-        <w:rPr>
-          <w:rFonts w:ascii="Calibri" w:hAnsi="Calibri" w:cs="Calibri"/>
-          <w:sz w:val="24"/>
-          <w:szCs w:val="24"/>
-        </w:rPr>
-        <w:t xml:space="preserve"> </w:t>
-      </w:r>
-      <w:r>
-        <w:rPr>
-          <w:rFonts w:ascii="Calibri" w:hAnsi="Calibri" w:cs="Calibri"/>
-          <w:b/>
-          <w:bCs/>
-          <w:sz w:val="24"/>
-          <w:szCs w:val="24"/>
-        </w:rPr>
-        <w:t>le point d’entrée</w:t>
-      </w:r>
-    </w:p>
-    <w:p>
-      <w:pPr>
-        <w:pStyle w:val="Paragraphedeliste"/>
-        <w:numPr>
-          <w:ilvl w:val="0"/>
-          <w:numId w:val="3"/>
-        </w:numPr>
-        <w:spacing w:after="0" w:line="240" w:lineRule="auto"/>
-        <w:jc w:val="both"/>
-        <w:rPr>
-          <w:rFonts w:ascii="Calibri" w:hAnsi="Calibri" w:cs="Calibri"/>
-          <w:sz w:val="24"/>
-          <w:szCs w:val="24"/>
-        </w:rPr>
-      </w:pPr>
-      <w:r>
-        <w:rPr>
-          <w:rFonts w:ascii="Calibri" w:hAnsi="Calibri" w:cs="Calibri"/>
-          <w:sz w:val="24"/>
-          <w:szCs w:val="24"/>
-        </w:rPr>
-        <w:t>Rediriger les requêtes</w:t>
-      </w:r>
-    </w:p>
-    <w:p>
-      <w:pPr>
-        <w:pStyle w:val="Paragraphedeliste"/>
-        <w:numPr>
-          <w:ilvl w:val="0"/>
-          <w:numId w:val="3"/>
-        </w:numPr>
-        <w:spacing w:after="0" w:line="240" w:lineRule="auto"/>
-        <w:jc w:val="both"/>
-        <w:rPr>
-          <w:rFonts w:ascii="Calibri" w:hAnsi="Calibri" w:cs="Calibri"/>
-          <w:sz w:val="24"/>
-          <w:szCs w:val="24"/>
-        </w:rPr>
-      </w:pPr>
-      <w:r>
-        <w:rPr>
-          <w:rFonts w:ascii="Calibri" w:hAnsi="Calibri" w:cs="Calibri"/>
-          <w:sz w:val="24"/>
-          <w:szCs w:val="24"/>
-        </w:rPr>
-        <w:t>Appliquer HTTPS</w:t>
-      </w:r>
-    </w:p>
-    <w:p>
-      <w:pPr>
-        <w:pStyle w:val="Paragraphedeliste"/>
-        <w:numPr>
-          <w:ilvl w:val="0"/>
-          <w:numId w:val="3"/>
-        </w:numPr>
-        <w:spacing w:after="0" w:line="240" w:lineRule="auto"/>
-        <w:jc w:val="both"/>
-        <w:rPr>
-          <w:rFonts w:ascii="Calibri" w:hAnsi="Calibri" w:cs="Calibri"/>
-          <w:sz w:val="24"/>
-          <w:szCs w:val="24"/>
-        </w:rPr>
-      </w:pPr>
-      <w:r>
-        <w:rPr>
-          <w:rFonts w:ascii="Calibri" w:hAnsi="Calibri" w:cs="Calibri"/>
-          <w:sz w:val="24"/>
-          <w:szCs w:val="24"/>
-        </w:rPr>
-        <w:t>Communiquer avec Authelia</w:t>
-      </w:r>
-    </w:p>
-    <w:p>
-      <w:pPr>
-        <w:spacing w:after="0" w:line="240" w:lineRule="auto"/>
-        <w:jc w:val="both"/>
-        <w:rPr>
-          <w:rFonts w:ascii="Calibri" w:hAnsi="Calibri" w:cs="Calibri"/>
-          <w:sz w:val="24"/>
-          <w:szCs w:val="24"/>
-        </w:rPr>
-      </w:pPr>
-      <w:r>
-        <w:rPr>
-          <w:rFonts w:ascii="Calibri" w:hAnsi="Calibri" w:cs="Calibri"/>
-          <w:sz w:val="24"/>
-          <w:szCs w:val="24"/>
-          <w:u w:val="single"/>
-        </w:rPr>
-        <w:t>Authelia :</w:t>
-      </w:r>
-      <w:r>
-        <w:rPr>
-          <w:rFonts w:ascii="Calibri" w:hAnsi="Calibri" w:cs="Calibri"/>
-          <w:sz w:val="24"/>
-          <w:szCs w:val="24"/>
-        </w:rPr>
-        <w:t xml:space="preserve"> </w:t>
-      </w:r>
-      <w:r>
-        <w:rPr>
-          <w:rFonts w:ascii="Calibri" w:hAnsi="Calibri" w:cs="Calibri"/>
-          <w:b/>
-          <w:bCs/>
-          <w:sz w:val="24"/>
-          <w:szCs w:val="24"/>
-        </w:rPr>
-        <w:t>le cœur du système</w:t>
-      </w:r>
-      <w:r>
-        <w:rPr>
-          <w:rFonts w:ascii="Calibri" w:hAnsi="Calibri" w:cs="Calibri"/>
-          <w:sz w:val="24"/>
-          <w:szCs w:val="24"/>
-        </w:rPr>
-        <w:t xml:space="preserve"> (cerveau de sécurité)</w:t>
-      </w:r>
-    </w:p>
-    <w:p>
-      <w:pPr>
-        <w:pStyle w:val="Paragraphedeliste"/>
-        <w:numPr>
-          <w:ilvl w:val="0"/>
-          <w:numId w:val="4"/>
-        </w:numPr>
-        <w:spacing w:after="0" w:line="240" w:lineRule="auto"/>
-        <w:jc w:val="both"/>
-        <w:rPr>
-          <w:rFonts w:ascii="Calibri" w:hAnsi="Calibri" w:cs="Calibri"/>
-          <w:sz w:val="24"/>
-          <w:szCs w:val="24"/>
-        </w:rPr>
-      </w:pPr>
-      <w:r>
-        <w:rPr>
-          <w:rFonts w:ascii="Calibri" w:hAnsi="Calibri" w:cs="Calibri"/>
-          <w:sz w:val="24"/>
-          <w:szCs w:val="24"/>
-        </w:rPr>
-        <w:t>Login utilisateur</w:t>
-      </w:r>
-    </w:p>
-    <w:p>
-      <w:pPr>
-        <w:pStyle w:val="Paragraphedeliste"/>
-        <w:numPr>
-          <w:ilvl w:val="0"/>
-          <w:numId w:val="4"/>
-        </w:numPr>
-        <w:spacing w:after="0" w:line="240" w:lineRule="auto"/>
-        <w:jc w:val="both"/>
-        <w:rPr>
-          <w:rFonts w:ascii="Calibri" w:hAnsi="Calibri" w:cs="Calibri"/>
-          <w:sz w:val="24"/>
-          <w:szCs w:val="24"/>
-        </w:rPr>
-      </w:pPr>
-      <w:r>
-        <w:rPr>
-          <w:rFonts w:ascii="Calibri" w:hAnsi="Calibri" w:cs="Calibri"/>
-          <w:sz w:val="24"/>
-          <w:szCs w:val="24"/>
-        </w:rPr>
-        <w:t xml:space="preserve">2FA (Google </w:t>
-      </w:r>
-      <w:proofErr w:type="spellStart"/>
-      <w:r>
-        <w:rPr>
-          <w:rFonts w:ascii="Calibri" w:hAnsi="Calibri" w:cs="Calibri"/>
-          <w:sz w:val="24"/>
-          <w:szCs w:val="24"/>
-        </w:rPr>
-        <w:t>Authenticator</w:t>
-      </w:r>
-      <w:proofErr w:type="spellEnd"/>
-      <w:r>
-        <w:rPr>
-          <w:rFonts w:ascii="Calibri" w:hAnsi="Calibri" w:cs="Calibri"/>
-          <w:sz w:val="24"/>
-          <w:szCs w:val="24"/>
-        </w:rPr>
-        <w:t>, etc.)</w:t>
-      </w:r>
-    </w:p>
-    <w:p>
-      <w:pPr>
-        <w:pStyle w:val="Paragraphedeliste"/>
-        <w:numPr>
-          <w:ilvl w:val="0"/>
-          <w:numId w:val="4"/>
-        </w:numPr>
-        <w:spacing w:after="0" w:line="240" w:lineRule="auto"/>
-        <w:jc w:val="both"/>
-        <w:rPr>
-          <w:rFonts w:ascii="Calibri" w:hAnsi="Calibri" w:cs="Calibri"/>
-          <w:sz w:val="24"/>
-          <w:szCs w:val="24"/>
-        </w:rPr>
-      </w:pPr>
-      <w:r>
-        <w:rPr>
-          <w:rFonts w:ascii="Calibri" w:hAnsi="Calibri" w:cs="Calibri"/>
-          <w:sz w:val="24"/>
-          <w:szCs w:val="24"/>
-        </w:rPr>
-        <w:t>Gestion des session (Redis)</w:t>
-      </w:r>
-    </w:p>
-    <w:p>
-      <w:pPr>
-        <w:pStyle w:val="Paragraphedeliste"/>
-        <w:numPr>
-          <w:ilvl w:val="0"/>
-          <w:numId w:val="4"/>
-        </w:numPr>
-        <w:spacing w:after="0" w:line="240" w:lineRule="auto"/>
-        <w:jc w:val="both"/>
-        <w:rPr>
-          <w:rFonts w:ascii="Calibri" w:hAnsi="Calibri" w:cs="Calibri"/>
-          <w:sz w:val="24"/>
-          <w:szCs w:val="24"/>
-        </w:rPr>
-      </w:pPr>
-      <w:r>
-        <w:rPr>
-          <w:rFonts w:ascii="Calibri" w:hAnsi="Calibri" w:cs="Calibri"/>
-          <w:sz w:val="24"/>
-          <w:szCs w:val="24"/>
-        </w:rPr>
-        <w:t>Fournisseur OIDC</w:t>
-      </w:r>
-    </w:p>
-    <w:p>
-      <w:pPr>
-        <w:spacing w:after="0" w:line="240" w:lineRule="auto"/>
-        <w:jc w:val="both"/>
-        <w:rPr>
-          <w:rFonts w:ascii="Calibri" w:hAnsi="Calibri" w:cs="Calibri"/>
-          <w:sz w:val="24"/>
-          <w:szCs w:val="24"/>
-        </w:rPr>
-      </w:pPr>
-      <w:r>
-        <w:rPr>
-          <w:rFonts w:ascii="Calibri" w:hAnsi="Calibri" w:cs="Calibri"/>
-          <w:sz w:val="24"/>
-          <w:szCs w:val="24"/>
-          <w:u w:val="single"/>
-        </w:rPr>
-        <w:t>Services</w:t>
-      </w:r>
-      <w:r>
-        <w:rPr>
-          <w:rFonts w:ascii="Calibri" w:hAnsi="Calibri" w:cs="Calibri"/>
-          <w:sz w:val="24"/>
-          <w:szCs w:val="24"/>
-        </w:rPr>
-        <w:t xml:space="preserve"> : </w:t>
-      </w:r>
-      <w:r>
-        <w:rPr>
-          <w:rFonts w:ascii="Calibri" w:hAnsi="Calibri" w:cs="Calibri"/>
-          <w:b/>
-          <w:bCs/>
-          <w:sz w:val="24"/>
-          <w:szCs w:val="24"/>
-        </w:rPr>
-        <w:t xml:space="preserve">Tous protégés </w:t>
-      </w:r>
-      <w:r>
-        <w:rPr>
-          <w:rFonts w:ascii="Calibri" w:hAnsi="Calibri" w:cs="Calibri"/>
-          <w:sz w:val="24"/>
-          <w:szCs w:val="24"/>
-        </w:rPr>
-        <w:t>(Aucun accès direct sans passer par Authelia)</w:t>
-      </w:r>
-    </w:p>
-    <w:p>
-      <w:pPr>
-        <w:pStyle w:val="Paragraphedeliste"/>
-        <w:numPr>
-          <w:ilvl w:val="0"/>
-          <w:numId w:val="6"/>
-        </w:numPr>
-        <w:spacing w:after="0" w:line="240" w:lineRule="auto"/>
-        <w:jc w:val="both"/>
-        <w:rPr>
-          <w:rFonts w:ascii="Calibri" w:hAnsi="Calibri" w:cs="Calibri"/>
-          <w:sz w:val="24"/>
-          <w:szCs w:val="24"/>
-        </w:rPr>
-      </w:pPr>
-      <w:r>
-        <w:rPr>
-          <w:rFonts w:ascii="Calibri" w:hAnsi="Calibri" w:cs="Calibri"/>
-          <w:sz w:val="24"/>
-          <w:szCs w:val="24"/>
-        </w:rPr>
-        <w:t>GitLab (code)</w:t>
-      </w:r>
-    </w:p>
-    <w:p>
-      <w:pPr>
-        <w:pStyle w:val="Paragraphedeliste"/>
-        <w:numPr>
-          <w:ilvl w:val="0"/>
-          <w:numId w:val="6"/>
-        </w:numPr>
-        <w:spacing w:after="0" w:line="240" w:lineRule="auto"/>
-        <w:jc w:val="both"/>
-        <w:rPr>
-          <w:rFonts w:ascii="Calibri" w:hAnsi="Calibri" w:cs="Calibri"/>
-          <w:sz w:val="24"/>
-          <w:szCs w:val="24"/>
-        </w:rPr>
-      </w:pPr>
-      <w:r>
-        <w:rPr>
-          <w:rFonts w:ascii="Calibri" w:hAnsi="Calibri" w:cs="Calibri"/>
-          <w:sz w:val="24"/>
-          <w:szCs w:val="24"/>
-        </w:rPr>
-        <w:t>Jenkins (CI/CD)</w:t>
-      </w:r>
-    </w:p>
-    <w:p>
-      <w:pPr>
-        <w:pStyle w:val="Paragraphedeliste"/>
-        <w:numPr>
-          <w:ilvl w:val="0"/>
-          <w:numId w:val="6"/>
-        </w:numPr>
-        <w:spacing w:after="0" w:line="240" w:lineRule="auto"/>
-        <w:jc w:val="both"/>
-        <w:rPr>
-          <w:rFonts w:ascii="Calibri" w:hAnsi="Calibri" w:cs="Calibri"/>
-          <w:sz w:val="24"/>
-          <w:szCs w:val="24"/>
-        </w:rPr>
-      </w:pPr>
-      <w:r>
-        <w:rPr>
-          <w:rFonts w:ascii="Calibri" w:hAnsi="Calibri" w:cs="Calibri"/>
-          <w:sz w:val="24"/>
-          <w:szCs w:val="24"/>
-        </w:rPr>
-        <w:t>Nextcloud (fichiers)</w:t>
-      </w:r>
-    </w:p>
-    <w:p>
-      <w:pPr>
-        <w:pStyle w:val="Paragraphedeliste"/>
-        <w:numPr>
-          <w:ilvl w:val="0"/>
-          <w:numId w:val="6"/>
-        </w:numPr>
-        <w:spacing w:after="0" w:line="240" w:lineRule="auto"/>
-        <w:jc w:val="both"/>
-        <w:rPr>
-          <w:rFonts w:ascii="Calibri" w:hAnsi="Calibri" w:cs="Calibri"/>
-          <w:sz w:val="24"/>
-          <w:szCs w:val="24"/>
-        </w:rPr>
-      </w:pPr>
-      <w:r>
-        <w:rPr>
-          <w:rFonts w:ascii="Calibri" w:hAnsi="Calibri" w:cs="Calibri"/>
-          <w:sz w:val="24"/>
-          <w:szCs w:val="24"/>
-        </w:rPr>
-        <w:lastRenderedPageBreak/>
-        <w:t>Jira (tickets)</w:t>
-      </w:r>
-    </w:p>
-    <w:p>
-      <w:pPr>
-        <w:pStyle w:val="Paragraphedeliste"/>
-        <w:numPr>
-          <w:ilvl w:val="0"/>
-          <w:numId w:val="6"/>
-        </w:numPr>
-        <w:spacing w:after="0" w:line="240" w:lineRule="auto"/>
-        <w:jc w:val="both"/>
-        <w:rPr>
-          <w:rFonts w:ascii="Calibri" w:hAnsi="Calibri" w:cs="Calibri"/>
-          <w:sz w:val="24"/>
-          <w:szCs w:val="24"/>
-        </w:rPr>
-      </w:pPr>
-      <w:r>
-        <w:rPr>
-          <w:rFonts w:ascii="Calibri" w:hAnsi="Calibri" w:cs="Calibri"/>
-          <w:sz w:val="24"/>
-          <w:szCs w:val="24"/>
-        </w:rPr>
-        <w:t>Confluence (documentation)</w:t>
-      </w:r>
-    </w:p>
-    <w:p>
-      <w:pPr>
-        <w:pStyle w:val="Paragraphedeliste"/>
-        <w:numPr>
-          <w:ilvl w:val="0"/>
-          <w:numId w:val="6"/>
-        </w:numPr>
-        <w:spacing w:after="0" w:line="240" w:lineRule="auto"/>
-        <w:jc w:val="both"/>
-        <w:rPr>
-          <w:rFonts w:ascii="Calibri" w:hAnsi="Calibri" w:cs="Calibri"/>
-          <w:sz w:val="24"/>
-          <w:szCs w:val="24"/>
-        </w:rPr>
-      </w:pPr>
-      <w:r>
-        <w:rPr>
-          <w:rFonts w:ascii="Calibri" w:hAnsi="Calibri" w:cs="Calibri"/>
-          <w:sz w:val="24"/>
-          <w:szCs w:val="24"/>
-        </w:rPr>
-        <w:t>Rocket.Chat (communication)</w:t>
-      </w:r>
-    </w:p>
-    <w:p>
-      <w:pPr>
-        <w:spacing w:after="0" w:line="240" w:lineRule="auto"/>
-        <w:jc w:val="both"/>
-        <w:rPr>
-          <w:rFonts w:ascii="Calibri" w:hAnsi="Calibri" w:cs="Calibri"/>
-          <w:sz w:val="24"/>
-          <w:szCs w:val="24"/>
-        </w:rPr>
-      </w:pPr>
-    </w:p>
-    <w:p>
-      <w:pPr>
         <w:pStyle w:val="Titre2"/>
         <w:jc w:val="both"/>
         <w:rPr>
@@ -8741,7 +9183,6 @@
       <w:r>
         <w:rPr>
           <w:rFonts w:ascii="Calibri" w:hAnsi="Calibri" w:cs="Calibri"/>
-          <w:lang w:val="en-US"/>
         </w:rPr>
         <w:t>2.</w:t>
       </w:r>
@@ -8754,7 +9195,6 @@
       <w:r>
         <w:rPr>
           <w:rFonts w:ascii="Calibri" w:hAnsi="Calibri" w:cs="Calibri"/>
-          <w:lang w:val="en-US"/>
         </w:rPr>
         <w:t xml:space="preserve"> – </w:t>
       </w:r>
@@ -10472,7 +10912,161 @@
     </w:p>
     <w:p>
       <w:pPr>
-        <w:jc w:val="both"/>
+        <w:pStyle w:val="Paragraphedeliste"/>
+        <w:numPr>
+          <w:ilvl w:val="0"/>
+          <w:numId w:val="28"/>
+        </w:numPr>
+        <w:spacing w:after="120"/>
+        <w:rPr>
+          <w:rFonts w:ascii="Calibri" w:hAnsi="Calibri" w:cs="Calibri"/>
+          <w:sz w:val="24"/>
+          <w:szCs w:val="24"/>
+        </w:rPr>
+      </w:pPr>
+      <w:r>
+        <w:rPr>
+          <w:rFonts w:ascii="Calibri" w:hAnsi="Calibri" w:cs="Calibri"/>
+          <w:sz w:val="24"/>
+          <w:szCs w:val="24"/>
+        </w:rPr>
+        <w:t>Contrain</w:t>
+      </w:r>
+      <w:r>
+        <w:rPr>
+          <w:rFonts w:ascii="Calibri" w:hAnsi="Calibri" w:cs="Calibri"/>
+          <w:sz w:val="24"/>
+          <w:szCs w:val="24"/>
+        </w:rPr>
+        <w:t>te de licence</w:t>
+      </w:r>
+    </w:p>
+    <w:p>
+      <w:pPr>
+        <w:spacing w:after="120"/>
+        <w:rPr>
+          <w:rFonts w:ascii="Calibri" w:hAnsi="Calibri" w:cs="Calibri"/>
+          <w:sz w:val="24"/>
+          <w:szCs w:val="24"/>
+        </w:rPr>
+      </w:pPr>
+      <w:r>
+        <w:rPr>
+          <w:rFonts w:ascii="Calibri" w:hAnsi="Calibri" w:cs="Calibri"/>
+          <w:b/>
+          <w:bCs/>
+          <w:i/>
+          <w:iCs/>
+          <w:sz w:val="24"/>
+          <w:szCs w:val="24"/>
+        </w:rPr>
+        <w:t>JIRA</w:t>
+      </w:r>
+      <w:r>
+        <w:rPr>
+          <w:rFonts w:ascii="Calibri" w:hAnsi="Calibri" w:cs="Calibri"/>
+          <w:sz w:val="24"/>
+          <w:szCs w:val="24"/>
+        </w:rPr>
+        <w:t xml:space="preserve"> et </w:t>
+      </w:r>
+      <w:r>
+        <w:rPr>
+          <w:rFonts w:ascii="Calibri" w:hAnsi="Calibri" w:cs="Calibri"/>
+          <w:b/>
+          <w:bCs/>
+          <w:i/>
+          <w:iCs/>
+          <w:sz w:val="24"/>
+          <w:szCs w:val="24"/>
+        </w:rPr>
+        <w:t>Confluence</w:t>
+      </w:r>
+      <w:r>
+        <w:rPr>
+          <w:rFonts w:ascii="Calibri" w:hAnsi="Calibri" w:cs="Calibri"/>
+          <w:sz w:val="24"/>
+          <w:szCs w:val="24"/>
+        </w:rPr>
+        <w:t xml:space="preserve"> sont des outils propriétaires nécessitant</w:t>
+      </w:r>
+      <w:r>
+        <w:rPr>
+          <w:rFonts w:ascii="Calibri" w:hAnsi="Calibri" w:cs="Calibri"/>
+          <w:sz w:val="24"/>
+          <w:szCs w:val="24"/>
+        </w:rPr>
+        <w:t xml:space="preserve"> des licences payantes</w:t>
+      </w:r>
+      <w:r>
+        <w:rPr>
+          <w:rFonts w:ascii="Calibri" w:hAnsi="Calibri" w:cs="Calibri"/>
+          <w:sz w:val="24"/>
+          <w:szCs w:val="24"/>
+        </w:rPr>
+        <w:t xml:space="preserve">, </w:t>
+      </w:r>
+      <w:r>
+        <w:rPr>
+          <w:rFonts w:ascii="Calibri" w:hAnsi="Calibri" w:cs="Calibri"/>
+          <w:sz w:val="24"/>
+          <w:szCs w:val="24"/>
+        </w:rPr>
+        <w:t>cela rend moins adaptés à un projet</w:t>
+      </w:r>
+      <w:r>
+        <w:rPr>
+          <w:rFonts w:ascii="Calibri" w:hAnsi="Calibri" w:cs="Calibri"/>
+          <w:sz w:val="24"/>
+          <w:szCs w:val="24"/>
+        </w:rPr>
+        <w:t xml:space="preserve"> académi</w:t>
+      </w:r>
+      <w:r>
+        <w:rPr>
+          <w:rFonts w:ascii="Calibri" w:hAnsi="Calibri" w:cs="Calibri"/>
+          <w:sz w:val="24"/>
+          <w:szCs w:val="24"/>
+        </w:rPr>
+        <w:t>que</w:t>
+      </w:r>
+      <w:r>
+        <w:rPr>
+          <w:rFonts w:ascii="Calibri" w:hAnsi="Calibri" w:cs="Calibri"/>
+          <w:sz w:val="24"/>
+          <w:szCs w:val="24"/>
+        </w:rPr>
+        <w:t xml:space="preserve"> </w:t>
+      </w:r>
+      <w:r>
+        <w:rPr>
+          <w:rFonts w:ascii="Calibri" w:hAnsi="Calibri" w:cs="Calibri"/>
+          <w:sz w:val="24"/>
+          <w:szCs w:val="24"/>
+        </w:rPr>
+        <w:t>(pas de budget</w:t>
+      </w:r>
+      <w:r>
+        <w:rPr>
+          <w:rFonts w:ascii="Calibri" w:hAnsi="Calibri" w:cs="Calibri"/>
+          <w:sz w:val="24"/>
+          <w:szCs w:val="24"/>
+        </w:rPr>
+        <w:t>)</w:t>
+      </w:r>
+    </w:p>
+    <w:p>
+      <w:pPr>
+        <w:pStyle w:val="Paragraphedeliste"/>
+        <w:numPr>
+          <w:ilvl w:val="0"/>
+          <w:numId w:val="28"/>
+        </w:numPr>
+        <w:rPr>
+          <w:rFonts w:ascii="Calibri" w:hAnsi="Calibri" w:cs="Calibri"/>
+          <w:sz w:val="24"/>
+          <w:szCs w:val="24"/>
+        </w:rPr>
       </w:pPr>
     </w:p>
     <w:p>
@@ -10491,7 +11085,211 @@
     </w:p>
     <w:p>
       <w:pPr>
-        <w:jc w:val="both"/>
+        <w:pStyle w:val="Paragraphedeliste"/>
+        <w:numPr>
+          <w:ilvl w:val="0"/>
+          <w:numId w:val="28"/>
+        </w:numPr>
+        <w:spacing w:after="120"/>
+        <w:jc w:val="both"/>
+        <w:rPr>
+          <w:rFonts w:ascii="Calibri" w:hAnsi="Calibri" w:cs="Calibri"/>
+          <w:sz w:val="24"/>
+          <w:szCs w:val="24"/>
+        </w:rPr>
+      </w:pPr>
+      <w:r>
+        <w:rPr>
+          <w:rFonts w:ascii="Calibri" w:hAnsi="Calibri" w:cs="Calibri"/>
+          <w:sz w:val="24"/>
+          <w:szCs w:val="24"/>
+        </w:rPr>
+        <w:t>Contrainte de licence</w:t>
+      </w:r>
+    </w:p>
+    <w:p>
+      <w:pPr>
+        <w:jc w:val="both"/>
+        <w:rPr>
+          <w:rFonts w:ascii="Calibri" w:hAnsi="Calibri" w:cs="Calibri"/>
+          <w:sz w:val="24"/>
+          <w:szCs w:val="24"/>
+        </w:rPr>
+      </w:pPr>
+      <w:r>
+        <w:rPr>
+          <w:rFonts w:ascii="Calibri" w:hAnsi="Calibri" w:cs="Calibri"/>
+          <w:b/>
+          <w:bCs/>
+          <w:i/>
+          <w:iCs/>
+          <w:sz w:val="24"/>
+          <w:szCs w:val="24"/>
+        </w:rPr>
+        <w:t>JIRA</w:t>
+      </w:r>
+      <w:r>
+        <w:rPr>
+          <w:rFonts w:ascii="Calibri" w:hAnsi="Calibri" w:cs="Calibri"/>
+          <w:sz w:val="24"/>
+          <w:szCs w:val="24"/>
+        </w:rPr>
+        <w:t xml:space="preserve"> et </w:t>
+      </w:r>
+      <w:r>
+        <w:rPr>
+          <w:rFonts w:ascii="Calibri" w:hAnsi="Calibri" w:cs="Calibri"/>
+          <w:b/>
+          <w:bCs/>
+          <w:i/>
+          <w:iCs/>
+          <w:sz w:val="24"/>
+          <w:szCs w:val="24"/>
+        </w:rPr>
+        <w:t>Confluence</w:t>
+      </w:r>
+      <w:r>
+        <w:rPr>
+          <w:rFonts w:ascii="Calibri" w:hAnsi="Calibri" w:cs="Calibri"/>
+          <w:sz w:val="24"/>
+          <w:szCs w:val="24"/>
+        </w:rPr>
+        <w:t xml:space="preserve"> ont été remplacés par une solution </w:t>
+      </w:r>
+      <w:r>
+        <w:rPr>
+          <w:rFonts w:ascii="Calibri" w:hAnsi="Calibri" w:cs="Calibri"/>
+          <w:sz w:val="24"/>
+          <w:szCs w:val="24"/>
+        </w:rPr>
+        <w:t xml:space="preserve">open-source </w:t>
+      </w:r>
+      <w:r>
+        <w:rPr>
+          <w:rFonts w:ascii="Calibri" w:hAnsi="Calibri" w:cs="Calibri"/>
+          <w:sz w:val="24"/>
+          <w:szCs w:val="24"/>
+        </w:rPr>
+        <w:t>–</w:t>
+      </w:r>
+      <w:r>
+        <w:rPr>
+          <w:rFonts w:ascii="Calibri" w:hAnsi="Calibri" w:cs="Calibri"/>
+          <w:sz w:val="24"/>
+          <w:szCs w:val="24"/>
+        </w:rPr>
+        <w:t xml:space="preserve"> </w:t>
+      </w:r>
+      <w:r>
+        <w:rPr>
+          <w:rFonts w:ascii="Calibri" w:hAnsi="Calibri" w:cs="Calibri"/>
+          <w:b/>
+          <w:bCs/>
+          <w:i/>
+          <w:iCs/>
+          <w:sz w:val="24"/>
+          <w:szCs w:val="24"/>
+        </w:rPr>
+        <w:t>Libredesk</w:t>
+      </w:r>
+      <w:r>
+        <w:rPr>
+          <w:rFonts w:ascii="Calibri" w:hAnsi="Calibri" w:cs="Calibri"/>
+          <w:sz w:val="24"/>
+          <w:szCs w:val="24"/>
+        </w:rPr>
+        <w:t xml:space="preserve">; Ce changement </w:t>
+      </w:r>
+      <w:r>
+        <w:rPr>
+          <w:rFonts w:ascii="Calibri" w:hAnsi="Calibri" w:cs="Calibri"/>
+          <w:sz w:val="24"/>
+          <w:szCs w:val="24"/>
+        </w:rPr>
+        <w:t xml:space="preserve">s’explique </w:t>
+      </w:r>
+      <w:r>
+        <w:rPr>
+          <w:rFonts w:ascii="Calibri" w:hAnsi="Calibri" w:cs="Calibri"/>
+          <w:sz w:val="24"/>
+          <w:szCs w:val="24"/>
+        </w:rPr>
+        <w:t>principalement par les contraintes de licences payantes</w:t>
+      </w:r>
+      <w:r>
+        <w:rPr>
+          <w:rFonts w:ascii="Calibri" w:hAnsi="Calibri" w:cs="Calibri"/>
+          <w:sz w:val="24"/>
+          <w:szCs w:val="24"/>
+        </w:rPr>
+        <w:t xml:space="preserve">. Libredesk </w:t>
+      </w:r>
+      <w:r>
+        <w:rPr>
+          <w:rFonts w:ascii="Calibri" w:hAnsi="Calibri" w:cs="Calibri"/>
+          <w:sz w:val="24"/>
+          <w:szCs w:val="24"/>
+        </w:rPr>
+        <w:t xml:space="preserve">permet de couvrir les besoins initialement </w:t>
+      </w:r>
+      <w:r>
+        <w:rPr>
+          <w:rFonts w:ascii="Calibri" w:hAnsi="Calibri" w:cs="Calibri"/>
+          <w:sz w:val="24"/>
+          <w:szCs w:val="24"/>
+        </w:rPr>
+        <w:t xml:space="preserve">prévus avec </w:t>
+      </w:r>
+      <w:r>
+        <w:rPr>
+          <w:rFonts w:ascii="Calibri" w:hAnsi="Calibri" w:cs="Calibri"/>
+          <w:i/>
+          <w:iCs/>
+          <w:sz w:val="24"/>
+          <w:szCs w:val="24"/>
+        </w:rPr>
+        <w:t>JIRA</w:t>
+      </w:r>
+      <w:r>
+        <w:rPr>
+          <w:rFonts w:ascii="Calibri" w:hAnsi="Calibri" w:cs="Calibri"/>
+          <w:sz w:val="24"/>
+          <w:szCs w:val="24"/>
+        </w:rPr>
+        <w:t xml:space="preserve"> et </w:t>
+      </w:r>
+      <w:r>
+        <w:rPr>
+          <w:rFonts w:ascii="Calibri" w:hAnsi="Calibri" w:cs="Calibri"/>
+          <w:i/>
+          <w:iCs/>
+          <w:sz w:val="24"/>
+          <w:szCs w:val="24"/>
+        </w:rPr>
+        <w:t>Confluence</w:t>
+      </w:r>
+      <w:r>
+        <w:rPr>
+          <w:rFonts w:ascii="Calibri" w:hAnsi="Calibri" w:cs="Calibri"/>
+          <w:sz w:val="24"/>
+          <w:szCs w:val="24"/>
+        </w:rPr>
+        <w:t>.</w:t>
+      </w:r>
+    </w:p>
+    <w:p>
+      <w:pPr>
+        <w:pStyle w:val="Paragraphedeliste"/>
+        <w:numPr>
+          <w:ilvl w:val="0"/>
+          <w:numId w:val="28"/>
+        </w:numPr>
+        <w:jc w:val="both"/>
+        <w:rPr>
+          <w:rFonts w:ascii="Calibri" w:hAnsi="Calibri" w:cs="Calibri"/>
+          <w:sz w:val="24"/>
+          <w:szCs w:val="24"/>
+        </w:rPr>
       </w:pPr>
     </w:p>
     <w:p>
@@ -10692,6 +11490,7 @@
       </w:pPr>
       <w:bookmarkStart w:id="63" w:name="_Toc226833251"/>
       <w:r>
+        <w:lastRenderedPageBreak/>
         <w:t>Annexe D — Journal de bord du projet (</w:t>
       </w:r>
       <w:proofErr w:type="spellStart"/>
@@ -13128,6 +13927,119 @@
     </w:lvl>
   </w:abstractNum>
   <w:abstractNum w:abstractNumId="21" w15:restartNumberingAfterBreak="0">
+    <w:nsid w:val="5C1E3E21"/>
+    <w:multiLevelType w:val="hybridMultilevel"/>
+    <w:tmpl w:val="9E20CD40"/>
+    <w:lvl w:ilvl="0" w:tplc="5AD648E8">
+      <w:start w:val="1"/>
+      <w:numFmt w:val="bullet"/>
+      <w:lvlText w:val=""/>
+      <w:lvlJc w:val="left"/>
+      <w:pPr>
+        <w:ind w:left="720" w:hanging="360"/>
+      </w:pPr>
+      <w:rPr>
+        <w:rFonts w:ascii="Symbol" w:hAnsi="Symbol" w:hint="default"/>
+      </w:rPr>
+    </w:lvl>
+    <w:lvl w:ilvl="1" w:tplc="0C0C0003" w:tentative="1">
+      <w:start w:val="1"/>
+      <w:numFmt w:val="bullet"/>
+      <w:lvlText w:val="o"/>
+      <w:lvlJc w:val="left"/>
+      <w:pPr>
+        <w:ind w:left="1440" w:hanging="360"/>
+      </w:pPr>
+      <w:rPr>
+        <w:rFonts w:ascii="Courier New" w:hAnsi="Courier New" w:cs="Courier New" w:hint="default"/>
+      </w:rPr>
+    </w:lvl>
+    <w:lvl w:ilvl="2" w:tplc="0C0C0005" w:tentative="1">
+      <w:start w:val="1"/>
+      <w:numFmt w:val="bullet"/>
+      <w:lvlText w:val=""/>
+      <w:lvlJc w:val="left"/>
+      <w:pPr>
+        <w:ind w:left="2160" w:hanging="360"/>
+      </w:pPr>
+      <w:rPr>
+        <w:rFonts w:ascii="Wingdings" w:hAnsi="Wingdings" w:hint="default"/>
+      </w:rPr>
+    </w:lvl>
+    <w:lvl w:ilvl="3" w:tplc="0C0C0001" w:tentative="1">
+      <w:start w:val="1"/>
+      <w:numFmt w:val="bullet"/>
+      <w:lvlText w:val=""/>
+      <w:lvlJc w:val="left"/>
+      <w:pPr>
+        <w:ind w:left="2880" w:hanging="360"/>
+      </w:pPr>
+      <w:rPr>
+        <w:rFonts w:ascii="Symbol" w:hAnsi="Symbol" w:hint="default"/>
+      </w:rPr>
+    </w:lvl>
+    <w:lvl w:ilvl="4" w:tplc="0C0C0003" w:tentative="1">
+      <w:start w:val="1"/>
+      <w:numFmt w:val="bullet"/>
+      <w:lvlText w:val="o"/>
+      <w:lvlJc w:val="left"/>
+      <w:pPr>
+        <w:ind w:left="3600" w:hanging="360"/>
+      </w:pPr>
+      <w:rPr>
+        <w:rFonts w:ascii="Courier New" w:hAnsi="Courier New" w:cs="Courier New" w:hint="default"/>
+      </w:rPr>
+    </w:lvl>
+    <w:lvl w:ilvl="5" w:tplc="0C0C0005" w:tentative="1">
+      <w:start w:val="1"/>
+      <w:numFmt w:val="bullet"/>
+      <w:lvlText w:val=""/>
+      <w:lvlJc w:val="left"/>
+      <w:pPr>
+        <w:ind w:left="4320" w:hanging="360"/>
+      </w:pPr>
+      <w:rPr>
+        <w:rFonts w:ascii="Wingdings" w:hAnsi="Wingdings" w:hint="default"/>
+      </w:rPr>
+    </w:lvl>
+    <w:lvl w:ilvl="6" w:tplc="0C0C0001" w:tentative="1">
+      <w:start w:val="1"/>
+      <w:numFmt w:val="bullet"/>
+      <w:lvlText w:val=""/>
+      <w:lvlJc w:val="left"/>
+      <w:pPr>
+        <w:ind w:left="5040" w:hanging="360"/>
+      </w:pPr>
+      <w:rPr>
+        <w:rFonts w:ascii="Symbol" w:hAnsi="Symbol" w:hint="default"/>
+      </w:rPr>
+    </w:lvl>
+    <w:lvl w:ilvl="7" w:tplc="0C0C0003" w:tentative="1">
+      <w:start w:val="1"/>
+      <w:numFmt w:val="bullet"/>
+      <w:lvlText w:val="o"/>
+      <w:lvlJc w:val="left"/>
+      <w:pPr>
+        <w:ind w:left="5760" w:hanging="360"/>
+      </w:pPr>
+      <w:rPr>
+        <w:rFonts w:ascii="Courier New" w:hAnsi="Courier New" w:cs="Courier New" w:hint="default"/>
+      </w:rPr>
+    </w:lvl>
+    <w:lvl w:ilvl="8" w:tplc="0C0C0005" w:tentative="1">
+      <w:start w:val="1"/>
+      <w:numFmt w:val="bullet"/>
+      <w:lvlText w:val=""/>
+      <w:lvlJc w:val="left"/>
+      <w:pPr>
+        <w:ind w:left="6480" w:hanging="360"/>
+      </w:pPr>
+      <w:rPr>
+        <w:rFonts w:ascii="Wingdings" w:hAnsi="Wingdings" w:hint="default"/>
+      </w:rPr>
+    </w:lvl>
+  </w:abstractNum>
+  <w:abstractNum w:abstractNumId="22" w15:restartNumberingAfterBreak="0">
     <w:nsid w:val="5FD11C50"/>
     <w:multiLevelType w:val="multilevel"/>
     <w:tmpl w:val="9D7AEE0E"/>
@@ -13240,7 +14152,7 @@
       </w:pPr>
     </w:lvl>
   </w:abstractNum>
-  <w:abstractNum w:abstractNumId="22" w15:restartNumberingAfterBreak="0">
+  <w:abstractNum w:abstractNumId="23" w15:restartNumberingAfterBreak="0">
     <w:nsid w:val="6F3E69A8"/>
     <w:multiLevelType w:val="hybridMultilevel"/>
     <w:tmpl w:val="3216D2C4"/>
@@ -13353,7 +14265,7 @@
       </w:rPr>
     </w:lvl>
   </w:abstractNum>
-  <w:abstractNum w:abstractNumId="23" w15:restartNumberingAfterBreak="0">
+  <w:abstractNum w:abstractNumId="24" w15:restartNumberingAfterBreak="0">
     <w:nsid w:val="70AC3E99"/>
     <w:multiLevelType w:val="hybridMultilevel"/>
     <w:tmpl w:val="4678E13A"/>
@@ -13466,7 +14378,7 @@
       </w:rPr>
     </w:lvl>
   </w:abstractNum>
-  <w:abstractNum w:abstractNumId="24" w15:restartNumberingAfterBreak="0">
+  <w:abstractNum w:abstractNumId="25" w15:restartNumberingAfterBreak="0">
     <w:nsid w:val="71575C4E"/>
     <w:multiLevelType w:val="hybridMultilevel"/>
     <w:tmpl w:val="BEF08AF6"/>
@@ -13579,7 +14491,7 @@
       </w:rPr>
     </w:lvl>
   </w:abstractNum>
-  <w:abstractNum w:abstractNumId="25" w15:restartNumberingAfterBreak="0">
+  <w:abstractNum w:abstractNumId="26" w15:restartNumberingAfterBreak="0">
     <w:nsid w:val="756A36E5"/>
     <w:multiLevelType w:val="hybridMultilevel"/>
     <w:tmpl w:val="5380E322"/>
@@ -13692,7 +14604,7 @@
       </w:rPr>
     </w:lvl>
   </w:abstractNum>
-  <w:abstractNum w:abstractNumId="26" w15:restartNumberingAfterBreak="0">
+  <w:abstractNum w:abstractNumId="27" w15:restartNumberingAfterBreak="0">
     <w:nsid w:val="76392B58"/>
     <w:multiLevelType w:val="hybridMultilevel"/>
     <w:tmpl w:val="BA164F1A"/>
@@ -13791,10 +14703,10 @@
     <w:abstractNumId w:val="8"/>
   </w:num>
   <w:num w:numId="4" w16cid:durableId="937829981">
-    <w:abstractNumId w:val="25"/>
+    <w:abstractNumId w:val="26"/>
   </w:num>
   <w:num w:numId="5" w16cid:durableId="117457955">
-    <w:abstractNumId w:val="21"/>
+    <w:abstractNumId w:val="22"/>
   </w:num>
   <w:num w:numId="6" w16cid:durableId="2006277576">
     <w:abstractNumId w:val="0"/>
@@ -13830,7 +14742,7 @@
     <w:abstractNumId w:val="6"/>
   </w:num>
   <w:num w:numId="17" w16cid:durableId="421608006">
-    <w:abstractNumId w:val="26"/>
+    <w:abstractNumId w:val="27"/>
   </w:num>
   <w:num w:numId="18" w16cid:durableId="54086389">
     <w:abstractNumId w:val="16"/>
@@ -13842,16 +14754,16 @@
     <w:abstractNumId w:val="4"/>
   </w:num>
   <w:num w:numId="21" w16cid:durableId="324865133">
-    <w:abstractNumId w:val="24"/>
+    <w:abstractNumId w:val="25"/>
   </w:num>
   <w:num w:numId="22" w16cid:durableId="1283268492">
     <w:abstractNumId w:val="10"/>
   </w:num>
   <w:num w:numId="23" w16cid:durableId="105465689">
-    <w:abstractNumId w:val="23"/>
+    <w:abstractNumId w:val="24"/>
   </w:num>
   <w:num w:numId="24" w16cid:durableId="440497883">
-    <w:abstractNumId w:val="22"/>
+    <w:abstractNumId w:val="23"/>
   </w:num>
   <w:num w:numId="25" w16cid:durableId="854001530">
     <w:abstractNumId w:val="3"/>
@@ -13861,6 +14773,9 @@
   </w:num>
   <w:num w:numId="27" w16cid:durableId="1017080357">
     <w:abstractNumId w:val="17"/>
+  </w:num>
+  <w:num w:numId="28" w16cid:durableId="1401907422">
+    <w:abstractNumId w:val="21"/>
   </w:num>
 </w:numbering>
 </file>
@@ -14921,6 +15836,163 @@
       <w:u w:val="single"/>
     </w:rPr>
   </w:style>
+  <w:style w:type="table" w:styleId="Grilledutableau">
+    <w:name w:val="Table Grid"/>
+    <w:basedOn w:val="TableauNormal"/>
+    <w:uiPriority w:val="39"/>
+    <w:rsid w:val="00F24BFF"/>
+    <w:pPr>
+      <w:spacing w:after="0" w:line="240" w:lineRule="auto"/>
+    </w:pPr>
+    <w:tblPr>
+      <w:tblBorders>
+        <w:top w:val="single" w:sz="4" w:space="0" w:color="auto"/>
+        <w:left w:val="single" w:sz="4" w:space="0" w:color="auto"/>
+        <w:bottom w:val="single" w:sz="4" w:space="0" w:color="auto"/>
+        <w:right w:val="single" w:sz="4" w:space="0" w:color="auto"/>
+        <w:insideH w:val="single" w:sz="4" w:space="0" w:color="auto"/>
+        <w:insideV w:val="single" w:sz="4" w:space="0" w:color="auto"/>
+      </w:tblBorders>
+    </w:tblPr>
+  </w:style>
+  <w:style w:type="table" w:styleId="Tableausimple1">
+    <w:name w:val="Plain Table 1"/>
+    <w:basedOn w:val="TableauNormal"/>
+    <w:uiPriority w:val="41"/>
+    <w:rsid w:val="00030F21"/>
+    <w:pPr>
+      <w:spacing w:after="0" w:line="240" w:lineRule="auto"/>
+    </w:pPr>
+    <w:tblPr>
+      <w:tblStyleRowBandSize w:val="1"/>
+      <w:tblStyleColBandSize w:val="1"/>
+      <w:tblBorders>
+        <w:top w:val="single" w:sz="4" w:space="0" w:color="BFBFBF" w:themeColor="background1" w:themeShade="BF"/>
+        <w:left w:val="single" w:sz="4" w:space="0" w:color="BFBFBF" w:themeColor="background1" w:themeShade="BF"/>
+        <w:bottom w:val="single" w:sz="4" w:space="0" w:color="BFBFBF" w:themeColor="background1" w:themeShade="BF"/>
+        <w:right w:val="single" w:sz="4" w:space="0" w:color="BFBFBF" w:themeColor="background1" w:themeShade="BF"/>
+        <w:insideH w:val="single" w:sz="4" w:space="0" w:color="BFBFBF" w:themeColor="background1" w:themeShade="BF"/>
+        <w:insideV w:val="single" w:sz="4" w:space="0" w:color="BFBFBF" w:themeColor="background1" w:themeShade="BF"/>
+      </w:tblBorders>
+    </w:tblPr>
+    <w:tblStylePr w:type="firstRow">
+      <w:rPr>
+        <w:b/>
+        <w:bCs/>
+      </w:rPr>
+    </w:tblStylePr>
+    <w:tblStylePr w:type="lastRow">
+      <w:rPr>
+        <w:b/>
+        <w:bCs/>
+      </w:rPr>
+      <w:tblPr/>
+      <w:tcPr>
+        <w:tcBorders>
+          <w:top w:val="double" w:sz="4" w:space="0" w:color="BFBFBF" w:themeColor="background1" w:themeShade="BF"/>
+        </w:tcBorders>
+      </w:tcPr>
+    </w:tblStylePr>
+    <w:tblStylePr w:type="firstCol">
+      <w:rPr>
+        <w:b/>
+        <w:bCs/>
+      </w:rPr>
+    </w:tblStylePr>
+    <w:tblStylePr w:type="lastCol">
+      <w:rPr>
+        <w:b/>
+        <w:bCs/>
+      </w:rPr>
+    </w:tblStylePr>
+    <w:tblStylePr w:type="band1Vert">
+      <w:tblPr/>
+      <w:tcPr>
+        <w:shd w:val="clear" w:color="auto" w:fill="F2F2F2" w:themeFill="background1" w:themeFillShade="F2"/>
+      </w:tcPr>
+    </w:tblStylePr>
+    <w:tblStylePr w:type="band1Horz">
+      <w:tblPr/>
+      <w:tcPr>
+        <w:shd w:val="clear" w:color="auto" w:fill="F2F2F2" w:themeFill="background1" w:themeFillShade="F2"/>
+      </w:tcPr>
+    </w:tblStylePr>
+  </w:style>
+  <w:style w:type="table" w:styleId="TableauGrille2">
+    <w:name w:val="Grid Table 2"/>
+    <w:basedOn w:val="TableauNormal"/>
+    <w:uiPriority w:val="47"/>
+    <w:rsid w:val="00030F21"/>
+    <w:pPr>
+      <w:spacing w:after="0" w:line="240" w:lineRule="auto"/>
+    </w:pPr>
+    <w:tblPr>
+      <w:tblStyleRowBandSize w:val="1"/>
+      <w:tblStyleColBandSize w:val="1"/>
+      <w:tblBorders>
+        <w:top w:val="single" w:sz="2" w:space="0" w:color="666666" w:themeColor="text1" w:themeTint="99"/>
+        <w:bottom w:val="single" w:sz="2" w:space="0" w:color="666666" w:themeColor="text1" w:themeTint="99"/>
+        <w:insideH w:val="single" w:sz="2" w:space="0" w:color="666666" w:themeColor="text1" w:themeTint="99"/>
+        <w:insideV w:val="single" w:sz="2" w:space="0" w:color="666666" w:themeColor="text1" w:themeTint="99"/>
+      </w:tblBorders>
+    </w:tblPr>
+    <w:tblStylePr w:type="firstRow">
+      <w:rPr>
+        <w:b/>
+        <w:bCs/>
+      </w:rPr>
+      <w:tblPr/>
+      <w:tcPr>
+        <w:tcBorders>
+          <w:top w:val="nil"/>
+          <w:bottom w:val="single" w:sz="12" w:space="0" w:color="666666" w:themeColor="text1" w:themeTint="99"/>
+          <w:insideH w:val="nil"/>
+          <w:insideV w:val="nil"/>
+        </w:tcBorders>
+        <w:shd w:val="clear" w:color="auto" w:fill="FFFFFF" w:themeFill="background1"/>
+      </w:tcPr>
+    </w:tblStylePr>
+    <w:tblStylePr w:type="lastRow">
+      <w:rPr>
+        <w:b/>
+        <w:bCs/>
+      </w:rPr>
+      <w:tblPr/>
+      <w:tcPr>
+        <w:tcBorders>
+          <w:top w:val="double" w:sz="2" w:space="0" w:color="666666" w:themeColor="text1" w:themeTint="99"/>
+          <w:bottom w:val="nil"/>
+          <w:insideH w:val="nil"/>
+          <w:insideV w:val="nil"/>
+        </w:tcBorders>
+        <w:shd w:val="clear" w:color="auto" w:fill="FFFFFF" w:themeFill="background1"/>
+      </w:tcPr>
+    </w:tblStylePr>
+    <w:tblStylePr w:type="firstCol">
+      <w:rPr>
+        <w:b/>
+        <w:bCs/>
+      </w:rPr>
+    </w:tblStylePr>
+    <w:tblStylePr w:type="lastCol">
+      <w:rPr>
+        <w:b/>
+        <w:bCs/>
+      </w:rPr>
+    </w:tblStylePr>
+    <w:tblStylePr w:type="band1Vert">
+      <w:tblPr/>
+      <w:tcPr>
+        <w:shd w:val="clear" w:color="auto" w:fill="CCCCCC" w:themeFill="text1" w:themeFillTint="33"/>
+      </w:tcPr>
+    </w:tblStylePr>
+    <w:tblStylePr w:type="band1Horz">
+      <w:tblPr/>
+      <w:tcPr>
+        <w:shd w:val="clear" w:color="auto" w:fill="CCCCCC" w:themeFill="text1" w:themeFillTint="33"/>
+      </w:tcPr>
+    </w:tblStylePr>
+  </w:style>
 </w:styles>
 </file>
 

</xml_diff>